<commit_message>
10_Bruteforce_Login_Protection.docx 포맷을 시리즈 공통 기준으로 통일
- styles.xml 테마 폰트 참조(asciiTheme/eastAsiaTheme 등)를 리터럴 "맑은 고딕"으로
  교체 -- 한글 글자 간격이 찌그러져 보이던 렌더링 결함 해결
- 표지 페이지 추가 (제목/부제/OWASP 분류/실습 프로젝트)
- 목차 페이지 추가 (1~6 대제목 불릿 리스트, Symbol 폰트 의존 없는
  새 불릿 정의 numId=100 추가)
- 페이지 번호 헤더 추가 (word/header1.xml + 관계/Content_Types 등록)
- 기존 본문 내용은 변경 없이 유지
</commit_message>
<xml_diff>
--- a/docs/security/10_Bruteforce_Login_Protection.docx
+++ b/docs/security/10_Bruteforce_Login_Protection.docx
@@ -2,6 +2,164 @@
 <file path=word/document.xml><?xml version="1.0" encoding="utf-8"?>
 <w:document xmlns:wpc="http://schemas.microsoft.com/office/word/2010/wordprocessingCanvas" xmlns:mo="http://schemas.microsoft.com/office/mac/office/2008/main" xmlns:mc="http://schemas.openxmlformats.org/markup-compatibility/2006" xmlns:mv="urn:schemas-microsoft-com:mac:vml" xmlns:o="urn:schemas-microsoft-com:office:office" xmlns:r="http://schemas.openxmlformats.org/officeDocument/2006/relationships" xmlns:m="http://schemas.openxmlformats.org/officeDocument/2006/math" xmlns:v="urn:schemas-microsoft-com:vml" xmlns:wp14="http://schemas.microsoft.com/office/word/2010/wordprocessingDrawing" xmlns:wp="http://schemas.openxmlformats.org/drawingml/2006/wordprocessingDrawing" xmlns:w10="urn:schemas-microsoft-com:office:word" xmlns:w="http://schemas.openxmlformats.org/wordprocessingml/2006/main" xmlns:w14="http://schemas.microsoft.com/office/word/2010/wordml" xmlns:wpg="http://schemas.microsoft.com/office/word/2010/wordprocessingGroup" xmlns:wpi="http://schemas.microsoft.com/office/word/2010/wordprocessingInk" xmlns:wne="http://schemas.microsoft.com/office/word/2006/wordml" xmlns:wps="http://schemas.microsoft.com/office/word/2010/wordprocessingShape" mc:Ignorable="w14 wp14">
   <w:body>
+    <w:p>
+      <w:pPr>
+        <w:spacing w:before="1100" w:after="200"/>
+        <w:jc w:val="center"/>
+      </w:pPr>
+      <w:r>
+        <w:rPr>
+          <w:b/>
+          <w:bCs/>
+          <w:color w:val="1F3864"/>
+          <w:sz w:val="30"/>
+          <w:szCs w:val="30"/>
+        </w:rPr>
+        <w:t xml:space="preserve">웹 보안 실습 교안</w:t>
+      </w:r>
+    </w:p>
+    <w:p>
+      <w:pPr>
+        <w:spacing w:after="120"/>
+        <w:jc w:val="center"/>
+      </w:pPr>
+      <w:r>
+        <w:rPr>
+          <w:b/>
+          <w:bCs/>
+          <w:color w:val="1F3864"/>
+          <w:sz w:val="40"/>
+          <w:szCs w:val="40"/>
+        </w:rPr>
+        <w:t xml:space="preserve">로그인 시도 제한 (Account Lockout / Brute Force 방어)</w:t>
+      </w:r>
+    </w:p>
+    <w:p>
+      <w:pPr>
+        <w:spacing w:after="500"/>
+        <w:jc w:val="center"/>
+      </w:pPr>
+      <w:r>
+        <w:rPr>
+          <w:color w:val="595959"/>
+        </w:rPr>
+        <w:t xml:space="preserve">Identification and Authentication Failures / OWASP #7(식별 및 인증 실패)</w:t>
+      </w:r>
+    </w:p>
+    <w:p>
+      <w:pPr>
+        <w:spacing w:after="60"/>
+        <w:jc w:val="center"/>
+      </w:pPr>
+      <w:r>
+        <w:rPr>
+          <w:color w:val="595959"/>
+        </w:rPr>
+        <w:t xml:space="preserve">실습 프로젝트 : Student_JWT (feature/bruteforce-demo)</w:t>
+      </w:r>
+    </w:p>
+    <w:p>
+      <w:r>
+        <w:br w:type="page"/>
+      </w:r>
+    </w:p>
+    <w:p>
+      <w:pPr>
+        <w:pStyle w:val="Heading1"/>
+        <w:spacing w:before="320" w:after="160"/>
+      </w:pPr>
+      <w:r>
+        <w:rPr>
+          <w:b/>
+          <w:color w:val="1F3864"/>
+          <w:sz w:val="30"/>
+        </w:rPr>
+        <w:t xml:space="preserve">목차</w:t>
+      </w:r>
+    </w:p>
+    <w:p>
+      <w:pPr>
+        <w:pStyle w:val="ListParagraph"/>
+        <w:numPr>
+          <w:ilvl w:val="0"/>
+          <w:numId w:val="100"/>
+        </w:numPr>
+        <w:spacing w:after="50" w:line="264" w:lineRule="auto"/>
+      </w:pPr>
+      <w:r>
+        <w:t xml:space="preserve">1. 개념 요약</w:t>
+      </w:r>
+    </w:p>
+    <w:p>
+      <w:pPr>
+        <w:pStyle w:val="ListParagraph"/>
+        <w:numPr>
+          <w:ilvl w:val="0"/>
+          <w:numId w:val="100"/>
+        </w:numPr>
+        <w:spacing w:after="50" w:line="264" w:lineRule="auto"/>
+      </w:pPr>
+      <w:r>
+        <w:t xml:space="preserve">2. 변경 내역 — 1단계(취약) → 2단계(조치)</w:t>
+      </w:r>
+    </w:p>
+    <w:p>
+      <w:pPr>
+        <w:pStyle w:val="ListParagraph"/>
+        <w:numPr>
+          <w:ilvl w:val="0"/>
+          <w:numId w:val="100"/>
+        </w:numPr>
+        <w:spacing w:after="50" w:line="264" w:lineRule="auto"/>
+      </w:pPr>
+      <w:r>
+        <w:t xml:space="preserve">3. 공격 실습 — 검증됨(2026-10-14)</w:t>
+      </w:r>
+    </w:p>
+    <w:p>
+      <w:pPr>
+        <w:pStyle w:val="ListParagraph"/>
+        <w:numPr>
+          <w:ilvl w:val="0"/>
+          <w:numId w:val="100"/>
+        </w:numPr>
+        <w:spacing w:after="50" w:line="264" w:lineRule="auto"/>
+      </w:pPr>
+      <w:r>
+        <w:t xml:space="preserve">4. 방어 원리</w:t>
+      </w:r>
+    </w:p>
+    <w:p>
+      <w:pPr>
+        <w:pStyle w:val="ListParagraph"/>
+        <w:numPr>
+          <w:ilvl w:val="0"/>
+          <w:numId w:val="100"/>
+        </w:numPr>
+        <w:spacing w:after="50" w:line="264" w:lineRule="auto"/>
+      </w:pPr>
+      <w:r>
+        <w:t xml:space="preserve">5. 방어 정리</w:t>
+      </w:r>
+    </w:p>
+    <w:p>
+      <w:pPr>
+        <w:pStyle w:val="ListParagraph"/>
+        <w:numPr>
+          <w:ilvl w:val="0"/>
+          <w:numId w:val="100"/>
+        </w:numPr>
+        <w:spacing w:after="50" w:line="264" w:lineRule="auto"/>
+      </w:pPr>
+      <w:r>
+        <w:t xml:space="preserve">6. 관련 문서</w:t>
+      </w:r>
+    </w:p>
+    <w:p>
+      <w:r>
+        <w:br w:type="page"/>
+      </w:r>
+    </w:p>
     <w:p>
       <w:pPr>
         <w:spacing w:after="200"/>
@@ -2582,6 +2740,7 @@
       </w:r>
     </w:p>
     <w:sectPr>
+      <w:headerReference w:type="default" r:id="rId9"/>
       <w:pgSz w:w="12240" w:h="15840"/>
       <w:pgMar w:top="1440" w:right="1800" w:bottom="1440" w:left="1800" w:header="720" w:footer="720" w:gutter="0"/>
       <w:cols w:space="720"/>
@@ -2589,6 +2748,34 @@
     </w:sectPr>
   </w:body>
 </w:document>
+</file>
+
+<file path=word/header1.xml><?xml version="1.0" encoding="utf-8"?>
+<w:hdr xmlns:wpc="http://schemas.microsoft.com/office/word/2010/wordprocessingCanvas" xmlns:cx="http://schemas.microsoft.com/office/drawing/2014/chartex" xmlns:mc="http://schemas.openxmlformats.org/markup-compatibility/2006" xmlns:o="urn:schemas-microsoft-com:office:office" xmlns:r="http://schemas.openxmlformats.org/officeDocument/2006/relationships" xmlns:m="http://schemas.openxmlformats.org/officeDocument/2006/math" xmlns:v="urn:schemas-microsoft-com:vml" xmlns:wp14="http://schemas.microsoft.com/office/word/2010/wordprocessingDrawing" xmlns:wp="http://schemas.openxmlformats.org/drawingml/2006/wordprocessingDrawing" xmlns:w10="urn:schemas-microsoft-com:office:word" xmlns:w="http://schemas.openxmlformats.org/wordprocessingml/2006/main" xmlns:w14="http://schemas.microsoft.com/office/word/2010/wordml" xmlns:w15="http://schemas.microsoft.com/office/word/2012/wordml" xmlns:wpg="http://schemas.microsoft.com/office/word/2010/wordprocessingGroup" xmlns:wpi="http://schemas.microsoft.com/office/word/2010/wordprocessingInk" xmlns:wne="http://schemas.microsoft.com/office/word/2006/wordml" xmlns:wps="http://schemas.microsoft.com/office/word/2010/wordprocessingShape" mc:Ignorable="w14 w15 wp14">
+  <w:p>
+    <w:pPr>
+      <w:jc w:val="right"/>
+    </w:pPr>
+    <w:r>
+      <w:fldChar w:fldCharType="begin"/>
+    </w:r>
+    <w:r>
+      <w:instrText xml:space="preserve"> PAGE   \* MERGEFORMAT </w:instrText>
+    </w:r>
+    <w:r>
+      <w:fldChar w:fldCharType="separate"/>
+    </w:r>
+    <w:r>
+      <w:rPr>
+        <w:noProof/>
+      </w:rPr>
+      <w:t>1</w:t>
+    </w:r>
+    <w:r>
+      <w:fldChar w:fldCharType="end"/>
+    </w:r>
+  </w:p>
+</w:hdr>
 </file>
 
 <file path=word/numbering.xml><?xml version="1.0" encoding="utf-8"?>
@@ -2764,6 +2951,18 @@
       </w:rPr>
     </w:lvl>
   </w:abstractNum>
+  <w:abstractNum w:abstractNumId="100">
+    <w:multiLevelType w:val="hybridMultilevel"/>
+    <w:lvl w:ilvl="0">
+      <w:start w:val="1"/>
+      <w:numFmt w:val="bullet"/>
+      <w:lvlText w:val="●"/>
+      <w:lvlJc w:val="left"/>
+      <w:pPr>
+        <w:ind w:left="720" w:hanging="360"/>
+      </w:pPr>
+    </w:lvl>
+  </w:abstractNum>
   <w:num w:numId="1">
     <w:abstractNumId w:val="8"/>
   </w:num>
@@ -2791,6 +2990,9 @@
   <w:num w:numId="9">
     <w:abstractNumId w:val="0"/>
   </w:num>
+  <w:num w:numId="100">
+    <w:abstractNumId w:val="100"/>
+  </w:num>
 </w:numbering>
 </file>
 
@@ -2799,7 +3001,7 @@
   <w:docDefaults>
     <w:rPrDefault>
       <w:rPr>
-        <w:rFonts w:asciiTheme="minorHAnsi" w:eastAsiaTheme="minorEastAsia" w:hAnsiTheme="minorHAnsi" w:cstheme="minorBidi"/>
+        <w:rFonts w:ascii="맑은 고딕" w:eastAsia="맑은 고딕" w:hAnsi="맑은 고딕" w:cs="맑은 고딕"/>
         <w:sz w:val="22"/>
         <w:szCs w:val="22"/>
         <w:lang w:val="en-US" w:eastAsia="en-US" w:bidi="ar-SA"/>
@@ -3014,7 +3216,7 @@
       <w:outlineLvl w:val="0"/>
     </w:pPr>
     <w:rPr>
-      <w:rFonts w:asciiTheme="majorHAnsi" w:eastAsiaTheme="majorEastAsia" w:hAnsiTheme="majorHAnsi" w:cstheme="majorBidi"/>
+      <w:rFonts w:ascii="맑은 고딕" w:eastAsia="맑은 고딕" w:hAnsi="맑은 고딕" w:cs="맑은 고딕"/>
       <w:b/>
       <w:bCs/>
       <w:color w:val="365F91" w:themeColor="accent1" w:themeShade="BF"/>
@@ -3038,7 +3240,7 @@
       <w:outlineLvl w:val="1"/>
     </w:pPr>
     <w:rPr>
-      <w:rFonts w:asciiTheme="majorHAnsi" w:eastAsiaTheme="majorEastAsia" w:hAnsiTheme="majorHAnsi" w:cstheme="majorBidi"/>
+      <w:rFonts w:ascii="맑은 고딕" w:eastAsia="맑은 고딕" w:hAnsi="맑은 고딕" w:cs="맑은 고딕"/>
       <w:b/>
       <w:bCs/>
       <w:color w:val="4F81BD" w:themeColor="accent1"/>
@@ -3062,7 +3264,7 @@
       <w:outlineLvl w:val="2"/>
     </w:pPr>
     <w:rPr>
-      <w:rFonts w:asciiTheme="majorHAnsi" w:eastAsiaTheme="majorEastAsia" w:hAnsiTheme="majorHAnsi" w:cstheme="majorBidi"/>
+      <w:rFonts w:ascii="맑은 고딕" w:eastAsia="맑은 고딕" w:hAnsi="맑은 고딕" w:cs="맑은 고딕"/>
       <w:b/>
       <w:bCs/>
       <w:color w:val="4F81BD" w:themeColor="accent1"/>
@@ -3085,7 +3287,7 @@
       <w:outlineLvl w:val="3"/>
     </w:pPr>
     <w:rPr>
-      <w:rFonts w:asciiTheme="majorHAnsi" w:eastAsiaTheme="majorEastAsia" w:hAnsiTheme="majorHAnsi" w:cstheme="majorBidi"/>
+      <w:rFonts w:ascii="맑은 고딕" w:eastAsia="맑은 고딕" w:hAnsi="맑은 고딕" w:cs="맑은 고딕"/>
       <w:b/>
       <w:bCs/>
       <w:i/>
@@ -3110,7 +3312,7 @@
       <w:outlineLvl w:val="4"/>
     </w:pPr>
     <w:rPr>
-      <w:rFonts w:asciiTheme="majorHAnsi" w:eastAsiaTheme="majorEastAsia" w:hAnsiTheme="majorHAnsi" w:cstheme="majorBidi"/>
+      <w:rFonts w:ascii="맑은 고딕" w:eastAsia="맑은 고딕" w:hAnsi="맑은 고딕" w:cs="맑은 고딕"/>
       <w:color w:val="243F60" w:themeColor="accent1" w:themeShade="7F"/>
     </w:rPr>
   </w:style>
@@ -3131,7 +3333,7 @@
       <w:outlineLvl w:val="5"/>
     </w:pPr>
     <w:rPr>
-      <w:rFonts w:asciiTheme="majorHAnsi" w:eastAsiaTheme="majorEastAsia" w:hAnsiTheme="majorHAnsi" w:cstheme="majorBidi"/>
+      <w:rFonts w:ascii="맑은 고딕" w:eastAsia="맑은 고딕" w:hAnsi="맑은 고딕" w:cs="맑은 고딕"/>
       <w:i/>
       <w:iCs/>
       <w:color w:val="243F60" w:themeColor="accent1" w:themeShade="7F"/>
@@ -3154,7 +3356,7 @@
       <w:outlineLvl w:val="6"/>
     </w:pPr>
     <w:rPr>
-      <w:rFonts w:asciiTheme="majorHAnsi" w:eastAsiaTheme="majorEastAsia" w:hAnsiTheme="majorHAnsi" w:cstheme="majorBidi"/>
+      <w:rFonts w:ascii="맑은 고딕" w:eastAsia="맑은 고딕" w:hAnsi="맑은 고딕" w:cs="맑은 고딕"/>
       <w:i/>
       <w:iCs/>
       <w:color w:val="404040" w:themeColor="text1" w:themeTint="BF"/>
@@ -3177,7 +3379,7 @@
       <w:outlineLvl w:val="7"/>
     </w:pPr>
     <w:rPr>
-      <w:rFonts w:asciiTheme="majorHAnsi" w:eastAsiaTheme="majorEastAsia" w:hAnsiTheme="majorHAnsi" w:cstheme="majorBidi"/>
+      <w:rFonts w:ascii="맑은 고딕" w:eastAsia="맑은 고딕" w:hAnsi="맑은 고딕" w:cs="맑은 고딕"/>
       <w:color w:val="4F81BD" w:themeColor="accent1"/>
       <w:sz w:val="20"/>
       <w:szCs w:val="20"/>
@@ -3200,7 +3402,7 @@
       <w:outlineLvl w:val="8"/>
     </w:pPr>
     <w:rPr>
-      <w:rFonts w:asciiTheme="majorHAnsi" w:eastAsiaTheme="majorEastAsia" w:hAnsiTheme="majorHAnsi" w:cstheme="majorBidi"/>
+      <w:rFonts w:ascii="맑은 고딕" w:eastAsia="맑은 고딕" w:hAnsi="맑은 고딕" w:cs="맑은 고딕"/>
       <w:i/>
       <w:iCs/>
       <w:color w:val="404040" w:themeColor="text1" w:themeTint="BF"/>
@@ -3251,7 +3453,7 @@
     <w:uiPriority w:val="9"/>
     <w:rsid w:val="00FC693F"/>
     <w:rPr>
-      <w:rFonts w:asciiTheme="majorHAnsi" w:eastAsiaTheme="majorEastAsia" w:hAnsiTheme="majorHAnsi" w:cstheme="majorBidi"/>
+      <w:rFonts w:ascii="맑은 고딕" w:eastAsia="맑은 고딕" w:hAnsi="맑은 고딕" w:cs="맑은 고딕"/>
       <w:b/>
       <w:bCs/>
       <w:color w:val="365F91" w:themeColor="accent1" w:themeShade="BF"/>
@@ -3266,7 +3468,7 @@
     <w:uiPriority w:val="9"/>
     <w:rsid w:val="00FC693F"/>
     <w:rPr>
-      <w:rFonts w:asciiTheme="majorHAnsi" w:eastAsiaTheme="majorEastAsia" w:hAnsiTheme="majorHAnsi" w:cstheme="majorBidi"/>
+      <w:rFonts w:ascii="맑은 고딕" w:eastAsia="맑은 고딕" w:hAnsi="맑은 고딕" w:cs="맑은 고딕"/>
       <w:b/>
       <w:bCs/>
       <w:color w:val="4F81BD" w:themeColor="accent1"/>
@@ -3281,7 +3483,7 @@
     <w:uiPriority w:val="9"/>
     <w:rsid w:val="00FC693F"/>
     <w:rPr>
-      <w:rFonts w:asciiTheme="majorHAnsi" w:eastAsiaTheme="majorEastAsia" w:hAnsiTheme="majorHAnsi" w:cstheme="majorBidi"/>
+      <w:rFonts w:ascii="맑은 고딕" w:eastAsia="맑은 고딕" w:hAnsi="맑은 고딕" w:cs="맑은 고딕"/>
       <w:b/>
       <w:bCs/>
       <w:color w:val="4F81BD" w:themeColor="accent1"/>
@@ -3303,7 +3505,7 @@
       <w:contextualSpacing/>
     </w:pPr>
     <w:rPr>
-      <w:rFonts w:asciiTheme="majorHAnsi" w:eastAsiaTheme="majorEastAsia" w:hAnsiTheme="majorHAnsi" w:cstheme="majorBidi"/>
+      <w:rFonts w:ascii="맑은 고딕" w:eastAsia="맑은 고딕" w:hAnsi="맑은 고딕" w:cs="맑은 고딕"/>
       <w:color w:val="17365D" w:themeColor="text2" w:themeShade="BF"/>
       <w:spacing w:val="5"/>
       <w:kern w:val="28"/>
@@ -3318,7 +3520,7 @@
     <w:uiPriority w:val="10"/>
     <w:rsid w:val="00FC693F"/>
     <w:rPr>
-      <w:rFonts w:asciiTheme="majorHAnsi" w:eastAsiaTheme="majorEastAsia" w:hAnsiTheme="majorHAnsi" w:cstheme="majorBidi"/>
+      <w:rFonts w:ascii="맑은 고딕" w:eastAsia="맑은 고딕" w:hAnsi="맑은 고딕" w:cs="맑은 고딕"/>
       <w:color w:val="17365D" w:themeColor="text2" w:themeShade="BF"/>
       <w:spacing w:val="5"/>
       <w:kern w:val="28"/>
@@ -3340,7 +3542,7 @@
       </w:numPr>
     </w:pPr>
     <w:rPr>
-      <w:rFonts w:asciiTheme="majorHAnsi" w:eastAsiaTheme="majorEastAsia" w:hAnsiTheme="majorHAnsi" w:cstheme="majorBidi"/>
+      <w:rFonts w:ascii="맑은 고딕" w:eastAsia="맑은 고딕" w:hAnsi="맑은 고딕" w:cs="맑은 고딕"/>
       <w:i/>
       <w:iCs/>
       <w:color w:val="4F81BD" w:themeColor="accent1"/>
@@ -3356,7 +3558,7 @@
     <w:uiPriority w:val="11"/>
     <w:rsid w:val="00FC693F"/>
     <w:rPr>
-      <w:rFonts w:asciiTheme="majorHAnsi" w:eastAsiaTheme="majorEastAsia" w:hAnsiTheme="majorHAnsi" w:cstheme="majorBidi"/>
+      <w:rFonts w:ascii="맑은 고딕" w:eastAsia="맑은 고딕" w:hAnsi="맑은 고딕" w:cs="맑은 고딕"/>
       <w:i/>
       <w:iCs/>
       <w:color w:val="4F81BD" w:themeColor="accent1"/>
@@ -3654,7 +3856,7 @@
     <w:semiHidden/>
     <w:rsid w:val="00FC693F"/>
     <w:rPr>
-      <w:rFonts w:asciiTheme="majorHAnsi" w:eastAsiaTheme="majorEastAsia" w:hAnsiTheme="majorHAnsi" w:cstheme="majorBidi"/>
+      <w:rFonts w:ascii="맑은 고딕" w:eastAsia="맑은 고딕" w:hAnsi="맑은 고딕" w:cs="맑은 고딕"/>
       <w:b/>
       <w:bCs/>
       <w:i/>
@@ -3670,7 +3872,7 @@
     <w:semiHidden/>
     <w:rsid w:val="00FC693F"/>
     <w:rPr>
-      <w:rFonts w:asciiTheme="majorHAnsi" w:eastAsiaTheme="majorEastAsia" w:hAnsiTheme="majorHAnsi" w:cstheme="majorBidi"/>
+      <w:rFonts w:ascii="맑은 고딕" w:eastAsia="맑은 고딕" w:hAnsi="맑은 고딕" w:cs="맑은 고딕"/>
       <w:color w:val="243F60" w:themeColor="accent1" w:themeShade="7F"/>
     </w:rPr>
   </w:style>
@@ -3682,7 +3884,7 @@
     <w:semiHidden/>
     <w:rsid w:val="00FC693F"/>
     <w:rPr>
-      <w:rFonts w:asciiTheme="majorHAnsi" w:eastAsiaTheme="majorEastAsia" w:hAnsiTheme="majorHAnsi" w:cstheme="majorBidi"/>
+      <w:rFonts w:ascii="맑은 고딕" w:eastAsia="맑은 고딕" w:hAnsi="맑은 고딕" w:cs="맑은 고딕"/>
       <w:i/>
       <w:iCs/>
       <w:color w:val="243F60" w:themeColor="accent1" w:themeShade="7F"/>
@@ -3696,7 +3898,7 @@
     <w:semiHidden/>
     <w:rsid w:val="00FC693F"/>
     <w:rPr>
-      <w:rFonts w:asciiTheme="majorHAnsi" w:eastAsiaTheme="majorEastAsia" w:hAnsiTheme="majorHAnsi" w:cstheme="majorBidi"/>
+      <w:rFonts w:ascii="맑은 고딕" w:eastAsia="맑은 고딕" w:hAnsi="맑은 고딕" w:cs="맑은 고딕"/>
       <w:i/>
       <w:iCs/>
       <w:color w:val="404040" w:themeColor="text1" w:themeTint="BF"/>
@@ -3710,7 +3912,7 @@
     <w:semiHidden/>
     <w:rsid w:val="00FC693F"/>
     <w:rPr>
-      <w:rFonts w:asciiTheme="majorHAnsi" w:eastAsiaTheme="majorEastAsia" w:hAnsiTheme="majorHAnsi" w:cstheme="majorBidi"/>
+      <w:rFonts w:ascii="맑은 고딕" w:eastAsia="맑은 고딕" w:hAnsi="맑은 고딕" w:cs="맑은 고딕"/>
       <w:color w:val="4F81BD" w:themeColor="accent1"/>
       <w:sz w:val="20"/>
       <w:szCs w:val="20"/>
@@ -3724,7 +3926,7 @@
     <w:semiHidden/>
     <w:rsid w:val="00FC693F"/>
     <w:rPr>
-      <w:rFonts w:asciiTheme="majorHAnsi" w:eastAsiaTheme="majorEastAsia" w:hAnsiTheme="majorHAnsi" w:cstheme="majorBidi"/>
+      <w:rFonts w:ascii="맑은 고딕" w:eastAsia="맑은 고딕" w:hAnsi="맑은 고딕" w:cs="맑은 고딕"/>
       <w:i/>
       <w:iCs/>
       <w:color w:val="404040" w:themeColor="text1" w:themeTint="BF"/>
@@ -5313,7 +5515,7 @@
         <w:spacing w:before="0" w:after="0" w:line="240" w:lineRule="auto"/>
       </w:pPr>
       <w:rPr>
-        <w:rFonts w:asciiTheme="majorHAnsi" w:eastAsiaTheme="majorEastAsia" w:hAnsiTheme="majorHAnsi" w:cstheme="majorBidi"/>
+        <w:rFonts w:ascii="맑은 고딕" w:eastAsia="맑은 고딕" w:hAnsi="맑은 고딕" w:cs="맑은 고딕"/>
         <w:b/>
         <w:bCs/>
       </w:rPr>
@@ -5334,7 +5536,7 @@
         <w:spacing w:before="0" w:after="0" w:line="240" w:lineRule="auto"/>
       </w:pPr>
       <w:rPr>
-        <w:rFonts w:asciiTheme="majorHAnsi" w:eastAsiaTheme="majorEastAsia" w:hAnsiTheme="majorHAnsi" w:cstheme="majorBidi"/>
+        <w:rFonts w:ascii="맑은 고딕" w:eastAsia="맑은 고딕" w:hAnsi="맑은 고딕" w:cs="맑은 고딕"/>
         <w:b/>
         <w:bCs/>
       </w:rPr>
@@ -5352,14 +5554,14 @@
     </w:tblStylePr>
     <w:tblStylePr w:type="firstCol">
       <w:rPr>
-        <w:rFonts w:asciiTheme="majorHAnsi" w:eastAsiaTheme="majorEastAsia" w:hAnsiTheme="majorHAnsi" w:cstheme="majorBidi"/>
+        <w:rFonts w:ascii="맑은 고딕" w:eastAsia="맑은 고딕" w:hAnsi="맑은 고딕" w:cs="맑은 고딕"/>
         <w:b/>
         <w:bCs/>
       </w:rPr>
     </w:tblStylePr>
     <w:tblStylePr w:type="lastCol">
       <w:rPr>
-        <w:rFonts w:asciiTheme="majorHAnsi" w:eastAsiaTheme="majorEastAsia" w:hAnsiTheme="majorHAnsi" w:cstheme="majorBidi"/>
+        <w:rFonts w:ascii="맑은 고딕" w:eastAsia="맑은 고딕" w:hAnsi="맑은 고딕" w:cs="맑은 고딕"/>
         <w:b/>
         <w:bCs/>
       </w:rPr>
@@ -5443,7 +5645,7 @@
         <w:spacing w:before="0" w:after="0" w:line="240" w:lineRule="auto"/>
       </w:pPr>
       <w:rPr>
-        <w:rFonts w:asciiTheme="majorHAnsi" w:eastAsiaTheme="majorEastAsia" w:hAnsiTheme="majorHAnsi" w:cstheme="majorBidi"/>
+        <w:rFonts w:ascii="맑은 고딕" w:eastAsia="맑은 고딕" w:hAnsi="맑은 고딕" w:cs="맑은 고딕"/>
         <w:b/>
         <w:bCs/>
       </w:rPr>
@@ -5464,7 +5666,7 @@
         <w:spacing w:before="0" w:after="0" w:line="240" w:lineRule="auto"/>
       </w:pPr>
       <w:rPr>
-        <w:rFonts w:asciiTheme="majorHAnsi" w:eastAsiaTheme="majorEastAsia" w:hAnsiTheme="majorHAnsi" w:cstheme="majorBidi"/>
+        <w:rFonts w:ascii="맑은 고딕" w:eastAsia="맑은 고딕" w:hAnsi="맑은 고딕" w:cs="맑은 고딕"/>
         <w:b/>
         <w:bCs/>
       </w:rPr>
@@ -5482,14 +5684,14 @@
     </w:tblStylePr>
     <w:tblStylePr w:type="firstCol">
       <w:rPr>
-        <w:rFonts w:asciiTheme="majorHAnsi" w:eastAsiaTheme="majorEastAsia" w:hAnsiTheme="majorHAnsi" w:cstheme="majorBidi"/>
+        <w:rFonts w:ascii="맑은 고딕" w:eastAsia="맑은 고딕" w:hAnsi="맑은 고딕" w:cs="맑은 고딕"/>
         <w:b/>
         <w:bCs/>
       </w:rPr>
     </w:tblStylePr>
     <w:tblStylePr w:type="lastCol">
       <w:rPr>
-        <w:rFonts w:asciiTheme="majorHAnsi" w:eastAsiaTheme="majorEastAsia" w:hAnsiTheme="majorHAnsi" w:cstheme="majorBidi"/>
+        <w:rFonts w:ascii="맑은 고딕" w:eastAsia="맑은 고딕" w:hAnsi="맑은 고딕" w:cs="맑은 고딕"/>
         <w:b/>
         <w:bCs/>
       </w:rPr>
@@ -5573,7 +5775,7 @@
         <w:spacing w:before="0" w:after="0" w:line="240" w:lineRule="auto"/>
       </w:pPr>
       <w:rPr>
-        <w:rFonts w:asciiTheme="majorHAnsi" w:eastAsiaTheme="majorEastAsia" w:hAnsiTheme="majorHAnsi" w:cstheme="majorBidi"/>
+        <w:rFonts w:ascii="맑은 고딕" w:eastAsia="맑은 고딕" w:hAnsi="맑은 고딕" w:cs="맑은 고딕"/>
         <w:b/>
         <w:bCs/>
       </w:rPr>
@@ -5594,7 +5796,7 @@
         <w:spacing w:before="0" w:after="0" w:line="240" w:lineRule="auto"/>
       </w:pPr>
       <w:rPr>
-        <w:rFonts w:asciiTheme="majorHAnsi" w:eastAsiaTheme="majorEastAsia" w:hAnsiTheme="majorHAnsi" w:cstheme="majorBidi"/>
+        <w:rFonts w:ascii="맑은 고딕" w:eastAsia="맑은 고딕" w:hAnsi="맑은 고딕" w:cs="맑은 고딕"/>
         <w:b/>
         <w:bCs/>
       </w:rPr>
@@ -5612,14 +5814,14 @@
     </w:tblStylePr>
     <w:tblStylePr w:type="firstCol">
       <w:rPr>
-        <w:rFonts w:asciiTheme="majorHAnsi" w:eastAsiaTheme="majorEastAsia" w:hAnsiTheme="majorHAnsi" w:cstheme="majorBidi"/>
+        <w:rFonts w:ascii="맑은 고딕" w:eastAsia="맑은 고딕" w:hAnsi="맑은 고딕" w:cs="맑은 고딕"/>
         <w:b/>
         <w:bCs/>
       </w:rPr>
     </w:tblStylePr>
     <w:tblStylePr w:type="lastCol">
       <w:rPr>
-        <w:rFonts w:asciiTheme="majorHAnsi" w:eastAsiaTheme="majorEastAsia" w:hAnsiTheme="majorHAnsi" w:cstheme="majorBidi"/>
+        <w:rFonts w:ascii="맑은 고딕" w:eastAsia="맑은 고딕" w:hAnsi="맑은 고딕" w:cs="맑은 고딕"/>
         <w:b/>
         <w:bCs/>
       </w:rPr>
@@ -5703,7 +5905,7 @@
         <w:spacing w:before="0" w:after="0" w:line="240" w:lineRule="auto"/>
       </w:pPr>
       <w:rPr>
-        <w:rFonts w:asciiTheme="majorHAnsi" w:eastAsiaTheme="majorEastAsia" w:hAnsiTheme="majorHAnsi" w:cstheme="majorBidi"/>
+        <w:rFonts w:ascii="맑은 고딕" w:eastAsia="맑은 고딕" w:hAnsi="맑은 고딕" w:cs="맑은 고딕"/>
         <w:b/>
         <w:bCs/>
       </w:rPr>
@@ -5724,7 +5926,7 @@
         <w:spacing w:before="0" w:after="0" w:line="240" w:lineRule="auto"/>
       </w:pPr>
       <w:rPr>
-        <w:rFonts w:asciiTheme="majorHAnsi" w:eastAsiaTheme="majorEastAsia" w:hAnsiTheme="majorHAnsi" w:cstheme="majorBidi"/>
+        <w:rFonts w:ascii="맑은 고딕" w:eastAsia="맑은 고딕" w:hAnsi="맑은 고딕" w:cs="맑은 고딕"/>
         <w:b/>
         <w:bCs/>
       </w:rPr>
@@ -5742,14 +5944,14 @@
     </w:tblStylePr>
     <w:tblStylePr w:type="firstCol">
       <w:rPr>
-        <w:rFonts w:asciiTheme="majorHAnsi" w:eastAsiaTheme="majorEastAsia" w:hAnsiTheme="majorHAnsi" w:cstheme="majorBidi"/>
+        <w:rFonts w:ascii="맑은 고딕" w:eastAsia="맑은 고딕" w:hAnsi="맑은 고딕" w:cs="맑은 고딕"/>
         <w:b/>
         <w:bCs/>
       </w:rPr>
     </w:tblStylePr>
     <w:tblStylePr w:type="lastCol">
       <w:rPr>
-        <w:rFonts w:asciiTheme="majorHAnsi" w:eastAsiaTheme="majorEastAsia" w:hAnsiTheme="majorHAnsi" w:cstheme="majorBidi"/>
+        <w:rFonts w:ascii="맑은 고딕" w:eastAsia="맑은 고딕" w:hAnsi="맑은 고딕" w:cs="맑은 고딕"/>
         <w:b/>
         <w:bCs/>
       </w:rPr>
@@ -5833,7 +6035,7 @@
         <w:spacing w:before="0" w:after="0" w:line="240" w:lineRule="auto"/>
       </w:pPr>
       <w:rPr>
-        <w:rFonts w:asciiTheme="majorHAnsi" w:eastAsiaTheme="majorEastAsia" w:hAnsiTheme="majorHAnsi" w:cstheme="majorBidi"/>
+        <w:rFonts w:ascii="맑은 고딕" w:eastAsia="맑은 고딕" w:hAnsi="맑은 고딕" w:cs="맑은 고딕"/>
         <w:b/>
         <w:bCs/>
       </w:rPr>
@@ -5854,7 +6056,7 @@
         <w:spacing w:before="0" w:after="0" w:line="240" w:lineRule="auto"/>
       </w:pPr>
       <w:rPr>
-        <w:rFonts w:asciiTheme="majorHAnsi" w:eastAsiaTheme="majorEastAsia" w:hAnsiTheme="majorHAnsi" w:cstheme="majorBidi"/>
+        <w:rFonts w:ascii="맑은 고딕" w:eastAsia="맑은 고딕" w:hAnsi="맑은 고딕" w:cs="맑은 고딕"/>
         <w:b/>
         <w:bCs/>
       </w:rPr>
@@ -5872,14 +6074,14 @@
     </w:tblStylePr>
     <w:tblStylePr w:type="firstCol">
       <w:rPr>
-        <w:rFonts w:asciiTheme="majorHAnsi" w:eastAsiaTheme="majorEastAsia" w:hAnsiTheme="majorHAnsi" w:cstheme="majorBidi"/>
+        <w:rFonts w:ascii="맑은 고딕" w:eastAsia="맑은 고딕" w:hAnsi="맑은 고딕" w:cs="맑은 고딕"/>
         <w:b/>
         <w:bCs/>
       </w:rPr>
     </w:tblStylePr>
     <w:tblStylePr w:type="lastCol">
       <w:rPr>
-        <w:rFonts w:asciiTheme="majorHAnsi" w:eastAsiaTheme="majorEastAsia" w:hAnsiTheme="majorHAnsi" w:cstheme="majorBidi"/>
+        <w:rFonts w:ascii="맑은 고딕" w:eastAsia="맑은 고딕" w:hAnsi="맑은 고딕" w:cs="맑은 고딕"/>
         <w:b/>
         <w:bCs/>
       </w:rPr>
@@ -5963,7 +6165,7 @@
         <w:spacing w:before="0" w:after="0" w:line="240" w:lineRule="auto"/>
       </w:pPr>
       <w:rPr>
-        <w:rFonts w:asciiTheme="majorHAnsi" w:eastAsiaTheme="majorEastAsia" w:hAnsiTheme="majorHAnsi" w:cstheme="majorBidi"/>
+        <w:rFonts w:ascii="맑은 고딕" w:eastAsia="맑은 고딕" w:hAnsi="맑은 고딕" w:cs="맑은 고딕"/>
         <w:b/>
         <w:bCs/>
       </w:rPr>
@@ -5984,7 +6186,7 @@
         <w:spacing w:before="0" w:after="0" w:line="240" w:lineRule="auto"/>
       </w:pPr>
       <w:rPr>
-        <w:rFonts w:asciiTheme="majorHAnsi" w:eastAsiaTheme="majorEastAsia" w:hAnsiTheme="majorHAnsi" w:cstheme="majorBidi"/>
+        <w:rFonts w:ascii="맑은 고딕" w:eastAsia="맑은 고딕" w:hAnsi="맑은 고딕" w:cs="맑은 고딕"/>
         <w:b/>
         <w:bCs/>
       </w:rPr>
@@ -6002,14 +6204,14 @@
     </w:tblStylePr>
     <w:tblStylePr w:type="firstCol">
       <w:rPr>
-        <w:rFonts w:asciiTheme="majorHAnsi" w:eastAsiaTheme="majorEastAsia" w:hAnsiTheme="majorHAnsi" w:cstheme="majorBidi"/>
+        <w:rFonts w:ascii="맑은 고딕" w:eastAsia="맑은 고딕" w:hAnsi="맑은 고딕" w:cs="맑은 고딕"/>
         <w:b/>
         <w:bCs/>
       </w:rPr>
     </w:tblStylePr>
     <w:tblStylePr w:type="lastCol">
       <w:rPr>
-        <w:rFonts w:asciiTheme="majorHAnsi" w:eastAsiaTheme="majorEastAsia" w:hAnsiTheme="majorHAnsi" w:cstheme="majorBidi"/>
+        <w:rFonts w:ascii="맑은 고딕" w:eastAsia="맑은 고딕" w:hAnsi="맑은 고딕" w:cs="맑은 고딕"/>
         <w:b/>
         <w:bCs/>
       </w:rPr>
@@ -6093,7 +6295,7 @@
         <w:spacing w:before="0" w:after="0" w:line="240" w:lineRule="auto"/>
       </w:pPr>
       <w:rPr>
-        <w:rFonts w:asciiTheme="majorHAnsi" w:eastAsiaTheme="majorEastAsia" w:hAnsiTheme="majorHAnsi" w:cstheme="majorBidi"/>
+        <w:rFonts w:ascii="맑은 고딕" w:eastAsia="맑은 고딕" w:hAnsi="맑은 고딕" w:cs="맑은 고딕"/>
         <w:b/>
         <w:bCs/>
       </w:rPr>
@@ -6114,7 +6316,7 @@
         <w:spacing w:before="0" w:after="0" w:line="240" w:lineRule="auto"/>
       </w:pPr>
       <w:rPr>
-        <w:rFonts w:asciiTheme="majorHAnsi" w:eastAsiaTheme="majorEastAsia" w:hAnsiTheme="majorHAnsi" w:cstheme="majorBidi"/>
+        <w:rFonts w:ascii="맑은 고딕" w:eastAsia="맑은 고딕" w:hAnsi="맑은 고딕" w:cs="맑은 고딕"/>
         <w:b/>
         <w:bCs/>
       </w:rPr>
@@ -6132,14 +6334,14 @@
     </w:tblStylePr>
     <w:tblStylePr w:type="firstCol">
       <w:rPr>
-        <w:rFonts w:asciiTheme="majorHAnsi" w:eastAsiaTheme="majorEastAsia" w:hAnsiTheme="majorHAnsi" w:cstheme="majorBidi"/>
+        <w:rFonts w:ascii="맑은 고딕" w:eastAsia="맑은 고딕" w:hAnsi="맑은 고딕" w:cs="맑은 고딕"/>
         <w:b/>
         <w:bCs/>
       </w:rPr>
     </w:tblStylePr>
     <w:tblStylePr w:type="lastCol">
       <w:rPr>
-        <w:rFonts w:asciiTheme="majorHAnsi" w:eastAsiaTheme="majorEastAsia" w:hAnsiTheme="majorHAnsi" w:cstheme="majorBidi"/>
+        <w:rFonts w:ascii="맑은 고딕" w:eastAsia="맑은 고딕" w:hAnsi="맑은 고딕" w:cs="맑은 고딕"/>
         <w:b/>
         <w:bCs/>
       </w:rPr>
@@ -8004,7 +8206,7 @@
     </w:tblPr>
     <w:tblStylePr w:type="firstRow">
       <w:rPr>
-        <w:rFonts w:asciiTheme="majorHAnsi" w:eastAsiaTheme="majorEastAsia" w:hAnsiTheme="majorHAnsi" w:cstheme="majorBidi"/>
+        <w:rFonts w:ascii="맑은 고딕" w:eastAsia="맑은 고딕" w:hAnsi="맑은 고딕" w:cs="맑은 고딕"/>
       </w:rPr>
       <w:tblPr/>
       <w:tcPr>
@@ -8088,7 +8290,7 @@
     </w:tblPr>
     <w:tblStylePr w:type="firstRow">
       <w:rPr>
-        <w:rFonts w:asciiTheme="majorHAnsi" w:eastAsiaTheme="majorEastAsia" w:hAnsiTheme="majorHAnsi" w:cstheme="majorBidi"/>
+        <w:rFonts w:ascii="맑은 고딕" w:eastAsia="맑은 고딕" w:hAnsi="맑은 고딕" w:cs="맑은 고딕"/>
       </w:rPr>
       <w:tblPr/>
       <w:tcPr>
@@ -8172,7 +8374,7 @@
     </w:tblPr>
     <w:tblStylePr w:type="firstRow">
       <w:rPr>
-        <w:rFonts w:asciiTheme="majorHAnsi" w:eastAsiaTheme="majorEastAsia" w:hAnsiTheme="majorHAnsi" w:cstheme="majorBidi"/>
+        <w:rFonts w:ascii="맑은 고딕" w:eastAsia="맑은 고딕" w:hAnsi="맑은 고딕" w:cs="맑은 고딕"/>
       </w:rPr>
       <w:tblPr/>
       <w:tcPr>
@@ -8256,7 +8458,7 @@
     </w:tblPr>
     <w:tblStylePr w:type="firstRow">
       <w:rPr>
-        <w:rFonts w:asciiTheme="majorHAnsi" w:eastAsiaTheme="majorEastAsia" w:hAnsiTheme="majorHAnsi" w:cstheme="majorBidi"/>
+        <w:rFonts w:ascii="맑은 고딕" w:eastAsia="맑은 고딕" w:hAnsi="맑은 고딕" w:cs="맑은 고딕"/>
       </w:rPr>
       <w:tblPr/>
       <w:tcPr>
@@ -8340,7 +8542,7 @@
     </w:tblPr>
     <w:tblStylePr w:type="firstRow">
       <w:rPr>
-        <w:rFonts w:asciiTheme="majorHAnsi" w:eastAsiaTheme="majorEastAsia" w:hAnsiTheme="majorHAnsi" w:cstheme="majorBidi"/>
+        <w:rFonts w:ascii="맑은 고딕" w:eastAsia="맑은 고딕" w:hAnsi="맑은 고딕" w:cs="맑은 고딕"/>
       </w:rPr>
       <w:tblPr/>
       <w:tcPr>
@@ -8424,7 +8626,7 @@
     </w:tblPr>
     <w:tblStylePr w:type="firstRow">
       <w:rPr>
-        <w:rFonts w:asciiTheme="majorHAnsi" w:eastAsiaTheme="majorEastAsia" w:hAnsiTheme="majorHAnsi" w:cstheme="majorBidi"/>
+        <w:rFonts w:ascii="맑은 고딕" w:eastAsia="맑은 고딕" w:hAnsi="맑은 고딕" w:cs="맑은 고딕"/>
       </w:rPr>
       <w:tblPr/>
       <w:tcPr>
@@ -8508,7 +8710,7 @@
     </w:tblPr>
     <w:tblStylePr w:type="firstRow">
       <w:rPr>
-        <w:rFonts w:asciiTheme="majorHAnsi" w:eastAsiaTheme="majorEastAsia" w:hAnsiTheme="majorHAnsi" w:cstheme="majorBidi"/>
+        <w:rFonts w:ascii="맑은 고딕" w:eastAsia="맑은 고딕" w:hAnsi="맑은 고딕" w:cs="맑은 고딕"/>
       </w:rPr>
       <w:tblPr/>
       <w:tcPr>
@@ -8573,7 +8775,7 @@
       <w:spacing w:after="0" w:line="240" w:lineRule="auto"/>
     </w:pPr>
     <w:rPr>
-      <w:rFonts w:asciiTheme="majorHAnsi" w:eastAsiaTheme="majorEastAsia" w:hAnsiTheme="majorHAnsi" w:cstheme="majorBidi"/>
+      <w:rFonts w:ascii="맑은 고딕" w:eastAsia="맑은 고딕" w:hAnsi="맑은 고딕" w:cs="맑은 고딕"/>
       <w:color w:val="000000" w:themeColor="text1"/>
     </w:rPr>
     <w:tblPr>
@@ -8701,7 +8903,7 @@
       <w:spacing w:after="0" w:line="240" w:lineRule="auto"/>
     </w:pPr>
     <w:rPr>
-      <w:rFonts w:asciiTheme="majorHAnsi" w:eastAsiaTheme="majorEastAsia" w:hAnsiTheme="majorHAnsi" w:cstheme="majorBidi"/>
+      <w:rFonts w:ascii="맑은 고딕" w:eastAsia="맑은 고딕" w:hAnsi="맑은 고딕" w:cs="맑은 고딕"/>
       <w:color w:val="000000" w:themeColor="text1"/>
     </w:rPr>
     <w:tblPr>
@@ -8829,7 +9031,7 @@
       <w:spacing w:after="0" w:line="240" w:lineRule="auto"/>
     </w:pPr>
     <w:rPr>
-      <w:rFonts w:asciiTheme="majorHAnsi" w:eastAsiaTheme="majorEastAsia" w:hAnsiTheme="majorHAnsi" w:cstheme="majorBidi"/>
+      <w:rFonts w:ascii="맑은 고딕" w:eastAsia="맑은 고딕" w:hAnsi="맑은 고딕" w:cs="맑은 고딕"/>
       <w:color w:val="000000" w:themeColor="text1"/>
     </w:rPr>
     <w:tblPr>
@@ -8957,7 +9159,7 @@
       <w:spacing w:after="0" w:line="240" w:lineRule="auto"/>
     </w:pPr>
     <w:rPr>
-      <w:rFonts w:asciiTheme="majorHAnsi" w:eastAsiaTheme="majorEastAsia" w:hAnsiTheme="majorHAnsi" w:cstheme="majorBidi"/>
+      <w:rFonts w:ascii="맑은 고딕" w:eastAsia="맑은 고딕" w:hAnsi="맑은 고딕" w:cs="맑은 고딕"/>
       <w:color w:val="000000" w:themeColor="text1"/>
     </w:rPr>
     <w:tblPr>
@@ -9085,7 +9287,7 @@
       <w:spacing w:after="0" w:line="240" w:lineRule="auto"/>
     </w:pPr>
     <w:rPr>
-      <w:rFonts w:asciiTheme="majorHAnsi" w:eastAsiaTheme="majorEastAsia" w:hAnsiTheme="majorHAnsi" w:cstheme="majorBidi"/>
+      <w:rFonts w:ascii="맑은 고딕" w:eastAsia="맑은 고딕" w:hAnsi="맑은 고딕" w:cs="맑은 고딕"/>
       <w:color w:val="000000" w:themeColor="text1"/>
     </w:rPr>
     <w:tblPr>
@@ -9213,7 +9415,7 @@
       <w:spacing w:after="0" w:line="240" w:lineRule="auto"/>
     </w:pPr>
     <w:rPr>
-      <w:rFonts w:asciiTheme="majorHAnsi" w:eastAsiaTheme="majorEastAsia" w:hAnsiTheme="majorHAnsi" w:cstheme="majorBidi"/>
+      <w:rFonts w:ascii="맑은 고딕" w:eastAsia="맑은 고딕" w:hAnsi="맑은 고딕" w:cs="맑은 고딕"/>
       <w:color w:val="000000" w:themeColor="text1"/>
     </w:rPr>
     <w:tblPr>
@@ -9341,7 +9543,7 @@
       <w:spacing w:after="0" w:line="240" w:lineRule="auto"/>
     </w:pPr>
     <w:rPr>
-      <w:rFonts w:asciiTheme="majorHAnsi" w:eastAsiaTheme="majorEastAsia" w:hAnsiTheme="majorHAnsi" w:cstheme="majorBidi"/>
+      <w:rFonts w:ascii="맑은 고딕" w:eastAsia="맑은 고딕" w:hAnsi="맑은 고딕" w:cs="맑은 고딕"/>
       <w:color w:val="000000" w:themeColor="text1"/>
     </w:rPr>
     <w:tblPr>
@@ -9980,7 +10182,7 @@
       <w:spacing w:after="0" w:line="240" w:lineRule="auto"/>
     </w:pPr>
     <w:rPr>
-      <w:rFonts w:asciiTheme="majorHAnsi" w:eastAsiaTheme="majorEastAsia" w:hAnsiTheme="majorHAnsi" w:cstheme="majorBidi"/>
+      <w:rFonts w:ascii="맑은 고딕" w:eastAsia="맑은 고딕" w:hAnsi="맑은 고딕" w:cs="맑은 고딕"/>
       <w:color w:val="000000" w:themeColor="text1"/>
     </w:rPr>
     <w:tblPr>
@@ -10105,7 +10307,7 @@
       <w:spacing w:after="0" w:line="240" w:lineRule="auto"/>
     </w:pPr>
     <w:rPr>
-      <w:rFonts w:asciiTheme="majorHAnsi" w:eastAsiaTheme="majorEastAsia" w:hAnsiTheme="majorHAnsi" w:cstheme="majorBidi"/>
+      <w:rFonts w:ascii="맑은 고딕" w:eastAsia="맑은 고딕" w:hAnsi="맑은 고딕" w:cs="맑은 고딕"/>
       <w:color w:val="000000" w:themeColor="text1"/>
     </w:rPr>
     <w:tblPr>
@@ -10230,7 +10432,7 @@
       <w:spacing w:after="0" w:line="240" w:lineRule="auto"/>
     </w:pPr>
     <w:rPr>
-      <w:rFonts w:asciiTheme="majorHAnsi" w:eastAsiaTheme="majorEastAsia" w:hAnsiTheme="majorHAnsi" w:cstheme="majorBidi"/>
+      <w:rFonts w:ascii="맑은 고딕" w:eastAsia="맑은 고딕" w:hAnsi="맑은 고딕" w:cs="맑은 고딕"/>
       <w:color w:val="000000" w:themeColor="text1"/>
     </w:rPr>
     <w:tblPr>
@@ -10355,7 +10557,7 @@
       <w:spacing w:after="0" w:line="240" w:lineRule="auto"/>
     </w:pPr>
     <w:rPr>
-      <w:rFonts w:asciiTheme="majorHAnsi" w:eastAsiaTheme="majorEastAsia" w:hAnsiTheme="majorHAnsi" w:cstheme="majorBidi"/>
+      <w:rFonts w:ascii="맑은 고딕" w:eastAsia="맑은 고딕" w:hAnsi="맑은 고딕" w:cs="맑은 고딕"/>
       <w:color w:val="000000" w:themeColor="text1"/>
     </w:rPr>
     <w:tblPr>
@@ -10480,7 +10682,7 @@
       <w:spacing w:after="0" w:line="240" w:lineRule="auto"/>
     </w:pPr>
     <w:rPr>
-      <w:rFonts w:asciiTheme="majorHAnsi" w:eastAsiaTheme="majorEastAsia" w:hAnsiTheme="majorHAnsi" w:cstheme="majorBidi"/>
+      <w:rFonts w:ascii="맑은 고딕" w:eastAsia="맑은 고딕" w:hAnsi="맑은 고딕" w:cs="맑은 고딕"/>
       <w:color w:val="000000" w:themeColor="text1"/>
     </w:rPr>
     <w:tblPr>
@@ -10605,7 +10807,7 @@
       <w:spacing w:after="0" w:line="240" w:lineRule="auto"/>
     </w:pPr>
     <w:rPr>
-      <w:rFonts w:asciiTheme="majorHAnsi" w:eastAsiaTheme="majorEastAsia" w:hAnsiTheme="majorHAnsi" w:cstheme="majorBidi"/>
+      <w:rFonts w:ascii="맑은 고딕" w:eastAsia="맑은 고딕" w:hAnsi="맑은 고딕" w:cs="맑은 고딕"/>
       <w:color w:val="000000" w:themeColor="text1"/>
     </w:rPr>
     <w:tblPr>
@@ -10730,7 +10932,7 @@
       <w:spacing w:after="0" w:line="240" w:lineRule="auto"/>
     </w:pPr>
     <w:rPr>
-      <w:rFonts w:asciiTheme="majorHAnsi" w:eastAsiaTheme="majorEastAsia" w:hAnsiTheme="majorHAnsi" w:cstheme="majorBidi"/>
+      <w:rFonts w:ascii="맑은 고딕" w:eastAsia="맑은 고딕" w:hAnsi="맑은 고딕" w:cs="맑은 고딕"/>
       <w:color w:val="000000" w:themeColor="text1"/>
     </w:rPr>
     <w:tblPr>

</xml_diff>

<commit_message>
10_Bruteforce_Login_Protection: Burp Suite Intruder 탭 명칭을 Options→Settings로 갱신
</commit_message>
<xml_diff>
--- a/docs/security/10_Bruteforce_Login_Protection.docx
+++ b/docs/security/10_Bruteforce_Login_Protection.docx
@@ -15,7 +15,7 @@
           <w:sz w:val="30"/>
           <w:szCs w:val="30"/>
         </w:rPr>
-        <w:t xml:space="preserve">웹 보안 실습 교안</w:t>
+        <w:t>웹 보안 실습 교안</w:t>
       </w:r>
     </w:p>
     <w:p>
@@ -31,7 +31,7 @@
           <w:sz w:val="40"/>
           <w:szCs w:val="40"/>
         </w:rPr>
-        <w:t xml:space="preserve">로그인 시도 제한 (Account Lockout / Brute Force 방어)</w:t>
+        <w:t>로그인 시도 제한 (Account Lockout / Brute Force 방어)</w:t>
       </w:r>
     </w:p>
     <w:p>
@@ -43,7 +43,7 @@
         <w:rPr>
           <w:color w:val="595959"/>
         </w:rPr>
-        <w:t xml:space="preserve">Identification and Authentication Failures / OWASP #7(식별 및 인증 실패)</w:t>
+        <w:t>Identification and Authentication Failures / OWASP #7(식별 및 인증 실패)</w:t>
       </w:r>
     </w:p>
     <w:p>
@@ -55,7 +55,7 @@
         <w:rPr>
           <w:color w:val="595959"/>
         </w:rPr>
-        <w:t xml:space="preserve">실습 프로젝트 : Student_JWT (feature/bruteforce-demo)</w:t>
+        <w:t>실습 프로젝트 : Student_JWT (feature/bruteforce-demo)</w:t>
       </w:r>
     </w:p>
     <w:p>
@@ -87,7 +87,7 @@
         <w:spacing w:after="50" w:line="264" w:lineRule="auto"/>
       </w:pPr>
       <w:r>
-        <w:t xml:space="preserve">1. 개념 요약</w:t>
+        <w:t>1. 개념 요약</w:t>
       </w:r>
     </w:p>
     <w:p>
@@ -106,7 +106,7 @@
         <w:rPr>
           <w:lang w:eastAsia="ko-KR"/>
         </w:rPr>
-        <w:t xml:space="preserve">2. 변경 내역 — 1단계(취약) → 2단계(조치)</w:t>
+        <w:t>2. 변경 내역 — 1단계(취약) → 2단계(조치)</w:t>
       </w:r>
     </w:p>
     <w:p>
@@ -119,7 +119,7 @@
         <w:spacing w:after="50" w:line="264" w:lineRule="auto"/>
       </w:pPr>
       <w:r>
-        <w:t xml:space="preserve">3. 공격 실습 — 검증됨</w:t>
+        <w:t xml:space="preserve">3. 공격 실습 </w:t>
       </w:r>
     </w:p>
     <w:p>
@@ -132,7 +132,7 @@
         <w:spacing w:after="50" w:line="264" w:lineRule="auto"/>
       </w:pPr>
       <w:r>
-        <w:t xml:space="preserve">4. 방어 원리</w:t>
+        <w:t>4. 방어 원리</w:t>
       </w:r>
     </w:p>
     <w:p>
@@ -145,7 +145,7 @@
         <w:spacing w:after="50" w:line="264" w:lineRule="auto"/>
       </w:pPr>
       <w:r>
-        <w:t xml:space="preserve">5. 방어 정리</w:t>
+        <w:t>5. 방어 정리</w:t>
       </w:r>
     </w:p>
     <w:p>
@@ -158,7 +158,7 @@
         <w:spacing w:after="50" w:line="264" w:lineRule="auto"/>
       </w:pPr>
       <w:r>
-        <w:t xml:space="preserve">6. 관련 문서</w:t>
+        <w:t>6. 관련 문서</w:t>
       </w:r>
     </w:p>
     <w:p>
@@ -174,7 +174,7 @@
           <w:sz w:val="32"/>
         </w:rPr>
         <w:lastRenderedPageBreak/>
-        <w:t xml:space="preserve">10. 로그인 시도 제한 (Account Lockout / Brute Force 방어) 실습</w:t>
+        <w:t>10. 로그인 시도 제한 (Account Lockout / Brute Force 방어) 실습</w:t>
       </w:r>
     </w:p>
     <w:p>
@@ -191,7 +191,7 @@
           <w:sz w:val="30"/>
           <w:lang w:eastAsia="ko-KR"/>
         </w:rPr>
-        <w:t xml:space="preserve">1. 개념 요약</w:t>
+        <w:t>1. 개념 요약</w:t>
       </w:r>
     </w:p>
     <w:p>
@@ -212,13 +212,13 @@
           <w:b/>
           <w:lang w:eastAsia="ko-KR"/>
         </w:rPr>
-        <w:t xml:space="preserve">시도 횟수 제한이 없으면</w:t>
+        <w:t>시도 횟수 제한이 없으면</w:t>
       </w:r>
       <w:r>
         <w:rPr>
           <w:lang w:eastAsia="ko-KR"/>
         </w:rPr>
-        <w:t xml:space="preserve">, 공격자는 Burp Suite Intruder 같은 자동화 도구로 비밀번호 후보 목록을 초당 수십~수백 번 반복 대입할 수 있다. 서버 입장에선 정상 로그인 요청과 구분이 안 되므로, 사전 공격(Dictionary attack)·크리덴셜 스터핑이 "뚫리느냐"가 아니라 "언제 뚫리느냐"의 시간 문제가 된다.</w:t>
+        <w:t>, 공격자는 Burp Suite Intruder 같은 자동화 도구로 비밀번호 후보 목록을 초당 수십~수백 번 반복 대입할 수 있다. 서버 입장에선 정상 로그인 요청과 구분이 안 되므로, 사전 공격(Dictionary attack)·크리덴셜 스터핑이 "뚫리느냐"가 아니라 "언제 뚫리느냐"의 시간 문제가 된다.</w:t>
       </w:r>
     </w:p>
     <w:p>
@@ -243,7 +243,7 @@
           <w:sz w:val="30"/>
           <w:lang w:eastAsia="ko-KR"/>
         </w:rPr>
-        <w:t xml:space="preserve">2. 변경 내역 — 1단계(취약) → 2단계(조치)</w:t>
+        <w:t>2. 변경 내역 — 1단계(취약) → 2단계(조치)</w:t>
       </w:r>
     </w:p>
     <w:p>
@@ -255,7 +255,7 @@
         <w:rPr>
           <w:color w:val="2E5496"/>
         </w:rPr>
-        <w:t xml:space="preserve">2-1. 1단계(취약) — 기존 상태</w:t>
+        <w:t>2-1. 1단계(취약) — 기존 상태</w:t>
       </w:r>
     </w:p>
     <w:p>
@@ -284,7 +284,7 @@
           <w:rFonts w:ascii="Consolas" w:hAnsi="Consolas"/>
           <w:sz w:val="18"/>
         </w:rPr>
-        <w:t xml:space="preserve">public ResponseEntity&lt;AuthResponse&gt; authenticateAndGetToken(@Valid @RequestBody AuthRequest authRequest) {</w:t>
+        <w:t>public ResponseEntity&lt;AuthResponse&gt; authenticateAndGetToken(@Valid @RequestBody AuthRequest authRequest) {</w:t>
       </w:r>
       <w:r>
         <w:br/>
@@ -410,7 +410,7 @@
           <w:color w:val="2E5496"/>
           <w:lang w:eastAsia="ko-KR"/>
         </w:rPr>
-        <w:t xml:space="preserve">2-2. 2단계(조치) — 추가된 코드</w:t>
+        <w:t>2-2. 2단계(조치) — 추가된 코드</w:t>
       </w:r>
     </w:p>
     <w:p>
@@ -994,7 +994,7 @@
           <w:rFonts w:ascii="Consolas" w:hAnsi="Consolas"/>
           <w:sz w:val="18"/>
         </w:rPr>
-        <w:t xml:space="preserve">public ResponseEntity&lt;AuthResponse&gt; authenticateAndGetToken(@Valid @RequestBody AuthRequest authRequest) {</w:t>
+        <w:t>public ResponseEntity&lt;AuthResponse&gt; authenticateAndGetToken(@Valid @RequestBody AuthRequest authRequest) {</w:t>
       </w:r>
       <w:r>
         <w:br/>
@@ -1233,6 +1233,92 @@
       <w:pPr>
         <w:spacing w:after="90" w:line="240" w:lineRule="auto"/>
         <w:rPr>
+          <w:color w:val="000000" w:themeColor="text1"/>
+          <w:lang w:eastAsia="ko-KR"/>
+        </w:rPr>
+      </w:pPr>
+      <w:r>
+        <w:rPr>
+          <w:b/>
+          <w:color w:val="000000" w:themeColor="text1"/>
+          <w:lang w:eastAsia="ko-KR"/>
+        </w:rPr>
+        <w:lastRenderedPageBreak/>
+        <w:t>왜 컨트롤러에서 막았나</w:t>
+      </w:r>
+      <w:r>
+        <w:rPr>
+          <w:color w:val="000000" w:themeColor="text1"/>
+          <w:lang w:eastAsia="ko-KR"/>
+        </w:rPr>
+        <w:t>: `UserDetails.isAccountNonLocked()`를 오버라이드</w:t>
+      </w:r>
+      <w:r>
+        <w:rPr>
+          <w:rFonts w:hint="eastAsia"/>
+          <w:color w:val="000000" w:themeColor="text1"/>
+          <w:lang w:eastAsia="ko-KR"/>
+        </w:rPr>
+        <w:t xml:space="preserve"> 하여</w:t>
+      </w:r>
+      <w:r>
+        <w:rPr>
+          <w:color w:val="000000" w:themeColor="text1"/>
+          <w:lang w:eastAsia="ko-KR"/>
+        </w:rPr>
+        <w:t xml:space="preserve"> Spring Security의 내부 `LockedException`에 맡기는 방법도 있지만, 그 경로는 메시지가 영문 고정값</w:t>
+      </w:r>
+      <w:r>
+        <w:rPr>
+          <w:rFonts w:hint="eastAsia"/>
+          <w:color w:val="000000" w:themeColor="text1"/>
+          <w:lang w:eastAsia="ko-KR"/>
+        </w:rPr>
+        <w:t xml:space="preserve"> </w:t>
+      </w:r>
+      <w:r>
+        <w:rPr>
+          <w:color w:val="000000" w:themeColor="text1"/>
+          <w:lang w:eastAsia="ko-KR"/>
+        </w:rPr>
+        <w:t xml:space="preserve">이고 "몇 초 후 재시도" 같은 정보를 줄 수 없다. </w:t>
+      </w:r>
+    </w:p>
+    <w:p>
+      <w:pPr>
+        <w:spacing w:after="90" w:line="240" w:lineRule="auto"/>
+        <w:rPr>
+          <w:color w:val="000000" w:themeColor="text1"/>
+          <w:lang w:eastAsia="ko-KR"/>
+        </w:rPr>
+      </w:pPr>
+      <w:r>
+        <w:rPr>
+          <w:color w:val="000000" w:themeColor="text1"/>
+          <w:lang w:eastAsia="ko-KR"/>
+        </w:rPr>
+        <w:t>대신 `authenticationManager.authenticate(...)` 호출 앞뒤를 직접 감싸서, 잠금 여부를 비밀번호 검증 전에 먼저 확인하고(불필요한 해시 비교를 생략), 실패/성공 결과에 따라 직접 카운트를 갱신한다</w:t>
+      </w:r>
+      <w:r>
+        <w:rPr>
+          <w:rFonts w:hint="eastAsia"/>
+          <w:color w:val="000000" w:themeColor="text1"/>
+          <w:lang w:eastAsia="ko-KR"/>
+        </w:rPr>
+        <w:t>.</w:t>
+      </w:r>
+      <w:r>
+        <w:rPr>
+          <w:color w:val="000000" w:themeColor="text1"/>
+          <w:lang w:eastAsia="ko-KR"/>
+        </w:rPr>
+        <w:t xml:space="preserve"> — 흐름이 컨트롤러 한 곳에 보여서 추적하기 쉽다.</w:t>
+      </w:r>
+    </w:p>
+    <w:p>
+      <w:pPr>
+        <w:spacing w:after="90" w:line="240" w:lineRule="auto"/>
+        <w:rPr>
           <w:color w:val="595959"/>
           <w:lang w:eastAsia="ko-KR"/>
         </w:rPr>
@@ -1240,106 +1326,51 @@
       <w:r>
         <w:rPr>
           <w:b/>
-          <w:color w:val="595959"/>
+          <w:color w:val="000000" w:themeColor="text1"/>
           <w:lang w:eastAsia="ko-KR"/>
         </w:rPr>
-        <w:lastRenderedPageBreak/>
-        <w:t xml:space="preserve">왜 컨트롤러에서 막았나</w:t>
-      </w:r>
-      <w:r>
-        <w:rPr>
-          <w:color w:val="595959"/>
+        <w:t>업데이트(2-4 참고)</w:t>
+      </w:r>
+      <w:r>
+        <w:rPr>
+          <w:color w:val="000000" w:themeColor="text1"/>
           <w:lang w:eastAsia="ko-KR"/>
         </w:rPr>
-        <w:t xml:space="preserve">: `UserDetails.isAccountNonLocked()`를 오버라이드</w:t>
+        <w:t>: 이 설계는 UserInfoController.login()(REST)에만 적용되어, 화면 로그인(/login-process)에</w:t>
       </w:r>
       <w:r>
         <w:rPr>
           <w:rFonts w:hint="eastAsia"/>
-          <w:color w:val="595959"/>
+          <w:color w:val="000000" w:themeColor="text1"/>
           <w:lang w:eastAsia="ko-KR"/>
         </w:rPr>
-        <w:t xml:space="preserve"> 하여</w:t>
-      </w:r>
-      <w:r>
-        <w:rPr>
-          <w:color w:val="595959"/>
+        <w:t>서도</w:t>
+      </w:r>
+      <w:r>
+        <w:rPr>
+          <w:color w:val="000000" w:themeColor="text1"/>
           <w:lang w:eastAsia="ko-KR"/>
         </w:rPr>
-        <w:t xml:space="preserve"> Spring Security의 내부 `LockedException`에 맡기는 방법도 있지만, 그 경로는 메시지가 영문 고정값</w:t>
+        <w:t xml:space="preserve"> 잠금 확인</w:t>
       </w:r>
       <w:r>
         <w:rPr>
           <w:rFonts w:hint="eastAsia"/>
-          <w:color w:val="595959"/>
+          <w:color w:val="000000" w:themeColor="text1"/>
           <w:lang w:eastAsia="ko-KR"/>
         </w:rPr>
-        <w:t xml:space="preserve"> </w:t>
-      </w:r>
-      <w:r>
-        <w:rPr>
-          <w:color w:val="595959"/>
+        <w:t>처리</w:t>
+      </w:r>
+      <w:r>
+        <w:rPr>
+          <w:color w:val="000000" w:themeColor="text1"/>
           <w:lang w:eastAsia="ko-KR"/>
         </w:rPr>
-        <w:t xml:space="preserve">이고 "몇 초 후 재시도" 같은 정보를 줄 수 없다. </w:t>
+        <w:t xml:space="preserve"> 실패/성공 이후 두 경로의 공통 지점으로 위치를 옮겼다.</w:t>
       </w:r>
     </w:p>
     <w:p>
       <w:pPr>
-        <w:spacing w:after="90" w:line="240" w:lineRule="auto"/>
-        <w:rPr>
-          <w:lang w:eastAsia="ko-KR"/>
-        </w:rPr>
-      </w:pPr>
-      <w:r>
-        <w:rPr>
-          <w:color w:val="595959"/>
-          <w:lang w:eastAsia="ko-KR"/>
-        </w:rPr>
-        <w:t xml:space="preserve">대신 `authenticationManager.authenticate(...)` 호출 앞뒤를 직접 감싸서, 잠금 여부를 비밀번호 검증 전에 먼저 확인하고(불필요한 해시 비교를 생략), 실패/성공 결과에 따라 직접 카운트를 갱신한다</w:t>
-      </w:r>
-      <w:r>
-        <w:rPr>
-          <w:rFonts w:hint="eastAsia"/>
-          <w:color w:val="595959"/>
-          <w:lang w:eastAsia="ko-KR"/>
-        </w:rPr>
-        <w:t>.</w:t>
-      </w:r>
-      <w:r>
-        <w:rPr>
-          <w:color w:val="595959"/>
-          <w:lang w:eastAsia="ko-KR"/>
-        </w:rPr>
-        <w:t xml:space="preserve"> — 흐름이 컨트롤러 한 곳에 보여서 추적하기 쉽다.</w:t>
-      </w:r>
-    </w:p>
-    <w:p>
-      <w:pPr>
-        <w:spacing w:after="90" w:line="240" w:lineRule="auto"/>
-        <w:rPr>
-          <w:color w:val="595959"/>
-          <w:lang w:eastAsia="ko-KR"/>
-        </w:rPr>
-      </w:pPr>
-      <w:r>
-        <w:rPr>
-          <w:b/>
-          <w:color w:val="595959"/>
-          <w:lang w:eastAsia="ko-KR"/>
-        </w:rPr>
-        <w:t xml:space="preserve">업데이트(2-4 참고)</w:t>
-      </w:r>
-      <w:r>
-        <w:rPr>
-          <w:color w:val="595959"/>
-          <w:lang w:eastAsia="ko-KR"/>
-        </w:rPr>
-        <w:t xml:space="preserve">: 이 설계는 UserInfoController.login()(REST)에만 적용되어, 화면 로그인(/login-process)에는 잠금 확인도 실패/성공 집계도 전혀 적용되지 않는 사각지대가 있었다. 이후 두 경로의 공통 지점으로 위치를 옮겼다.</w:t>
-      </w:r>
-    </w:p>
-    <w:p>
-      <w:pPr>
         <w:pStyle w:val="21"/>
         <w:spacing w:before="240" w:after="100"/>
         <w:rPr>
@@ -1351,7 +1382,7 @@
           <w:color w:val="2E5496"/>
           <w:lang w:eastAsia="ko-KR"/>
         </w:rPr>
-        <w:t xml:space="preserve">2-3. 변경/추가 파일 한눈에 보기</w:t>
+        <w:t>2-3. 변경/추가 파일 한눈에 보기</w:t>
       </w:r>
     </w:p>
     <w:tbl>
@@ -1418,7 +1449,7 @@
                 <w:color w:val="FFFFFF"/>
                 <w:sz w:val="18"/>
               </w:rPr>
-              <w:t xml:space="preserve">한 일</w:t>
+              <w:t>한 일</w:t>
             </w:r>
           </w:p>
         </w:tc>
@@ -1459,7 +1490,7 @@
               <w:rPr>
                 <w:sz w:val="18"/>
               </w:rPr>
-              <w:t xml:space="preserve">failedLoginCount, lockedUntil 필드 추가</w:t>
+              <w:t>failedLoginCount, lockedUntil 필드 추가</w:t>
             </w:r>
           </w:p>
         </w:tc>
@@ -1500,7 +1531,7 @@
               <w:rPr>
                 <w:sz w:val="18"/>
               </w:rPr>
-              <w:t xml:space="preserve">잠금 확인(assertNotLocked)·실패 누적(onFailure)·성공 초기화(onSuccess)</w:t>
+              <w:t>잠금 확인(assertNotLocked)·실패 누적(onFailure)·성공 초기화(onSuccess)</w:t>
             </w:r>
           </w:p>
         </w:tc>
@@ -1547,7 +1578,7 @@
                 <w:sz w:val="18"/>
                 <w:lang w:eastAsia="ko-KR"/>
               </w:rPr>
-              <w:t xml:space="preserve">login()에서 잠금 확인 → 인증 시도 → 성공/실패에 따라 LoginAttemptService 호출</w:t>
+              <w:t>login()에서 잠금 확인 → 인증 시도 → 성공/실패에 따라 LoginAttemptService 호출</w:t>
             </w:r>
           </w:p>
         </w:tc>
@@ -1588,7 +1619,7 @@
               <w:rPr>
                 <w:sz w:val="18"/>
               </w:rPr>
-              <w:t xml:space="preserve">login.lockout.max-attempts=5, login.lockout.duration-seconds=300 추가</w:t>
+              <w:t>login.lockout.max-attempts=5, login.lockout.duration-seconds=300 추가</w:t>
             </w:r>
           </w:p>
         </w:tc>
@@ -1629,7 +1660,7 @@
               <w:rPr>
                 <w:sz w:val="18"/>
               </w:rPr>
-              <w:t xml:space="preserve">loadUserByUsername() 에서 비밀번호 검증 전에 assertNotLocked() 호출 - 폼/REST 로그인 공통 지점</w:t>
+              <w:t>loadUserByUsername() 에서 비밀번호 검증 전에 assertNotLocked() 호출 - 폼/REST 로그인 공통 지점</w:t>
             </w:r>
           </w:p>
         </w:tc>
@@ -1670,7 +1701,7 @@
               <w:rPr>
                 <w:sz w:val="18"/>
               </w:rPr>
-              <w:t xml:space="preserve">onAuthenticationSuccess/onAuthenticationFailure 에서 LoginAttemptService.onSuccess/onFailure 호출 (LockedException 은 제외)</w:t>
+              <w:t>onAuthenticationSuccess/onAuthenticationFailure 에서 LoginAttemptService.onSuccess/onFailure 호출 (LockedException 은 제외)</w:t>
             </w:r>
           </w:p>
         </w:tc>
@@ -1681,46 +1712,64 @@
         <w:pStyle w:val="21"/>
         <w:spacing w:before="240" w:after="100"/>
         <w:rPr>
-          <w:lang w:eastAsia="ko-KR"/>
-        </w:rPr>
-      </w:pPr>
-      <w:r>
-        <w:rPr>
           <w:color w:val="2E5496"/>
           <w:lang w:eastAsia="ko-KR"/>
         </w:rPr>
-        <w:t xml:space="preserve">2-4. 화면 로그인(/login-process)엔 적용되지 않던 문제와 수정 - 공통 지점으로 이동</w:t>
-      </w:r>
+      </w:pPr>
     </w:p>
     <w:p>
       <w:pPr>
-        <w:spacing w:after="90" w:line="240" w:lineRule="auto"/>
-        <w:rPr>
+        <w:rPr>
+          <w:b/>
+          <w:bCs/>
+          <w:color w:val="2E5496"/>
+          <w:sz w:val="26"/>
+          <w:szCs w:val="26"/>
           <w:lang w:eastAsia="ko-KR"/>
         </w:rPr>
       </w:pPr>
       <w:r>
         <w:rPr>
+          <w:color w:val="2E5496"/>
           <w:lang w:eastAsia="ko-KR"/>
         </w:rPr>
-        <w:t xml:space="preserve">2-2의 구현은 UserInfoController.login()(REST, /api/userinfos/login) </w:t>
-      </w:r>
-      <w:r>
-        <w:rPr>
-          <w:b/>
-          <w:lang w:eastAsia="ko-KR"/>
-        </w:rPr>
-        <w:t xml:space="preserve">안에만</w:t>
-      </w:r>
-      <w:r>
-        <w:rPr>
-          <w:lang w:eastAsia="ko-KR"/>
-        </w:rPr>
-        <w:t xml:space="preserve"> assertNotLocked/onFailure/onSuccess를 명시적으로 호출했다. 그런데 화면 로그인은 SecurityConfig의 formLoginFilterChain에 설정된 Spring Security 기본 formLogin(...)(/login-process)이 처리하며, UserInfoController.login()을 전혀 거치지 않는다. 그 결과 화면에서 비밀번호를 틀려도 failed_login_count가 전혀 증가하지 않았고, 계정이 이미 잠긴 상태에서도 화면 로그인은 잠금 확인 자체를 우회했다(비밀번호만 맞으면 그대로 로그인됨).</w:t>
+        <w:br w:type="page"/>
       </w:r>
     </w:p>
     <w:p>
       <w:pPr>
+        <w:pStyle w:val="21"/>
+        <w:spacing w:before="240" w:after="100"/>
+        <w:rPr>
+          <w:lang w:eastAsia="ko-KR"/>
+        </w:rPr>
+      </w:pPr>
+      <w:r>
+        <w:rPr>
+          <w:color w:val="2E5496"/>
+          <w:lang w:eastAsia="ko-KR"/>
+        </w:rPr>
+        <w:lastRenderedPageBreak/>
+        <w:t>2-4. 화면 로그인(/login-process)엔 적용되지 않</w:t>
+      </w:r>
+      <w:r>
+        <w:rPr>
+          <w:rFonts w:hint="eastAsia"/>
+          <w:color w:val="2E5496"/>
+          <w:lang w:eastAsia="ko-KR"/>
+        </w:rPr>
+        <w:t>는</w:t>
+      </w:r>
+      <w:r>
+        <w:rPr>
+          <w:color w:val="2E5496"/>
+          <w:lang w:eastAsia="ko-KR"/>
+        </w:rPr>
+        <w:t xml:space="preserve"> 문제 수정</w:t>
+      </w:r>
+    </w:p>
+    <w:p>
+      <w:pPr>
         <w:spacing w:after="90" w:line="240" w:lineRule="auto"/>
         <w:rPr>
           <w:lang w:eastAsia="ko-KR"/>
@@ -1728,16 +1777,35 @@
       </w:pPr>
       <w:r>
         <w:rPr>
-          <w:b/>
           <w:lang w:eastAsia="ko-KR"/>
         </w:rPr>
-        <w:t xml:space="preserve">수정 방향</w:t>
-      </w:r>
-      <w:r>
-        <w:rPr>
+        <w:t>폼 로그인</w:t>
+      </w:r>
+      <w:r>
+        <w:rPr>
+          <w:rFonts w:hint="eastAsia"/>
           <w:lang w:eastAsia="ko-KR"/>
         </w:rPr>
-        <w:t xml:space="preserve">: 폼 로그인·REST 로그인 모두 결국 AuthenticationManager -&gt; DaoAuthenticationProvider를 공통으로 거친다는 점을 이용해, 잠금 확인과 성공/실패 처리를 컨트롤러가 아니라 그 공통 지점으로 옮겼다.</w:t>
+        <w:t>과</w:t>
+      </w:r>
+      <w:r>
+        <w:rPr>
+          <w:lang w:eastAsia="ko-KR"/>
+        </w:rPr>
+        <w:t xml:space="preserve">REST 로그인 모두 AuthenticationManager -&gt; DaoAuthenticationProvider를 공통으로 거친다는 점을 이용해, 잠금 확인과 성공/실패 처리를 컨트롤러가 아니라 AuthenticationManager </w:t>
+      </w:r>
+      <w:r>
+        <w:rPr>
+          <w:rFonts w:hint="eastAsia"/>
+          <w:lang w:eastAsia="ko-KR"/>
+        </w:rPr>
+        <w:t>에서 처리 합니다.</w:t>
+      </w:r>
+      <w:r>
+        <w:rPr>
+          <w:lang w:eastAsia="ko-KR"/>
+        </w:rPr>
+        <w:t xml:space="preserve"> </w:t>
       </w:r>
     </w:p>
     <w:p>
@@ -1756,7 +1824,7 @@
           <w:rFonts w:ascii="Consolas" w:hAnsi="Consolas"/>
           <w:sz w:val="18"/>
         </w:rPr>
-        <w:t xml:space="preserve">// UserInfoUserDetailsService.loadUserByUsername()</w:t>
+        <w:t>// UserInfoUserDetailsService.loadUserByUsername()</w:t>
       </w:r>
       <w:r>
         <w:br/>
@@ -1766,7 +1834,7 @@
           <w:rFonts w:ascii="Consolas" w:hAnsi="Consolas"/>
           <w:sz w:val="18"/>
         </w:rPr>
-        <w:t xml:space="preserve">// - DaoAuthenticationProvider 가 비밀번호 검증 전에 호출하는 지점이라 폼/REST 공통으로 거친다.</w:t>
+        <w:t xml:space="preserve">// DaoAuthenticationProvider 가 비밀번호 검증 전에 호출하는 지점이라 폼/REST 공통으로 거친다.</w:t>
       </w:r>
       <w:r>
         <w:br/>
@@ -1776,7 +1844,7 @@
           <w:rFonts w:ascii="Consolas" w:hAnsi="Consolas"/>
           <w:sz w:val="18"/>
         </w:rPr>
-        <w:t xml:space="preserve">@Override</w:t>
+        <w:t>@Override</w:t>
       </w:r>
       <w:r>
         <w:br/>
@@ -1786,7 +1854,7 @@
           <w:rFonts w:ascii="Consolas" w:hAnsi="Consolas"/>
           <w:sz w:val="18"/>
         </w:rPr>
-        <w:t xml:space="preserve">public UserDetails loadUserByUsername(String username) throws UsernameNotFoundException {</w:t>
+        <w:t>public UserDetails loadUserByUsername(String username) throws UsernameNotFoundException {</w:t>
       </w:r>
       <w:r>
         <w:br/>
@@ -1816,7 +1884,7 @@
           <w:rFonts w:ascii="Consolas" w:hAnsi="Consolas"/>
           <w:sz w:val="18"/>
         </w:rPr>
-        <w:t xml:space="preserve">}</w:t>
+        <w:t>}</w:t>
       </w:r>
     </w:p>
     <w:p>
@@ -1855,9 +1923,10 @@
           <w:rFonts w:ascii="Consolas" w:hAnsi="Consolas"/>
           <w:sz w:val="18"/>
         </w:rPr>
-        <w:t xml:space="preserve">onAuthenticationSuccess(...)  { ...; loginAttemptService.onSuccess(user); }</w:t>
-      </w:r>
-      <w:r>
+        <w:t>onAuthenticationSuccess(...)  { ...; loginAttemptService.onSuccess(user); }</w:t>
+      </w:r>
+      <w:r>
+        <w:br/>
         <w:br/>
       </w:r>
       <w:r>
@@ -1865,7 +1934,7 @@
           <w:rFonts w:ascii="Consolas" w:hAnsi="Consolas"/>
           <w:sz w:val="18"/>
         </w:rPr>
-        <w:t xml:space="preserve"/>
+        <w:t>onAuthenticationFailure(...) {</w:t>
       </w:r>
       <w:r>
         <w:br/>
@@ -1875,7 +1944,7 @@
           <w:rFonts w:ascii="Consolas" w:hAnsi="Consolas"/>
           <w:sz w:val="18"/>
         </w:rPr>
-        <w:t xml:space="preserve">onAuthenticationFailure(...) {</w:t>
+        <w:t xml:space="preserve">    ...</w:t>
       </w:r>
       <w:r>
         <w:br/>
@@ -1885,7 +1954,7 @@
           <w:rFonts w:ascii="Consolas" w:hAnsi="Consolas"/>
           <w:sz w:val="18"/>
         </w:rPr>
-        <w:t xml:space="preserve">    ...</w:t>
+        <w:t xml:space="preserve">    if (!(event.getException() instanceof LockedException)) {</w:t>
       </w:r>
       <w:r>
         <w:br/>
@@ -1895,7 +1964,7 @@
           <w:rFonts w:ascii="Consolas" w:hAnsi="Consolas"/>
           <w:sz w:val="18"/>
         </w:rPr>
-        <w:t xml:space="preserve">    if (!(event.getException() instanceof LockedException)) {</w:t>
+        <w:t xml:space="preserve">        loginAttemptService.onFailure(user);</w:t>
       </w:r>
       <w:r>
         <w:br/>
@@ -1905,7 +1974,7 @@
           <w:rFonts w:ascii="Consolas" w:hAnsi="Consolas"/>
           <w:sz w:val="18"/>
         </w:rPr>
-        <w:t xml:space="preserve">        loginAttemptService.onFailure(user);</w:t>
+        <w:t xml:space="preserve">    }</w:t>
       </w:r>
       <w:r>
         <w:br/>
@@ -1915,17 +1984,7 @@
           <w:rFonts w:ascii="Consolas" w:hAnsi="Consolas"/>
           <w:sz w:val="18"/>
         </w:rPr>
-        <w:t xml:space="preserve">    }</w:t>
-      </w:r>
-      <w:r>
-        <w:br/>
-      </w:r>
-      <w:r>
-        <w:rPr>
-          <w:rFonts w:ascii="Consolas" w:hAnsi="Consolas"/>
-          <w:sz w:val="18"/>
-        </w:rPr>
-        <w:t xml:space="preserve">}</w:t>
+        <w:t>}</w:t>
       </w:r>
     </w:p>
     <w:p>
@@ -1940,13 +1999,26 @@
           <w:b/>
           <w:lang w:eastAsia="ko-KR"/>
         </w:rPr>
-        <w:t xml:space="preserve">왜 LockedException은 제외하는가</w:t>
+        <w:t>왜 LockedException은 제외하는가</w:t>
       </w:r>
       <w:r>
         <w:rPr>
           <w:lang w:eastAsia="ko-KR"/>
         </w:rPr>
-        <w:t xml:space="preserve">: assertNotLocked()가 이제 authenticate() 호출 경로(loadUserByUsername) 안에서 실행되므로, 이미 잠긴 계정이 다시 시도하면 그 LockedException도 AbstractAuthenticationFailureEvent로 발행된다. 이걸 그대로 onFailure()로 넘기면 매 재시도마다 failed_login_count가 더 쌓이고 lockedUntil이 계속 뒤로 밀리므로 명시적으로 제외했다.</w:t>
+        <w:t>: assertNotLocked()가 이제 authenticate() 호출 경로(loadUserByUsername) 안에서 실행되므로, 이미 잠긴 계정이 다시 시도하면 그 LockedException도 AbstractAuthenticationFailureEvent로 발행된다. 이걸 그대로 onFailure()로 넘기면 매 재시도</w:t>
+      </w:r>
+      <w:r>
+        <w:rPr>
+          <w:rFonts w:hint="eastAsia"/>
+          <w:lang w:eastAsia="ko-KR"/>
+        </w:rPr>
+        <w:t xml:space="preserve"> 할 때 </w:t>
+      </w:r>
+      <w:r>
+        <w:rPr>
+          <w:lang w:eastAsia="ko-KR"/>
+        </w:rPr>
+        <w:t>마다 failed_login_count가 더 쌓이고 lockedUntil이 계속 뒤로 밀리므로 명시적으로 제외했다.</w:t>
       </w:r>
     </w:p>
     <w:p>
@@ -1961,13 +2033,26 @@
           <w:b/>
           <w:lang w:eastAsia="ko-KR"/>
         </w:rPr>
-        <w:t xml:space="preserve">UserInfoController.login()</w:t>
+        <w:t>UserInfoController.login()</w:t>
       </w:r>
       <w:r>
         <w:rPr>
           <w:lang w:eastAsia="ko-KR"/>
         </w:rPr>
-        <w:t xml:space="preserve">: 위 두 곳으로 공통화되어, 더 이상 LoginAttemptService를 직접 호출하지 않는다(2-2의 코드는 이 수정 이전 버전).</w:t>
+        <w:t>: 위 두 곳으로 공통화</w:t>
+      </w:r>
+      <w:r>
+        <w:rPr>
+          <w:rFonts w:hint="eastAsia"/>
+          <w:lang w:eastAsia="ko-KR"/>
+        </w:rPr>
+        <w:t xml:space="preserve"> </w:t>
+      </w:r>
+      <w:r>
+        <w:rPr>
+          <w:lang w:eastAsia="ko-KR"/>
+        </w:rPr>
+        <w:t>되어, 더 이상 LoginAttemptService를 직접 호출하지 않는다</w:t>
       </w:r>
     </w:p>
     <w:p>
@@ -1977,19 +2062,6 @@
           <w:lang w:eastAsia="ko-KR"/>
         </w:rPr>
       </w:pPr>
-      <w:r>
-        <w:rPr>
-          <w:b/>
-          <w:lang w:eastAsia="ko-KR"/>
-        </w:rPr>
-        <w:t xml:space="preserve">실측 검증</w:t>
-      </w:r>
-      <w:r>
-        <w:rPr>
-          <w:lang w:eastAsia="ko-KR"/>
-        </w:rPr>
-        <w:t xml:space="preserve">: cs001@aa.com(잠기지 않은 상태)으로 화면 로그인 폼에 틀린 비밀번호를 한 번 제출.</w:t>
-      </w:r>
     </w:p>
     <w:tbl>
       <w:tblPr>
@@ -2023,7 +2095,7 @@
                 <w:color w:val="FFFFFF"/>
                 <w:sz w:val="18"/>
               </w:rPr>
-              <w:t xml:space="preserve">호출 전</w:t>
+              <w:t>호출 전</w:t>
             </w:r>
           </w:p>
         </w:tc>
@@ -2039,7 +2111,7 @@
                 <w:color w:val="FFFFFF"/>
                 <w:sz w:val="18"/>
               </w:rPr>
-              <w:t xml:space="preserve">호출</w:t>
+              <w:t>호출</w:t>
             </w:r>
           </w:p>
         </w:tc>
@@ -2055,7 +2127,7 @@
                 <w:color w:val="FFFFFF"/>
                 <w:sz w:val="18"/>
               </w:rPr>
-              <w:t xml:space="preserve">호출 후</w:t>
+              <w:t>호출 후</w:t>
             </w:r>
           </w:p>
         </w:tc>
@@ -2070,7 +2142,7 @@
               <w:rPr>
                 <w:sz w:val="18"/>
               </w:rPr>
-              <w:t xml:space="preserve">failed_login_count=0, locked_until=NULL</w:t>
+              <w:t>failed_login_count=0, locked_until=NULL</w:t>
             </w:r>
           </w:p>
         </w:tc>
@@ -2083,7 +2155,9 @@
               <w:rPr>
                 <w:sz w:val="18"/>
               </w:rPr>
-              <w:t xml:space="preserve">POST /login-process (틀린 비밀번호, CSRF 토큰 포함) -&gt; 302 /login?error</w:t>
+              <w:t xml:space="preserve">POST /login-process (틀린 비밀번호, CSRF 토큰 포함) -&gt; 302 </w:t>
+              <w:lastRenderedPageBreak/>
+              <w:t>/login?error</w:t>
             </w:r>
           </w:p>
         </w:tc>
@@ -2096,7 +2170,8 @@
               <w:rPr>
                 <w:sz w:val="18"/>
               </w:rPr>
-              <w:t xml:space="preserve">failed_login_count=1, locked_until=NULL</w:t>
+              <w:lastRenderedPageBreak/>
+              <w:t>failed_login_count=1, locked_until=NULL</w:t>
             </w:r>
           </w:p>
         </w:tc>
@@ -2113,34 +2188,37 @@
         <w:rPr>
           <w:lang w:eastAsia="ko-KR"/>
         </w:rPr>
-        <w:t xml:space="preserve">수정 전에는 이 표의 "호출 후" 값이 "호출 전"과 동일(0, 증가 없음)했다 - 화면 로그인이 LoginAttemptService를 전혀 거치지 않았기 때문이다.</w:t>
+        <w:lastRenderedPageBreak/>
+        <w:t>수정 전에는 이 표의 "호출 후" 값이 "호출 전"과 동일(0, 증가 없음)했다 - 화면 로그인이 LoginAttemptService를 전혀 거치지 않았기 때문이다.</w:t>
       </w:r>
     </w:p>
     <w:p>
       <w:pPr>
         <w:spacing w:after="40"/>
+        <w:rPr>
+          <w:lang w:eastAsia="ko-KR"/>
+        </w:rPr>
       </w:pPr>
     </w:p>
     <w:p>
       <w:pPr>
-        <w:spacing w:after="40"/>
-      </w:pPr>
+        <w:pStyle w:val="1"/>
+        <w:spacing w:before="320" w:after="160"/>
+        <w:rPr>
+          <w:lang w:eastAsia="ko-KR"/>
+        </w:rPr>
+      </w:pPr>
+      <w:r>
+        <w:rPr>
+          <w:color w:val="1F3864"/>
+          <w:sz w:val="30"/>
+          <w:lang w:eastAsia="ko-KR"/>
+        </w:rPr>
+        <w:t xml:space="preserve">3. 공격 실습 </w:t>
+      </w:r>
     </w:p>
     <w:p>
       <w:pPr>
-        <w:pStyle w:val="1"/>
-        <w:spacing w:before="320" w:after="160"/>
-      </w:pPr>
-      <w:r>
-        <w:rPr>
-          <w:color w:val="1F3864"/>
-          <w:sz w:val="30"/>
-        </w:rPr>
-        <w:t xml:space="preserve">3. 공격 실습 </w:t>
-      </w:r>
-    </w:p>
-    <w:p>
-      <w:pPr>
         <w:pStyle w:val="21"/>
         <w:spacing w:before="240" w:after="100"/>
         <w:rPr>
@@ -2152,7 +2230,7 @@
           <w:color w:val="2E5496"/>
           <w:lang w:eastAsia="ko-KR"/>
         </w:rPr>
-        <w:t xml:space="preserve">3-1. curl 로 메커니즘 확인</w:t>
+        <w:t>3-1. curl 로 메커니즘 확인</w:t>
       </w:r>
     </w:p>
     <w:p>
@@ -2191,16 +2269,7 @@
           <w:rFonts w:ascii="Consolas" w:hAnsi="Consolas"/>
           <w:sz w:val="18"/>
         </w:rPr>
-        <w:t xml:space="preserve">  curl -s -X POST http://localhost:8080</w:t>
-      </w:r>
-      <w:bookmarkStart w:id="0" w:name="_GoBack"/>
-      <w:bookmarkEnd w:id="0"/>
-      <w:r>
-        <w:rPr>
-          <w:rFonts w:ascii="Consolas" w:hAnsi="Consolas"/>
-          <w:sz w:val="18"/>
-        </w:rPr>
-        <w:t>/api/userinfos/login \</w:t>
+        <w:t xml:space="preserve">  curl -s -X POST http://localhost:8080/api/userinfos/login \</w:t>
       </w:r>
       <w:r>
         <w:br/>
@@ -2329,7 +2398,7 @@
               <w:rPr>
                 <w:sz w:val="18"/>
               </w:rPr>
-              <w:t xml:space="preserve">(평소와 동일)</w:t>
+              <w:t>(평소와 동일)</w:t>
             </w:r>
           </w:p>
         </w:tc>
@@ -2344,8 +2413,7 @@
               <w:rPr>
                 <w:sz w:val="18"/>
               </w:rPr>
-              <w:lastRenderedPageBreak/>
-              <w:t xml:space="preserve">5회(임계치 도달)</w:t>
+              <w:t>5회(임계치 도달)</w:t>
             </w:r>
           </w:p>
         </w:tc>
@@ -2364,7 +2432,7 @@
                 <w:sz w:val="18"/>
                 <w:lang w:eastAsia="ko-KR"/>
               </w:rPr>
-              <w:t xml:space="preserve">401 "자격 증명에 실패하였습니다." — 이 응답 자체는 평소와 같다(잠금은 이 요청의 실패 처리 이후에 걸림). 서버 로그에 [AUDIT] 로그인 시도 제한 - 계정 잠금 - 실패 횟수=5 기록</w:t>
+              <w:t>401 "자격 증명에 실패하였습니다." — 이 응답 자체는 평소와 같다(잠금은 이 요청의 실패 처리 이후에 걸림). 서버 로그에 [AUDIT] 로그인 시도 제한 - 계정 잠금 - 실패 횟수=5 기록</w:t>
             </w:r>
           </w:p>
         </w:tc>
@@ -2385,7 +2453,7 @@
                 <w:sz w:val="18"/>
                 <w:lang w:eastAsia="ko-KR"/>
               </w:rPr>
-              <w:t xml:space="preserve">6회째(비밀번호를 맞게 넣어도)</w:t>
+              <w:t>6회째(비밀번호를 맞게 넣어도)</w:t>
             </w:r>
           </w:p>
         </w:tc>
@@ -2404,7 +2472,7 @@
                 <w:sz w:val="18"/>
                 <w:lang w:eastAsia="ko-KR"/>
               </w:rPr>
-              <w:t xml:space="preserve">401 "로그인 시도 횟수를 초과하여 계정이 잠겼습니다. 약 N초 후 다시 시도하세요"</w:t>
+              <w:t>401 "로그인 시도 횟수를 초과하여 계정이 잠겼습니다. 약 N초 후 다시 시도하세요"</w:t>
             </w:r>
           </w:p>
         </w:tc>
@@ -2422,6 +2490,7 @@
       <w:pPr>
         <w:spacing w:after="90" w:line="240" w:lineRule="auto"/>
         <w:rPr>
+          <w:rFonts w:hint="eastAsia"/>
           <w:lang w:eastAsia="ko-KR"/>
         </w:rPr>
       </w:pPr>
@@ -2429,7 +2498,20 @@
         <w:rPr>
           <w:lang w:eastAsia="ko-KR"/>
         </w:rPr>
-        <w:t xml:space="preserve">로그인 성공(올바른 비밀번호) 후 다시 틀린 비밀번호를 시도하면, 카운트가 0부터 다시 쌓이는 것도 확인됨(성공 시 초기화).</w:t>
+        <w:t xml:space="preserve">로그인 성공(올바른 비밀번호) 후 다시 틀린 비밀번호를 시도하면, 카운트가 0부터 다시 쌓</w:t>
+      </w:r>
+      <w:r>
+        <w:rPr>
+          <w:rFonts w:hint="eastAsia"/>
+          <w:lang w:eastAsia="ko-KR"/>
+        </w:rPr>
+        <w:t>인다.</w:t>
+      </w:r>
+      <w:r>
+        <w:rPr>
+          <w:lang w:eastAsia="ko-KR"/>
+        </w:rPr>
+        <w:t xml:space="preserve"> </w:t>
       </w:r>
     </w:p>
     <w:p>
@@ -2441,7 +2523,7 @@
         <w:rPr>
           <w:color w:val="2E5496"/>
         </w:rPr>
-        <w:t xml:space="preserve">3-2. Burp Suite Intruder로 자동화 재현</w:t>
+        <w:t>3-2. Burp Suite Intruder로 자동화 재현</w:t>
       </w:r>
     </w:p>
     <w:p>
@@ -2496,6 +2578,7 @@
           <w:b/>
           <w:lang w:eastAsia="ko-KR"/>
         </w:rPr>
+        <w:lastRenderedPageBreak/>
         <w:t>3. Payloads</w:t>
       </w:r>
       <w:r>
@@ -2513,83 +2596,134 @@
           <w:lang w:eastAsia="ko-KR"/>
         </w:rPr>
       </w:pPr>
+      <w:bookmarkStart w:id="0" w:name="_GoBack"/>
       <w:r>
         <w:rPr>
           <w:b/>
           <w:lang w:eastAsia="ko-KR"/>
         </w:rPr>
-        <w:t>4. Options → Grep - Match</w:t>
+        <w:t>4. Settings(과거 Options) → Grep - Match</w:t>
       </w:r>
       <w:r>
         <w:rPr>
           <w:lang w:eastAsia="ko-KR"/>
         </w:rPr>
-        <w:t xml:space="preserve">에 `잠겼습니다` 문자열을 추가해 두면, 결과 테이블에서 몇 번째 요청부터 잠금 메시지로 바뀌는지 체크박스로 바로 확인된다.</w:t>
+        <w:t>에 `잠겼습니다` 문자열을 추가해 두면, 결과 테이블에서 몇 번째 요청부터 잠금 메시지로 바뀌는지 체크박스로 바로 확인된다.</w:t>
+      </w:r>
+    </w:p>
+    <w:bookmarkEnd w:id="0"/>
+    <w:p>
+      <w:pPr>
+        <w:spacing w:after="90"/>
+        <w:ind w:left="360"/>
+        <w:rPr>
+          <w:lang w:eastAsia="ko-KR"/>
+        </w:rPr>
+      </w:pPr>
+      <w:r>
+        <w:rPr>
+          <w:b/>
+          <w:lang w:eastAsia="ko-KR"/>
+        </w:rPr>
+        <w:t>5. Start attack</w:t>
+      </w:r>
+      <w:r>
+        <w:rPr>
+          <w:lang w:eastAsia="ko-KR"/>
+        </w:rPr>
+        <w:t xml:space="preserve"> → 결과 테이블의 `Status code`는 전부 401로 동일하지만, 5번째 응답까지는 `잠겼습니다` 컬럼이 비어 있고 6번째부터 체크된다 — 자동화된 공격이라도 서버가 5회 지점에서 차단선을 그었다는 것을 한눈에 확인할 수 있다.</w:t>
       </w:r>
     </w:p>
     <w:p>
       <w:pPr>
         <w:spacing w:after="90"/>
-        <w:ind w:left="360"/>
         <w:rPr>
           <w:lang w:eastAsia="ko-KR"/>
         </w:rPr>
       </w:pPr>
+      <w:r>
+        <w:rPr>
+          <w:noProof/>
+          <w:lang w:eastAsia="ko-KR"/>
+        </w:rPr>
+        <w:drawing>
+          <wp:inline distT="0" distB="0" distL="0" distR="0" wp14:anchorId="37C0A12F" wp14:editId="18206081">
+            <wp:extent cx="5486400" cy="4021455"/>
+            <wp:effectExtent l="0" t="0" r="0" b="0"/>
+            <wp:docPr id="1" name="그림 1"/>
+            <wp:cNvGraphicFramePr>
+              <a:graphicFrameLocks xmlns:a="http://schemas.openxmlformats.org/drawingml/2006/main" noChangeAspect="1"/>
+            </wp:cNvGraphicFramePr>
+            <a:graphic xmlns:a="http://schemas.openxmlformats.org/drawingml/2006/main">
+              <a:graphicData uri="http://schemas.openxmlformats.org/drawingml/2006/picture">
+                <pic:pic xmlns:pic="http://schemas.openxmlformats.org/drawingml/2006/picture">
+                  <pic:nvPicPr>
+                    <pic:cNvPr id="1" name=""/>
+                    <pic:cNvPicPr/>
+                  </pic:nvPicPr>
+                  <pic:blipFill>
+                    <a:blip r:embed="rId8"/>
+                    <a:stretch>
+                      <a:fillRect/>
+                    </a:stretch>
+                  </pic:blipFill>
+                  <pic:spPr>
+                    <a:xfrm>
+                      <a:off x="0" y="0"/>
+                      <a:ext cx="5486400" cy="4021455"/>
+                    </a:xfrm>
+                    <a:prstGeom prst="rect">
+                      <a:avLst/>
+                    </a:prstGeom>
+                  </pic:spPr>
+                </pic:pic>
+              </a:graphicData>
+            </a:graphic>
+          </wp:inline>
+        </w:drawing>
+      </w:r>
+    </w:p>
+    <w:p>
+      <w:pPr>
+        <w:pStyle w:val="21"/>
+        <w:spacing w:before="240" w:after="100"/>
+        <w:rPr>
+          <w:lang w:eastAsia="ko-KR"/>
+        </w:rPr>
+      </w:pPr>
+      <w:r>
+        <w:rPr>
+          <w:color w:val="2E5496"/>
+          <w:lang w:eastAsia="ko-KR"/>
+        </w:rPr>
+        <w:t>3-3. Burp Suite Repeater로 우회 시도 — 교훈: 안 되는 이유</w:t>
+      </w:r>
+    </w:p>
+    <w:p>
+      <w:pPr>
+        <w:spacing w:after="90" w:line="240" w:lineRule="auto"/>
+        <w:rPr>
+          <w:lang w:eastAsia="ko-KR"/>
+        </w:rPr>
+      </w:pPr>
+      <w:r>
+        <w:rPr>
+          <w:lang w:eastAsia="ko-KR"/>
+        </w:rPr>
+        <w:t xml:space="preserve">잠긴 상태에서 </w:t>
+      </w:r>
       <w:r>
         <w:rPr>
           <w:b/>
           <w:lang w:eastAsia="ko-KR"/>
         </w:rPr>
-        <w:t>5. Start attack</w:t>
+        <w:t>Repeater</w:t>
       </w:r>
       <w:r>
         <w:rPr>
           <w:lang w:eastAsia="ko-KR"/>
         </w:rPr>
-        <w:t xml:space="preserve"> → 결과 테이블의 `Status code`는 전부 401로 동일하지만, 5번째 응답까지는 `잠겼습니다` 컬럼이 비어 있고 6번째부터 체크된다 — 자동화된 공격이라도 서버가 5회 지점에서 차단선을 그었다는 것을 한눈에 확인할 수 있다.</w:t>
-      </w:r>
-    </w:p>
-    <w:p>
-      <w:pPr>
-        <w:pStyle w:val="21"/>
-        <w:spacing w:before="240" w:after="100"/>
-        <w:rPr>
-          <w:lang w:eastAsia="ko-KR"/>
-        </w:rPr>
-      </w:pPr>
-      <w:r>
-        <w:rPr>
-          <w:color w:val="2E5496"/>
-          <w:lang w:eastAsia="ko-KR"/>
-        </w:rPr>
-        <w:t xml:space="preserve">3-3. Burp Suite Repeater로 우회 시도 — 교훈: 안 되는 이유</w:t>
-      </w:r>
-    </w:p>
-    <w:p>
-      <w:pPr>
-        <w:spacing w:after="90" w:line="240" w:lineRule="auto"/>
-        <w:rPr>
-          <w:lang w:eastAsia="ko-KR"/>
-        </w:rPr>
-      </w:pPr>
-      <w:r>
-        <w:rPr>
-          <w:lang w:eastAsia="ko-KR"/>
-        </w:rPr>
-        <w:t xml:space="preserve">잠긴 상태에서 </w:t>
-      </w:r>
-      <w:r>
-        <w:rPr>
-          <w:b/>
-          <w:lang w:eastAsia="ko-KR"/>
-        </w:rPr>
-        <w:t>Repeater</w:t>
-      </w:r>
-      <w:r>
-        <w:rPr>
-          <w:lang w:eastAsia="ko-KR"/>
-        </w:rPr>
-        <w:t xml:space="preserve">로 요청을 다시 보내되, `X-Forwarded-For` 헤더를 다른 IP로 바꿔서 재시도:</w:t>
+        <w:t>로 요청을 다시 보내되, `X-Forwarded-For` 헤더를 다른 IP로 바꿔서 재시도:</w:t>
       </w:r>
     </w:p>
     <w:p>
@@ -2653,6 +2787,7 @@
           <w:b/>
           <w:lang w:eastAsia="ko-KR"/>
         </w:rPr>
+        <w:lastRenderedPageBreak/>
         <w:t>결과</w:t>
       </w:r>
       <w:r>
@@ -2666,13 +2801,13 @@
           <w:b/>
           <w:lang w:eastAsia="ko-KR"/>
         </w:rPr>
-        <w:t xml:space="preserve">IP가 아니라 계정(email) 기준</w:t>
+        <w:t>IP가 아니라 계정(email) 기준</w:t>
       </w:r>
       <w:r>
         <w:rPr>
           <w:lang w:eastAsia="ko-KR"/>
         </w:rPr>
-        <w:t xml:space="preserve">으로 잠그기 때문에, 헤더를 조작해 다른 IP처럼 보여도 우회되지 않는다.</w:t>
+        <w:t>으로 잠그기 때문에, 헤더를 조작해 다른 IP처럼 보여도 우회되지 않는다.</w:t>
       </w:r>
     </w:p>
     <w:p>
@@ -2688,8 +2823,7 @@
           <w:color w:val="595959"/>
           <w:lang w:eastAsia="ko-KR"/>
         </w:rPr>
-        <w:lastRenderedPageBreak/>
-        <w:t xml:space="preserve">그런데 이 설계에는 반대 방향의 약점이 있다</w:t>
+        <w:t>그런데 이 설계에는 반대 방향의 약점이 있다</w:t>
       </w:r>
       <w:r>
         <w:rPr>
@@ -2713,7 +2847,7 @@
           <w:sz w:val="30"/>
           <w:lang w:eastAsia="ko-KR"/>
         </w:rPr>
-        <w:t xml:space="preserve">4. 방어 원리</w:t>
+        <w:t>4. 방어 원리</w:t>
       </w:r>
     </w:p>
     <w:p>
@@ -2729,7 +2863,7 @@
           <w:color w:val="2E5496"/>
           <w:lang w:eastAsia="ko-KR"/>
         </w:rPr>
-        <w:t xml:space="preserve">4-1. 비밀번호 검증보다 먼저 잠금을 확인한다</w:t>
+        <w:t>4-1. 비밀번호 검증보다 먼저 잠금을 확인한다</w:t>
       </w:r>
     </w:p>
     <w:p>
@@ -2756,7 +2890,7 @@
         <w:spacing w:after="90" w:line="240" w:lineRule="auto"/>
       </w:pPr>
       <w:r>
-        <w:t xml:space="preserve">잠긴 계정이면 `authenticationManager.authenticate(...)`(비밀번호 해시 비교 포함)를 아예 호출하지 않는다 — 불필요한 CPU 비용을 줄이고, 잠겨 있다는 사실을 더 빠르고 명확하게 응답한다.</w:t>
+        <w:t>잠긴 계정이면 `authenticationManager.authenticate(...)`(비밀번호 해시 비교 포함)를 아예 호출하지 않는다 — 불필요한 CPU 비용을 줄이고, 잠겨 있다는 사실을 더 빠르고 명확하게 응답한다.</w:t>
       </w:r>
     </w:p>
     <w:p>
@@ -2772,7 +2906,7 @@
           <w:color w:val="2E5496"/>
           <w:lang w:eastAsia="ko-KR"/>
         </w:rPr>
-        <w:t xml:space="preserve">4-2. 성공하면 즉시 초기화한다</w:t>
+        <w:t>4-2. 성공하면 즉시 초기화한다</w:t>
       </w:r>
     </w:p>
     <w:p>
@@ -2809,7 +2943,7 @@
         <w:rPr>
           <w:lang w:eastAsia="ko-KR"/>
         </w:rPr>
-        <w:t xml:space="preserve">실패를 몇 번 하다가도 결국 올바른 비밀번호로 로그인하면 카운트를 0으로 되돌린다 — 정상 사용자가 비밀번호를 몇 번 오타 냈다고 누적되어 다음에 불이익을 받지 않게 한다.</w:t>
+        <w:t>실패를 몇 번 하다가도 결국 올바른 비밀번호로 로그인하면 카운트를 0으로 되돌린다 — 정상 사용자가 비밀번호를 몇 번 오타 냈다고 누적되어 다음에 불이익을 받지 않게 한다.</w:t>
       </w:r>
     </w:p>
     <w:p>
@@ -2825,7 +2959,7 @@
           <w:color w:val="2E5496"/>
           <w:lang w:eastAsia="ko-KR"/>
         </w:rPr>
-        <w:t xml:space="preserve">4-3. 한계와 트레이드오프 (중요)</w:t>
+        <w:t>4-3. 한계와 트레이드오프 (중요)</w:t>
       </w:r>
     </w:p>
     <w:p>
@@ -2840,7 +2974,7 @@
           <w:b/>
           <w:lang w:eastAsia="ko-KR"/>
         </w:rPr>
-        <w:t xml:space="preserve">계정 기준 잠금은 가용성 공격(DoS)에 노출된다.</w:t>
+        <w:t>계정 기준 잠금은 가용성 공격(DoS)에 노출된다.</w:t>
       </w:r>
       <w:r>
         <w:rPr>
@@ -2860,7 +2994,7 @@
         <w:rPr>
           <w:lang w:eastAsia="ko-KR"/>
         </w:rPr>
-        <w:t xml:space="preserve">실무에서는 아래를 조합해 완화한다(이 브랜치엔 미적용 — 범위 밖):</w:t>
+        <w:t>실무에서는 아래를 조합해 완화한다(이 브랜치엔 미적용 — 범위 밖):</w:t>
       </w:r>
     </w:p>
     <w:p>
@@ -2876,13 +3010,13 @@
           <w:b/>
           <w:lang w:eastAsia="ko-KR"/>
         </w:rPr>
-        <w:t xml:space="preserve">IP 기준 속도 제한</w:t>
+        <w:t>IP 기준 속도 제한</w:t>
       </w:r>
       <w:r>
         <w:rPr>
           <w:lang w:eastAsia="ko-KR"/>
         </w:rPr>
-        <w:t xml:space="preserve">(예: Bucket4j)을 계정 기준과 병행 — 짧은 시간에 과도한 요청을 보내는 IP 자체도 함께 제한.</w:t>
+        <w:t>(예: Bucket4j)을 계정 기준과 병행 — 짧은 시간에 과도한 요청을 보내는 IP 자체도 함께 제한.</w:t>
       </w:r>
     </w:p>
     <w:p>
@@ -2898,13 +3032,13 @@
           <w:b/>
           <w:lang w:eastAsia="ko-KR"/>
         </w:rPr>
-        <w:t xml:space="preserve">점진적 백오프</w:t>
+        <w:t>점진적 백오프</w:t>
       </w:r>
       <w:r>
         <w:rPr>
           <w:lang w:eastAsia="ko-KR"/>
         </w:rPr>
-        <w:t xml:space="preserve">(실패할 때마다 잠금 시간을 2배씩 늘리는 등) — 고정 300초 대신 1차 5회/5초, 2차 10회/1분처럼 단계화.</w:t>
+        <w:t>(실패할 때마다 잠금 시간을 2배씩 늘리는 등) — 고정 300초 대신 1차 5회/5초, 2차 10회/1분처럼 단계화.</w:t>
       </w:r>
     </w:p>
     <w:p>
@@ -2920,13 +3054,14 @@
           <w:b/>
           <w:lang w:eastAsia="ko-KR"/>
         </w:rPr>
+        <w:lastRenderedPageBreak/>
         <w:t>CAPTCHA</w:t>
       </w:r>
       <w:r>
         <w:rPr>
           <w:lang w:eastAsia="ko-KR"/>
         </w:rPr>
-        <w:t xml:space="preserve">(일정 실패 횟수 이후 사람인지 확인) — 자동화 도구의 반복 자체를 어렵게 만듦.</w:t>
+        <w:t>(일정 실패 횟수 이후 사람인지 확인) — 자동화 도구의 반복 자체를 어렵게 만듦.</w:t>
       </w:r>
     </w:p>
     <w:p>
@@ -2938,8 +3073,7 @@
         <w:rPr>
           <w:color w:val="2E5496"/>
         </w:rPr>
-        <w:lastRenderedPageBreak/>
-        <w:t xml:space="preserve">검증 (안전 버전, 검증됨)</w:t>
+        <w:t>검증 (안전 버전, 검증됨)</w:t>
       </w:r>
     </w:p>
     <w:tbl>
@@ -3004,7 +3138,7 @@
               <w:rPr>
                 <w:sz w:val="18"/>
               </w:rPr>
-              <w:t xml:space="preserve">같은 계정 5회 연속 실패</w:t>
+              <w:t>같은 계정 5회 연속 실패</w:t>
             </w:r>
           </w:p>
         </w:tc>
@@ -3023,7 +3157,7 @@
                 <w:sz w:val="18"/>
                 <w:lang w:eastAsia="ko-KR"/>
               </w:rPr>
-              <w:t xml:space="preserve">5회째까지는 평소와 같은 401, 5회째 처리 중 계정 잠금([AUDIT] 로그)</w:t>
+              <w:t>5회째까지는 평소와 같은 401, 5회째 처리 중 계정 잠금([AUDIT] 로그)</w:t>
             </w:r>
           </w:p>
         </w:tc>
@@ -3044,7 +3178,7 @@
                 <w:sz w:val="18"/>
                 <w:lang w:eastAsia="ko-KR"/>
               </w:rPr>
-              <w:t xml:space="preserve">잠긴 상태에서 올바른 비밀번호로 재시도</w:t>
+              <w:t>잠긴 상태에서 올바른 비밀번호로 재시도</w:t>
             </w:r>
           </w:p>
         </w:tc>
@@ -3063,7 +3197,7 @@
                 <w:sz w:val="18"/>
                 <w:lang w:eastAsia="ko-KR"/>
               </w:rPr>
-              <w:t xml:space="preserve">401 "잠겼습니다" — 비밀번호 정답 여부와 무관하게 거부</w:t>
+              <w:t>401 "잠겼습니다" — 비밀번호 정답 여부와 무관하게 거부</w:t>
             </w:r>
           </w:p>
         </w:tc>
@@ -3078,7 +3212,7 @@
               <w:rPr>
                 <w:sz w:val="18"/>
               </w:rPr>
-              <w:t xml:space="preserve">로그인 성공 후 재실패</w:t>
+              <w:t>로그인 성공 후 재실패</w:t>
             </w:r>
           </w:p>
         </w:tc>
@@ -3097,7 +3231,7 @@
                 <w:sz w:val="18"/>
                 <w:lang w:eastAsia="ko-KR"/>
               </w:rPr>
-              <w:t xml:space="preserve">카운트가 0부터 다시 쌓임(성공 시 초기화 확인)</w:t>
+              <w:t>카운트가 0부터 다시 쌓임(성공 시 초기화 확인)</w:t>
             </w:r>
           </w:p>
         </w:tc>
@@ -3112,7 +3246,7 @@
               <w:rPr>
                 <w:sz w:val="18"/>
               </w:rPr>
-              <w:t xml:space="preserve">Repeater로 X-Forwarded-For 변조 후 재시도</w:t>
+              <w:t>Repeater로 X-Forwarded-For 변조 후 재시도</w:t>
             </w:r>
           </w:p>
         </w:tc>
@@ -3131,7 +3265,7 @@
                 <w:sz w:val="18"/>
                 <w:lang w:eastAsia="ko-KR"/>
               </w:rPr>
-              <w:t xml:space="preserve">여전히 401 — 계정 기준이라 IP 변조로 우회되지 않음</w:t>
+              <w:t>여전히 401 — 계정 기준이라 IP 변조로 우회되지 않음</w:t>
             </w:r>
           </w:p>
         </w:tc>
@@ -3155,7 +3289,7 @@
           <w:color w:val="1F3864"/>
           <w:sz w:val="30"/>
         </w:rPr>
-        <w:t xml:space="preserve">5. 방어 정리</w:t>
+        <w:t>5. 방어 정리</w:t>
       </w:r>
     </w:p>
     <w:tbl>
@@ -3220,7 +3354,7 @@
               <w:rPr>
                 <w:sz w:val="18"/>
               </w:rPr>
-              <w:t xml:space="preserve">계정 잠금(핵심, 적용됨)</w:t>
+              <w:t>계정 잠금(핵심, 적용됨)</w:t>
             </w:r>
           </w:p>
         </w:tc>
@@ -3239,7 +3373,7 @@
                 <w:sz w:val="18"/>
                 <w:lang w:eastAsia="ko-KR"/>
               </w:rPr>
-              <w:t xml:space="preserve">연속 N회(기본 5회) 실패 시 일정 시간(기본 300초) 해당 계정의 로그인을 거부</w:t>
+              <w:t>연속 N회(기본 5회) 실패 시 일정 시간(기본 300초) 해당 계정의 로그인을 거부</w:t>
             </w:r>
           </w:p>
         </w:tc>
@@ -3254,7 +3388,7 @@
               <w:rPr>
                 <w:sz w:val="18"/>
               </w:rPr>
-              <w:t xml:space="preserve">실패 비용 최소화</w:t>
+              <w:t>실패 비용 최소화</w:t>
             </w:r>
           </w:p>
         </w:tc>
@@ -3273,7 +3407,7 @@
                 <w:sz w:val="18"/>
                 <w:lang w:eastAsia="ko-KR"/>
               </w:rPr>
-              <w:t xml:space="preserve">잠긴 계정은 비밀번호 검증 자체를 생략하고 즉시 거부</w:t>
+              <w:t>잠긴 계정은 비밀번호 검증 자체를 생략하고 즉시 거부</w:t>
             </w:r>
           </w:p>
         </w:tc>
@@ -3288,7 +3422,7 @@
               <w:rPr>
                 <w:sz w:val="18"/>
               </w:rPr>
-              <w:t xml:space="preserve">성공 시 초기화</w:t>
+              <w:t>성공 시 초기화</w:t>
             </w:r>
           </w:p>
         </w:tc>
@@ -3307,7 +3441,7 @@
                 <w:sz w:val="18"/>
                 <w:lang w:eastAsia="ko-KR"/>
               </w:rPr>
-              <w:t xml:space="preserve">정상 사용자의 일시적 오타가 누적되어 불이익을 주지 않음</w:t>
+              <w:t>정상 사용자의 일시적 오타가 누적되어 불이익을 주지 않음</w:t>
             </w:r>
           </w:p>
         </w:tc>
@@ -3328,7 +3462,7 @@
                 <w:sz w:val="18"/>
                 <w:lang w:eastAsia="ko-KR"/>
               </w:rPr>
-              <w:t xml:space="preserve">IP 기준 속도 제한(미적용·향후 보강)</w:t>
+              <w:t>IP 기준 속도 제한(미적용·향후 보강)</w:t>
             </w:r>
           </w:p>
         </w:tc>
@@ -3347,7 +3481,7 @@
                 <w:sz w:val="18"/>
                 <w:lang w:eastAsia="ko-KR"/>
               </w:rPr>
-              <w:t xml:space="preserve">계정 잠금의 DoS 악용(§4-3)을 보완 — 여러 계정을 공격하는 IP 자체를 제한</w:t>
+              <w:t>계정 잠금의 DoS 악용(§4-3)을 보완 — 여러 계정을 공격하는 IP 자체를 제한</w:t>
             </w:r>
           </w:p>
         </w:tc>
@@ -3374,14 +3508,14 @@
           <w:color w:val="595959"/>
           <w:lang w:eastAsia="ko-KR"/>
         </w:rPr>
-        <w:t xml:space="preserve">교육 포인트</w:t>
+        <w:t>교육 포인트</w:t>
       </w:r>
       <w:r>
         <w:rPr>
           <w:color w:val="595959"/>
           <w:lang w:eastAsia="ko-KR"/>
         </w:rPr>
-        <w:t xml:space="preserve">: "시도 횟수 제한"은 브루트포스를 막는 가장 기본적인 방어지만, 공짜가 아니다 — 어떤 단위(계정? IP? 둘 다?)로 제한하느냐에 따라 막는 공격과 새로 생기는 약점(가용성 공격)이 달라진다. Burp Suite Intruder/Repeater로 직접 찔러보면 "막힌 것"과 "그 대신 생긴 약점"을 둘 다 눈으로 확인할 수 있다.</w:t>
+        <w:t>: "시도 횟수 제한"은 브루트포스를 막는 가장 기본적인 방어지만, 공짜가 아니다 — 어떤 단위(계정? IP? 둘 다?)로 제한하느냐에 따라 막는 공격과 새로 생기는 약점(가용성 공격)이 달라진다. Burp Suite Intruder/Repeater로 직접 찔러보면 "막힌 것"과 "그 대신 생긴 약점"을 둘 다 눈으로 확인할 수 있다.</w:t>
       </w:r>
     </w:p>
     <w:p>
@@ -3394,7 +3528,8 @@
           <w:color w:val="1F3864"/>
           <w:sz w:val="30"/>
         </w:rPr>
-        <w:t xml:space="preserve">6. 관련 문서</w:t>
+        <w:lastRenderedPageBreak/>
+        <w:t>6. 관련 문서</w:t>
       </w:r>
     </w:p>
     <w:p>
@@ -3409,7 +3544,7 @@
         <w:rPr>
           <w:lang w:eastAsia="ko-KR"/>
         </w:rPr>
-        <w:t xml:space="preserve">OWASP Top 10 2025 #7 식별 및 인증 실패</w:t>
+        <w:t>OWASP Top 10 2025 #7 식별 및 인증 실패</w:t>
       </w:r>
     </w:p>
     <w:p>
@@ -3418,7 +3553,7 @@
         <w:spacing w:after="60"/>
       </w:pPr>
       <w:r>
-        <w:t xml:space="preserve">전체 진행: 00_App_Security_Review.md</w:t>
+        <w:t>전체 진행: 00_App_Security_Review.md</w:t>
       </w:r>
     </w:p>
     <w:p>
@@ -3433,12 +3568,11 @@
         <w:rPr>
           <w:lang w:eastAsia="ko-KR"/>
         </w:rPr>
-        <w:lastRenderedPageBreak/>
-        <w:t xml:space="preserve">같은 /api/userinfos/login 경로를 다루는 다른 보강: 06_JWT_Security.md(토큰 발급/회전), 04_Logging_Hardening.md(인증 실패 감사 로그 — 이 문서의 잠금 로그도 같은 [AUDIT] 규칙을 따름)</w:t>
+        <w:t>같은 /api/userinfos/login 경로를 다루는 다른 보강: 06_JWT_Security.md(토큰 발급/회전), 04_Logging_Hardening.md(인증 실패 감사 로그 — 이 문서의 잠금 로그도 같은 [AUDIT] 규칙을 따름)</w:t>
       </w:r>
     </w:p>
     <w:sectPr>
-      <w:headerReference w:type="default" r:id="rId8"/>
+      <w:headerReference w:type="default" r:id="rId9"/>
       <w:pgSz w:w="12240" w:h="15840"/>
       <w:pgMar w:top="1440" w:right="1800" w:bottom="1440" w:left="1800" w:header="720" w:footer="720" w:gutter="0"/>
       <w:cols w:space="720"/>
@@ -3517,7 +3651,7 @@
       <w:rPr>
         <w:noProof/>
       </w:rPr>
-      <w:t>7</w:t>
+      <w:t>9</w:t>
     </w:r>
     <w:r>
       <w:fldChar w:fldCharType="end"/>
@@ -15464,7 +15598,7 @@
 </file>
 
 <file path=customXml/itemProps1.xml><?xml version="1.0" encoding="utf-8"?>
-<ds:datastoreItem xmlns:ds="http://schemas.openxmlformats.org/officeDocument/2006/customXml" ds:itemID="{A009590E-1246-4F4D-8D64-DF25EF4828B0}">
+<ds:datastoreItem xmlns:ds="http://schemas.openxmlformats.org/officeDocument/2006/customXml" ds:itemID="{B5B6BE63-4C52-44ED-A296-FCCD22E83509}">
   <ds:schemaRefs>
     <ds:schemaRef ds:uri="http://schemas.openxmlformats.org/officeDocument/2006/bibliography"/>
   </ds:schemaRefs>

</xml_diff>

<commit_message>
10_Bruteforce_Login_Protection.docx: Burp Suite Intruder 실습 캡처 및 CSRF 403 사례 추가
</commit_message>
<xml_diff>
--- a/docs/security/10_Bruteforce_Login_Protection.docx
+++ b/docs/security/10_Bruteforce_Login_Protection.docx
@@ -344,7 +344,56 @@
           <w:rFonts w:ascii="Consolas" w:hAnsi="Consolas"/>
           <w:sz w:val="18"/>
         </w:rPr>
-        <w:t xml:space="preserve">    // ... 성공 시 토큰 발급</w:t>
+        <w:t xml:space="preserve">    // ... </w:t>
+      </w:r>
+      <w:r>
+        <w:rPr>
+          <w:rFonts w:ascii="Consolas" w:hAnsi="Consolas"/>
+          <w:sz w:val="18"/>
+        </w:rPr>
+        <w:t>성공</w:t>
+      </w:r>
+      <w:r>
+        <w:rPr>
+          <w:rFonts w:ascii="Consolas" w:hAnsi="Consolas"/>
+          <w:sz w:val="18"/>
+        </w:rPr>
+        <w:t xml:space="preserve"> </w:t>
+      </w:r>
+      <w:r>
+        <w:rPr>
+          <w:rFonts w:ascii="Consolas" w:hAnsi="Consolas"/>
+          <w:sz w:val="18"/>
+        </w:rPr>
+        <w:t>시</w:t>
+      </w:r>
+      <w:r>
+        <w:rPr>
+          <w:rFonts w:ascii="Consolas" w:hAnsi="Consolas"/>
+          <w:sz w:val="18"/>
+        </w:rPr>
+        <w:t xml:space="preserve"> </w:t>
+      </w:r>
+      <w:r>
+        <w:rPr>
+          <w:rFonts w:ascii="Consolas" w:hAnsi="Consolas"/>
+          <w:sz w:val="18"/>
+        </w:rPr>
+        <w:t>토큰</w:t>
+      </w:r>
+      <w:r>
+        <w:rPr>
+          <w:rFonts w:ascii="Consolas" w:hAnsi="Consolas"/>
+          <w:sz w:val="18"/>
+        </w:rPr>
+        <w:t xml:space="preserve"> </w:t>
+      </w:r>
+      <w:r>
+        <w:rPr>
+          <w:rFonts w:ascii="Consolas" w:hAnsi="Consolas"/>
+          <w:sz w:val="18"/>
+        </w:rPr>
+        <w:t>발급</w:t>
       </w:r>
       <w:r>
         <w:br/>
@@ -459,7 +508,199 @@
           <w:sz w:val="18"/>
           <w:lang w:eastAsia="ko-KR"/>
         </w:rPr>
-        <w:t xml:space="preserve">//[로그인 시도 제한 - bruteforce-demo] 연속 로그인 실패 횟수. 로그인 성공 시 0으로 초기화된다.</w:t>
+        <w:t>//[</w:t>
+      </w:r>
+      <w:r>
+        <w:rPr>
+          <w:rFonts w:ascii="Consolas" w:hAnsi="Consolas"/>
+          <w:sz w:val="18"/>
+          <w:lang w:eastAsia="ko-KR"/>
+        </w:rPr>
+        <w:t>로그인</w:t>
+      </w:r>
+      <w:r>
+        <w:rPr>
+          <w:rFonts w:ascii="Consolas" w:hAnsi="Consolas"/>
+          <w:sz w:val="18"/>
+          <w:lang w:eastAsia="ko-KR"/>
+        </w:rPr>
+        <w:t xml:space="preserve"> </w:t>
+      </w:r>
+      <w:r>
+        <w:rPr>
+          <w:rFonts w:ascii="Consolas" w:hAnsi="Consolas"/>
+          <w:sz w:val="18"/>
+          <w:lang w:eastAsia="ko-KR"/>
+        </w:rPr>
+        <w:t>시도</w:t>
+      </w:r>
+      <w:r>
+        <w:rPr>
+          <w:rFonts w:ascii="Consolas" w:hAnsi="Consolas"/>
+          <w:sz w:val="18"/>
+          <w:lang w:eastAsia="ko-KR"/>
+        </w:rPr>
+        <w:t xml:space="preserve"> </w:t>
+      </w:r>
+      <w:r>
+        <w:rPr>
+          <w:rFonts w:ascii="Consolas" w:hAnsi="Consolas"/>
+          <w:sz w:val="18"/>
+          <w:lang w:eastAsia="ko-KR"/>
+        </w:rPr>
+        <w:t>제한</w:t>
+      </w:r>
+      <w:r>
+        <w:rPr>
+          <w:rFonts w:ascii="Consolas" w:hAnsi="Consolas"/>
+          <w:sz w:val="18"/>
+          <w:lang w:eastAsia="ko-KR"/>
+        </w:rPr>
+        <w:t xml:space="preserve"> - bruteforce-demo] </w:t>
+      </w:r>
+      <w:r>
+        <w:rPr>
+          <w:rFonts w:ascii="Consolas" w:hAnsi="Consolas"/>
+          <w:sz w:val="18"/>
+          <w:lang w:eastAsia="ko-KR"/>
+        </w:rPr>
+        <w:t>연속</w:t>
+      </w:r>
+      <w:r>
+        <w:rPr>
+          <w:rFonts w:ascii="Consolas" w:hAnsi="Consolas"/>
+          <w:sz w:val="18"/>
+          <w:lang w:eastAsia="ko-KR"/>
+        </w:rPr>
+        <w:t xml:space="preserve"> </w:t>
+      </w:r>
+      <w:r>
+        <w:rPr>
+          <w:rFonts w:ascii="Consolas" w:hAnsi="Consolas"/>
+          <w:sz w:val="18"/>
+          <w:lang w:eastAsia="ko-KR"/>
+        </w:rPr>
+        <w:t>로그인</w:t>
+      </w:r>
+      <w:r>
+        <w:rPr>
+          <w:rFonts w:ascii="Consolas" w:hAnsi="Consolas"/>
+          <w:sz w:val="18"/>
+          <w:lang w:eastAsia="ko-KR"/>
+        </w:rPr>
+        <w:t xml:space="preserve"> </w:t>
+      </w:r>
+      <w:r>
+        <w:rPr>
+          <w:rFonts w:ascii="Consolas" w:hAnsi="Consolas"/>
+          <w:sz w:val="18"/>
+          <w:lang w:eastAsia="ko-KR"/>
+        </w:rPr>
+        <w:t>실패</w:t>
+      </w:r>
+      <w:r>
+        <w:rPr>
+          <w:rFonts w:ascii="Consolas" w:hAnsi="Consolas"/>
+          <w:sz w:val="18"/>
+          <w:lang w:eastAsia="ko-KR"/>
+        </w:rPr>
+        <w:t xml:space="preserve"> </w:t>
+      </w:r>
+      <w:r>
+        <w:rPr>
+          <w:rFonts w:ascii="Consolas" w:hAnsi="Consolas"/>
+          <w:sz w:val="18"/>
+          <w:lang w:eastAsia="ko-KR"/>
+        </w:rPr>
+        <w:t>횟수</w:t>
+      </w:r>
+      <w:r>
+        <w:rPr>
+          <w:rFonts w:ascii="Consolas" w:hAnsi="Consolas"/>
+          <w:sz w:val="18"/>
+          <w:lang w:eastAsia="ko-KR"/>
+        </w:rPr>
+        <w:t xml:space="preserve">. </w:t>
+      </w:r>
+      <w:r>
+        <w:rPr>
+          <w:rFonts w:ascii="Consolas" w:hAnsi="Consolas"/>
+          <w:sz w:val="18"/>
+          <w:lang w:eastAsia="ko-KR"/>
+        </w:rPr>
+        <w:t>로그인</w:t>
+      </w:r>
+      <w:r>
+        <w:rPr>
+          <w:rFonts w:ascii="Consolas" w:hAnsi="Consolas"/>
+          <w:sz w:val="18"/>
+          <w:lang w:eastAsia="ko-KR"/>
+        </w:rPr>
+        <w:t xml:space="preserve"> </w:t>
+      </w:r>
+      <w:r>
+        <w:rPr>
+          <w:rFonts w:ascii="Consolas" w:hAnsi="Consolas"/>
+          <w:sz w:val="18"/>
+          <w:lang w:eastAsia="ko-KR"/>
+        </w:rPr>
+        <w:t>성공</w:t>
+      </w:r>
+      <w:r>
+        <w:rPr>
+          <w:rFonts w:ascii="Consolas" w:hAnsi="Consolas"/>
+          <w:sz w:val="18"/>
+          <w:lang w:eastAsia="ko-KR"/>
+        </w:rPr>
+        <w:t xml:space="preserve"> </w:t>
+      </w:r>
+      <w:r>
+        <w:rPr>
+          <w:rFonts w:ascii="Consolas" w:hAnsi="Consolas"/>
+          <w:sz w:val="18"/>
+          <w:lang w:eastAsia="ko-KR"/>
+        </w:rPr>
+        <w:t>시</w:t>
+      </w:r>
+      <w:r>
+        <w:rPr>
+          <w:rFonts w:ascii="Consolas" w:hAnsi="Consolas"/>
+          <w:sz w:val="18"/>
+          <w:lang w:eastAsia="ko-KR"/>
+        </w:rPr>
+        <w:t xml:space="preserve"> 0</w:t>
+      </w:r>
+      <w:r>
+        <w:rPr>
+          <w:rFonts w:ascii="Consolas" w:hAnsi="Consolas"/>
+          <w:sz w:val="18"/>
+          <w:lang w:eastAsia="ko-KR"/>
+        </w:rPr>
+        <w:t>으로</w:t>
+      </w:r>
+      <w:r>
+        <w:rPr>
+          <w:rFonts w:ascii="Consolas" w:hAnsi="Consolas"/>
+          <w:sz w:val="18"/>
+          <w:lang w:eastAsia="ko-KR"/>
+        </w:rPr>
+        <w:t xml:space="preserve"> </w:t>
+      </w:r>
+      <w:r>
+        <w:rPr>
+          <w:rFonts w:ascii="Consolas" w:hAnsi="Consolas"/>
+          <w:sz w:val="18"/>
+          <w:lang w:eastAsia="ko-KR"/>
+        </w:rPr>
+        <w:t>초기화된다</w:t>
+      </w:r>
+      <w:r>
+        <w:rPr>
+          <w:rFonts w:ascii="Consolas" w:hAnsi="Consolas"/>
+          <w:sz w:val="18"/>
+          <w:lang w:eastAsia="ko-KR"/>
+        </w:rPr>
+        <w:t>.</w:t>
       </w:r>
       <w:r>
         <w:rPr>
@@ -486,6 +727,8 @@
       </w:r>
       <w:r>
         <w:br/>
+      </w:r>
+      <w:r>
         <w:br/>
       </w:r>
       <w:r>
@@ -494,7 +737,147 @@
           <w:sz w:val="18"/>
         </w:rPr>
         <w:lastRenderedPageBreak/>
-        <w:t xml:space="preserve">//[로그인 시도 제한 - bruteforce-demo] 이 시각 이전까지는 비밀번호가 맞아도 로그인을 거부한다.</w:t>
+        <w:t>//[</w:t>
+      </w:r>
+      <w:r>
+        <w:rPr>
+          <w:rFonts w:ascii="Consolas" w:hAnsi="Consolas"/>
+          <w:sz w:val="18"/>
+        </w:rPr>
+        <w:t>로그인</w:t>
+      </w:r>
+      <w:r>
+        <w:rPr>
+          <w:rFonts w:ascii="Consolas" w:hAnsi="Consolas"/>
+          <w:sz w:val="18"/>
+        </w:rPr>
+        <w:t xml:space="preserve"> </w:t>
+      </w:r>
+      <w:r>
+        <w:rPr>
+          <w:rFonts w:ascii="Consolas" w:hAnsi="Consolas"/>
+          <w:sz w:val="18"/>
+        </w:rPr>
+        <w:t>시도</w:t>
+      </w:r>
+      <w:r>
+        <w:rPr>
+          <w:rFonts w:ascii="Consolas" w:hAnsi="Consolas"/>
+          <w:sz w:val="18"/>
+        </w:rPr>
+        <w:t xml:space="preserve"> </w:t>
+      </w:r>
+      <w:r>
+        <w:rPr>
+          <w:rFonts w:ascii="Consolas" w:hAnsi="Consolas"/>
+          <w:sz w:val="18"/>
+        </w:rPr>
+        <w:t>제한</w:t>
+      </w:r>
+      <w:r>
+        <w:rPr>
+          <w:rFonts w:ascii="Consolas" w:hAnsi="Consolas"/>
+          <w:sz w:val="18"/>
+        </w:rPr>
+        <w:t xml:space="preserve"> - bruteforce-demo] </w:t>
+      </w:r>
+      <w:r>
+        <w:rPr>
+          <w:rFonts w:ascii="Consolas" w:hAnsi="Consolas"/>
+          <w:sz w:val="18"/>
+        </w:rPr>
+        <w:t>이</w:t>
+      </w:r>
+      <w:r>
+        <w:rPr>
+          <w:rFonts w:ascii="Consolas" w:hAnsi="Consolas"/>
+          <w:sz w:val="18"/>
+        </w:rPr>
+        <w:t xml:space="preserve"> </w:t>
+      </w:r>
+      <w:r>
+        <w:rPr>
+          <w:rFonts w:ascii="Consolas" w:hAnsi="Consolas"/>
+          <w:sz w:val="18"/>
+        </w:rPr>
+        <w:t>시각</w:t>
+      </w:r>
+      <w:r>
+        <w:rPr>
+          <w:rFonts w:ascii="Consolas" w:hAnsi="Consolas"/>
+          <w:sz w:val="18"/>
+        </w:rPr>
+        <w:t xml:space="preserve"> </w:t>
+      </w:r>
+      <w:r>
+        <w:rPr>
+          <w:rFonts w:ascii="Consolas" w:hAnsi="Consolas"/>
+          <w:sz w:val="18"/>
+        </w:rPr>
+        <w:t>이전까지는</w:t>
+      </w:r>
+      <w:r>
+        <w:rPr>
+          <w:rFonts w:ascii="Consolas" w:hAnsi="Consolas"/>
+          <w:sz w:val="18"/>
+        </w:rPr>
+        <w:t xml:space="preserve"> </w:t>
+      </w:r>
+      <w:r>
+        <w:rPr>
+          <w:rFonts w:ascii="Consolas" w:hAnsi="Consolas"/>
+          <w:sz w:val="18"/>
+        </w:rPr>
+        <w:t>비밀번호가</w:t>
+      </w:r>
+      <w:r>
+        <w:rPr>
+          <w:rFonts w:ascii="Consolas" w:hAnsi="Consolas"/>
+          <w:sz w:val="18"/>
+        </w:rPr>
+        <w:t xml:space="preserve"> </w:t>
+      </w:r>
+      <w:r>
+        <w:rPr>
+          <w:rFonts w:ascii="Consolas" w:hAnsi="Consolas"/>
+          <w:sz w:val="18"/>
+        </w:rPr>
+        <w:t>맞아도</w:t>
+      </w:r>
+      <w:r>
+        <w:rPr>
+          <w:rFonts w:ascii="Consolas" w:hAnsi="Consolas"/>
+          <w:sz w:val="18"/>
+        </w:rPr>
+        <w:t xml:space="preserve"> </w:t>
+      </w:r>
+      <w:r>
+        <w:rPr>
+          <w:rFonts w:ascii="Consolas" w:hAnsi="Consolas"/>
+          <w:sz w:val="18"/>
+        </w:rPr>
+        <w:t>로그인을</w:t>
+      </w:r>
+      <w:r>
+        <w:rPr>
+          <w:rFonts w:ascii="Consolas" w:hAnsi="Consolas"/>
+          <w:sz w:val="18"/>
+        </w:rPr>
+        <w:t xml:space="preserve"> </w:t>
+      </w:r>
+      <w:r>
+        <w:rPr>
+          <w:rFonts w:ascii="Consolas" w:hAnsi="Consolas"/>
+          <w:sz w:val="18"/>
+        </w:rPr>
+        <w:t>거부한다</w:t>
+      </w:r>
+      <w:r>
+        <w:rPr>
+          <w:rFonts w:ascii="Consolas" w:hAnsi="Consolas"/>
+          <w:sz w:val="18"/>
+        </w:rPr>
+        <w:t>.</w:t>
       </w:r>
       <w:r>
         <w:br/>
@@ -504,7 +887,119 @@
           <w:rFonts w:ascii="Consolas" w:hAnsi="Consolas"/>
           <w:sz w:val="18"/>
         </w:rPr>
-        <w:t xml:space="preserve">//  null 이면 잠겨 있지 않은 상태. LoginAttemptService 가 설정/해제한다.</w:t>
+        <w:t xml:space="preserve">//  null </w:t>
+      </w:r>
+      <w:r>
+        <w:rPr>
+          <w:rFonts w:ascii="Consolas" w:hAnsi="Consolas"/>
+          <w:sz w:val="18"/>
+        </w:rPr>
+        <w:t>이면</w:t>
+      </w:r>
+      <w:r>
+        <w:rPr>
+          <w:rFonts w:ascii="Consolas" w:hAnsi="Consolas"/>
+          <w:sz w:val="18"/>
+        </w:rPr>
+        <w:t xml:space="preserve"> </w:t>
+      </w:r>
+      <w:r>
+        <w:rPr>
+          <w:rFonts w:ascii="Consolas" w:hAnsi="Consolas"/>
+          <w:sz w:val="18"/>
+        </w:rPr>
+        <w:t>잠겨</w:t>
+      </w:r>
+      <w:r>
+        <w:rPr>
+          <w:rFonts w:ascii="Consolas" w:hAnsi="Consolas"/>
+          <w:sz w:val="18"/>
+        </w:rPr>
+        <w:t xml:space="preserve"> </w:t>
+      </w:r>
+      <w:r>
+        <w:rPr>
+          <w:rFonts w:ascii="Consolas" w:hAnsi="Consolas"/>
+          <w:sz w:val="18"/>
+        </w:rPr>
+        <w:t>있지</w:t>
+      </w:r>
+      <w:r>
+        <w:rPr>
+          <w:rFonts w:ascii="Consolas" w:hAnsi="Consolas"/>
+          <w:sz w:val="18"/>
+        </w:rPr>
+        <w:t xml:space="preserve"> </w:t>
+      </w:r>
+      <w:r>
+        <w:rPr>
+          <w:rFonts w:ascii="Consolas" w:hAnsi="Consolas"/>
+          <w:sz w:val="18"/>
+        </w:rPr>
+        <w:t>않은</w:t>
+      </w:r>
+      <w:r>
+        <w:rPr>
+          <w:rFonts w:ascii="Consolas" w:hAnsi="Consolas"/>
+          <w:sz w:val="18"/>
+        </w:rPr>
+        <w:t xml:space="preserve"> </w:t>
+      </w:r>
+      <w:r>
+        <w:rPr>
+          <w:rFonts w:ascii="Consolas" w:hAnsi="Consolas"/>
+          <w:sz w:val="18"/>
+        </w:rPr>
+        <w:t>상태</w:t>
+      </w:r>
+      <w:r>
+        <w:rPr>
+          <w:rFonts w:ascii="Consolas" w:hAnsi="Consolas"/>
+          <w:sz w:val="18"/>
+        </w:rPr>
+        <w:t xml:space="preserve">. LoginAttemptService </w:t>
+      </w:r>
+      <w:r>
+        <w:rPr>
+          <w:rFonts w:ascii="Consolas" w:hAnsi="Consolas"/>
+          <w:sz w:val="18"/>
+        </w:rPr>
+        <w:t>가</w:t>
+      </w:r>
+      <w:r>
+        <w:rPr>
+          <w:rFonts w:ascii="Consolas" w:hAnsi="Consolas"/>
+          <w:sz w:val="18"/>
+        </w:rPr>
+        <w:t xml:space="preserve"> </w:t>
+      </w:r>
+      <w:r>
+        <w:rPr>
+          <w:rFonts w:ascii="Consolas" w:hAnsi="Consolas"/>
+          <w:sz w:val="18"/>
+        </w:rPr>
+        <w:t>설정</w:t>
+      </w:r>
+      <w:r>
+        <w:rPr>
+          <w:rFonts w:ascii="Consolas" w:hAnsi="Consolas"/>
+          <w:sz w:val="18"/>
+        </w:rPr>
+        <w:t>/</w:t>
+      </w:r>
+      <w:r>
+        <w:rPr>
+          <w:rFonts w:ascii="Consolas" w:hAnsi="Consolas"/>
+          <w:sz w:val="18"/>
+        </w:rPr>
+        <w:t>해제한다</w:t>
+      </w:r>
+      <w:r>
+        <w:rPr>
+          <w:rFonts w:ascii="Consolas" w:hAnsi="Consolas"/>
+          <w:sz w:val="18"/>
+        </w:rPr>
+        <w:t>.</w:t>
       </w:r>
       <w:r>
         <w:br/>
@@ -538,7 +1033,11 @@
         <w:t>담당</w:t>
       </w:r>
       <w:r>
-        <w:t>:</w:t>
+        <w:rPr>
+          <w:rFonts w:hint="eastAsia"/>
+          <w:lang w:eastAsia="ko-KR"/>
+        </w:rPr>
+        <w:t>함</w:t>
       </w:r>
     </w:p>
     <w:p>
@@ -591,6 +1090,8 @@
       </w:r>
       <w:r>
         <w:br/>
+      </w:r>
+      <w:r>
         <w:br/>
       </w:r>
       <w:r>
@@ -602,6 +1103,8 @@
       </w:r>
       <w:r>
         <w:br/>
+      </w:r>
+      <w:r>
         <w:br/>
       </w:r>
       <w:r>
@@ -623,6 +1126,8 @@
       </w:r>
       <w:r>
         <w:br/>
+      </w:r>
+      <w:r>
         <w:br/>
       </w:r>
       <w:r>
@@ -644,6 +1149,8 @@
       </w:r>
       <w:r>
         <w:br/>
+      </w:r>
+      <w:r>
         <w:br/>
       </w:r>
       <w:r>
@@ -651,7 +1158,133 @@
           <w:rFonts w:ascii="Consolas" w:hAnsi="Consolas"/>
           <w:sz w:val="18"/>
         </w:rPr>
-        <w:t xml:space="preserve">    /** 잠겨 있으면 LockedException 을 던진다(비밀번호 검증 전에 즉시 차단). */</w:t>
+        <w:t xml:space="preserve">    /** </w:t>
+      </w:r>
+      <w:r>
+        <w:rPr>
+          <w:rFonts w:ascii="Consolas" w:hAnsi="Consolas"/>
+          <w:sz w:val="18"/>
+        </w:rPr>
+        <w:t>잠겨</w:t>
+      </w:r>
+      <w:r>
+        <w:rPr>
+          <w:rFonts w:ascii="Consolas" w:hAnsi="Consolas"/>
+          <w:sz w:val="18"/>
+        </w:rPr>
+        <w:t xml:space="preserve"> </w:t>
+      </w:r>
+      <w:r>
+        <w:rPr>
+          <w:rFonts w:ascii="Consolas" w:hAnsi="Consolas"/>
+          <w:sz w:val="18"/>
+        </w:rPr>
+        <w:t>있으면</w:t>
+      </w:r>
+      <w:r>
+        <w:rPr>
+          <w:rFonts w:ascii="Consolas" w:hAnsi="Consolas"/>
+          <w:sz w:val="18"/>
+        </w:rPr>
+        <w:t xml:space="preserve"> LockedException </w:t>
+      </w:r>
+      <w:r>
+        <w:rPr>
+          <w:rFonts w:ascii="Consolas" w:hAnsi="Consolas"/>
+          <w:sz w:val="18"/>
+        </w:rPr>
+        <w:t>을</w:t>
+      </w:r>
+      <w:r>
+        <w:rPr>
+          <w:rFonts w:ascii="Consolas" w:hAnsi="Consolas"/>
+          <w:sz w:val="18"/>
+        </w:rPr>
+        <w:t xml:space="preserve"> </w:t>
+      </w:r>
+      <w:r>
+        <w:rPr>
+          <w:rFonts w:ascii="Consolas" w:hAnsi="Consolas"/>
+          <w:sz w:val="18"/>
+        </w:rPr>
+        <w:t>던진다</w:t>
+      </w:r>
+      <w:r>
+        <w:rPr>
+          <w:rFonts w:ascii="Consolas" w:hAnsi="Consolas"/>
+          <w:sz w:val="18"/>
+        </w:rPr>
+        <w:t>(</w:t>
+      </w:r>
+      <w:r>
+        <w:rPr>
+          <w:rFonts w:ascii="Consolas" w:hAnsi="Consolas"/>
+          <w:sz w:val="18"/>
+        </w:rPr>
+        <w:t>비밀번호</w:t>
+      </w:r>
+      <w:r>
+        <w:rPr>
+          <w:rFonts w:ascii="Consolas" w:hAnsi="Consolas"/>
+          <w:sz w:val="18"/>
+        </w:rPr>
+        <w:t xml:space="preserve"> </w:t>
+      </w:r>
+      <w:r>
+        <w:rPr>
+          <w:rFonts w:ascii="Consolas" w:hAnsi="Consolas"/>
+          <w:sz w:val="18"/>
+        </w:rPr>
+        <w:t>검증</w:t>
+      </w:r>
+      <w:r>
+        <w:rPr>
+          <w:rFonts w:ascii="Consolas" w:hAnsi="Consolas"/>
+          <w:sz w:val="18"/>
+        </w:rPr>
+        <w:t xml:space="preserve"> </w:t>
+      </w:r>
+      <w:r>
+        <w:rPr>
+          <w:rFonts w:ascii="Consolas" w:hAnsi="Consolas"/>
+          <w:sz w:val="18"/>
+        </w:rPr>
+        <w:t>전에</w:t>
+      </w:r>
+      <w:r>
+        <w:rPr>
+          <w:rFonts w:ascii="Consolas" w:hAnsi="Consolas"/>
+          <w:sz w:val="18"/>
+        </w:rPr>
+        <w:t xml:space="preserve"> </w:t>
+      </w:r>
+      <w:r>
+        <w:rPr>
+          <w:rFonts w:ascii="Consolas" w:hAnsi="Consolas"/>
+          <w:sz w:val="18"/>
+        </w:rPr>
+        <w:t>즉시</w:t>
+      </w:r>
+      <w:r>
+        <w:rPr>
+          <w:rFonts w:ascii="Consolas" w:hAnsi="Consolas"/>
+          <w:sz w:val="18"/>
+        </w:rPr>
+        <w:t xml:space="preserve"> </w:t>
+      </w:r>
+      <w:r>
+        <w:rPr>
+          <w:rFonts w:ascii="Consolas" w:hAnsi="Consolas"/>
+          <w:sz w:val="18"/>
+        </w:rPr>
+        <w:t>차단</w:t>
+      </w:r>
+      <w:r>
+        <w:rPr>
+          <w:rFonts w:ascii="Consolas" w:hAnsi="Consolas"/>
+          <w:sz w:val="18"/>
+        </w:rPr>
+        <w:t>). */</w:t>
       </w:r>
       <w:r>
         <w:br/>
@@ -731,7 +1364,161 @@
           <w:rFonts w:ascii="Consolas" w:hAnsi="Consolas"/>
           <w:sz w:val="18"/>
         </w:rPr>
-        <w:t xml:space="preserve">                        "로그인 시도 횟수를 초과하여 계정이 잠겼습니다. 약 " + remainingSeconds + "초 후 다시 시도하세요");</w:t>
+        <w:t xml:space="preserve">                        "</w:t>
+      </w:r>
+      <w:r>
+        <w:rPr>
+          <w:rFonts w:ascii="Consolas" w:hAnsi="Consolas"/>
+          <w:sz w:val="18"/>
+        </w:rPr>
+        <w:t>로그인</w:t>
+      </w:r>
+      <w:r>
+        <w:rPr>
+          <w:rFonts w:ascii="Consolas" w:hAnsi="Consolas"/>
+          <w:sz w:val="18"/>
+        </w:rPr>
+        <w:t xml:space="preserve"> </w:t>
+      </w:r>
+      <w:r>
+        <w:rPr>
+          <w:rFonts w:ascii="Consolas" w:hAnsi="Consolas"/>
+          <w:sz w:val="18"/>
+        </w:rPr>
+        <w:t>시도</w:t>
+      </w:r>
+      <w:r>
+        <w:rPr>
+          <w:rFonts w:ascii="Consolas" w:hAnsi="Consolas"/>
+          <w:sz w:val="18"/>
+        </w:rPr>
+        <w:t xml:space="preserve"> </w:t>
+      </w:r>
+      <w:r>
+        <w:rPr>
+          <w:rFonts w:ascii="Consolas" w:hAnsi="Consolas"/>
+          <w:sz w:val="18"/>
+        </w:rPr>
+        <w:t>횟수를</w:t>
+      </w:r>
+      <w:r>
+        <w:rPr>
+          <w:rFonts w:ascii="Consolas" w:hAnsi="Consolas"/>
+          <w:sz w:val="18"/>
+        </w:rPr>
+        <w:t xml:space="preserve"> </w:t>
+      </w:r>
+      <w:r>
+        <w:rPr>
+          <w:rFonts w:ascii="Consolas" w:hAnsi="Consolas"/>
+          <w:sz w:val="18"/>
+        </w:rPr>
+        <w:t>초과하여</w:t>
+      </w:r>
+      <w:r>
+        <w:rPr>
+          <w:rFonts w:ascii="Consolas" w:hAnsi="Consolas"/>
+          <w:sz w:val="18"/>
+        </w:rPr>
+        <w:t xml:space="preserve"> </w:t>
+      </w:r>
+      <w:r>
+        <w:rPr>
+          <w:rFonts w:ascii="Consolas" w:hAnsi="Consolas"/>
+          <w:sz w:val="18"/>
+        </w:rPr>
+        <w:t>계정이</w:t>
+      </w:r>
+      <w:r>
+        <w:rPr>
+          <w:rFonts w:ascii="Consolas" w:hAnsi="Consolas"/>
+          <w:sz w:val="18"/>
+        </w:rPr>
+        <w:t xml:space="preserve"> </w:t>
+      </w:r>
+      <w:r>
+        <w:rPr>
+          <w:rFonts w:ascii="Consolas" w:hAnsi="Consolas"/>
+          <w:sz w:val="18"/>
+        </w:rPr>
+        <w:t>잠겼습니다</w:t>
+      </w:r>
+      <w:r>
+        <w:rPr>
+          <w:rFonts w:ascii="Consolas" w:hAnsi="Consolas"/>
+          <w:sz w:val="18"/>
+        </w:rPr>
+        <w:t xml:space="preserve">. </w:t>
+      </w:r>
+      <w:r>
+        <w:rPr>
+          <w:rFonts w:ascii="Consolas" w:hAnsi="Consolas"/>
+          <w:sz w:val="18"/>
+        </w:rPr>
+        <w:t>약</w:t>
+      </w:r>
+      <w:r>
+        <w:rPr>
+          <w:rFonts w:ascii="Consolas" w:hAnsi="Consolas"/>
+          <w:sz w:val="18"/>
+        </w:rPr>
+        <w:t xml:space="preserve"> " + remainingSeconds + "</w:t>
+      </w:r>
+      <w:r>
+        <w:rPr>
+          <w:rFonts w:ascii="Consolas" w:hAnsi="Consolas"/>
+          <w:sz w:val="18"/>
+        </w:rPr>
+        <w:t>초</w:t>
+      </w:r>
+      <w:r>
+        <w:rPr>
+          <w:rFonts w:ascii="Consolas" w:hAnsi="Consolas"/>
+          <w:sz w:val="18"/>
+        </w:rPr>
+        <w:t xml:space="preserve"> </w:t>
+      </w:r>
+      <w:r>
+        <w:rPr>
+          <w:rFonts w:ascii="Consolas" w:hAnsi="Consolas"/>
+          <w:sz w:val="18"/>
+        </w:rPr>
+        <w:t>후</w:t>
+      </w:r>
+      <w:r>
+        <w:rPr>
+          <w:rFonts w:ascii="Consolas" w:hAnsi="Consolas"/>
+          <w:sz w:val="18"/>
+        </w:rPr>
+        <w:t xml:space="preserve"> </w:t>
+      </w:r>
+      <w:r>
+        <w:rPr>
+          <w:rFonts w:ascii="Consolas" w:hAnsi="Consolas"/>
+          <w:sz w:val="18"/>
+        </w:rPr>
+        <w:t>다시</w:t>
+      </w:r>
+      <w:r>
+        <w:rPr>
+          <w:rFonts w:ascii="Consolas" w:hAnsi="Consolas"/>
+          <w:sz w:val="18"/>
+        </w:rPr>
+        <w:t xml:space="preserve"> </w:t>
+      </w:r>
+      <w:r>
+        <w:rPr>
+          <w:rFonts w:ascii="Consolas" w:hAnsi="Consolas"/>
+          <w:sz w:val="18"/>
+        </w:rPr>
+        <w:t>시도하세요</w:t>
+      </w:r>
+      <w:r>
+        <w:rPr>
+          <w:rFonts w:ascii="Consolas" w:hAnsi="Consolas"/>
+          <w:sz w:val="18"/>
+        </w:rPr>
+        <w:t>");</w:t>
       </w:r>
       <w:r>
         <w:br/>
@@ -765,6 +1552,8 @@
       </w:r>
       <w:r>
         <w:br/>
+      </w:r>
+      <w:r>
         <w:br/>
       </w:r>
       <w:r>
@@ -772,7 +1561,105 @@
           <w:rFonts w:ascii="Consolas" w:hAnsi="Consolas"/>
           <w:sz w:val="18"/>
         </w:rPr>
-        <w:t xml:space="preserve">    /** 로그인 성공 시 실패 횟수와 잠금을 초기화한다. */</w:t>
+        <w:t xml:space="preserve">    /** </w:t>
+      </w:r>
+      <w:r>
+        <w:rPr>
+          <w:rFonts w:ascii="Consolas" w:hAnsi="Consolas"/>
+          <w:sz w:val="18"/>
+        </w:rPr>
+        <w:t>로그인</w:t>
+      </w:r>
+      <w:r>
+        <w:rPr>
+          <w:rFonts w:ascii="Consolas" w:hAnsi="Consolas"/>
+          <w:sz w:val="18"/>
+        </w:rPr>
+        <w:t xml:space="preserve"> </w:t>
+      </w:r>
+      <w:r>
+        <w:rPr>
+          <w:rFonts w:ascii="Consolas" w:hAnsi="Consolas"/>
+          <w:sz w:val="18"/>
+        </w:rPr>
+        <w:t>성공</w:t>
+      </w:r>
+      <w:r>
+        <w:rPr>
+          <w:rFonts w:ascii="Consolas" w:hAnsi="Consolas"/>
+          <w:sz w:val="18"/>
+        </w:rPr>
+        <w:t xml:space="preserve"> </w:t>
+      </w:r>
+      <w:r>
+        <w:rPr>
+          <w:rFonts w:ascii="Consolas" w:hAnsi="Consolas"/>
+          <w:sz w:val="18"/>
+        </w:rPr>
+        <w:t>시</w:t>
+      </w:r>
+      <w:r>
+        <w:rPr>
+          <w:rFonts w:ascii="Consolas" w:hAnsi="Consolas"/>
+          <w:sz w:val="18"/>
+        </w:rPr>
+        <w:t xml:space="preserve"> </w:t>
+      </w:r>
+      <w:r>
+        <w:rPr>
+          <w:rFonts w:ascii="Consolas" w:hAnsi="Consolas"/>
+          <w:sz w:val="18"/>
+        </w:rPr>
+        <w:t>실패</w:t>
+      </w:r>
+      <w:r>
+        <w:rPr>
+          <w:rFonts w:ascii="Consolas" w:hAnsi="Consolas"/>
+          <w:sz w:val="18"/>
+        </w:rPr>
+        <w:t xml:space="preserve"> </w:t>
+      </w:r>
+      <w:r>
+        <w:rPr>
+          <w:rFonts w:ascii="Consolas" w:hAnsi="Consolas"/>
+          <w:sz w:val="18"/>
+        </w:rPr>
+        <w:t>횟수와</w:t>
+      </w:r>
+      <w:r>
+        <w:rPr>
+          <w:rFonts w:ascii="Consolas" w:hAnsi="Consolas"/>
+          <w:sz w:val="18"/>
+        </w:rPr>
+        <w:t xml:space="preserve"> </w:t>
+      </w:r>
+      <w:r>
+        <w:rPr>
+          <w:rFonts w:ascii="Consolas" w:hAnsi="Consolas"/>
+          <w:sz w:val="18"/>
+        </w:rPr>
+        <w:t>잠금을</w:t>
+      </w:r>
+      <w:r>
+        <w:rPr>
+          <w:rFonts w:ascii="Consolas" w:hAnsi="Consolas"/>
+          <w:sz w:val="18"/>
+        </w:rPr>
+        <w:t xml:space="preserve"> </w:t>
+      </w:r>
+      <w:r>
+        <w:rPr>
+          <w:rFonts w:ascii="Consolas" w:hAnsi="Consolas"/>
+          <w:sz w:val="18"/>
+        </w:rPr>
+        <w:t>초기화한다</w:t>
+      </w:r>
+      <w:r>
+        <w:rPr>
+          <w:rFonts w:ascii="Consolas" w:hAnsi="Consolas"/>
+          <w:sz w:val="18"/>
+        </w:rPr>
+        <w:t>. */</w:t>
       </w:r>
       <w:r>
         <w:br/>
@@ -792,10 +1679,26 @@
           <w:rFonts w:ascii="Consolas" w:hAnsi="Consolas"/>
           <w:sz w:val="18"/>
         </w:rPr>
-        <w:t xml:space="preserve">    public void onSuccess(String email) { /* failedLoginCount=0, lockedUntil=null 저장 */ }</w:t>
+        <w:t xml:space="preserve">    public void onSuccess(String email) { /* failedLoginCount=0, lockedUntil=null </w:t>
+      </w:r>
+      <w:r>
+        <w:rPr>
+          <w:rFonts w:ascii="Consolas" w:hAnsi="Consolas"/>
+          <w:sz w:val="18"/>
+        </w:rPr>
+        <w:t>저장</w:t>
+      </w:r>
+      <w:r>
+        <w:rPr>
+          <w:rFonts w:ascii="Consolas" w:hAnsi="Consolas"/>
+          <w:sz w:val="18"/>
+        </w:rPr>
+        <w:t xml:space="preserve"> */ }</w:t>
       </w:r>
       <w:r>
         <w:br/>
+      </w:r>
+      <w:r>
         <w:br/>
       </w:r>
       <w:r>
@@ -803,7 +1706,161 @@
           <w:rFonts w:ascii="Consolas" w:hAnsi="Consolas"/>
           <w:sz w:val="18"/>
         </w:rPr>
-        <w:t xml:space="preserve">    /** 로그인 실패 시 호출. 실패 횟수를 누적하고, 임계치를 넘으면 계정을 잠근다. */</w:t>
+        <w:t xml:space="preserve">    /** </w:t>
+      </w:r>
+      <w:r>
+        <w:rPr>
+          <w:rFonts w:ascii="Consolas" w:hAnsi="Consolas"/>
+          <w:sz w:val="18"/>
+        </w:rPr>
+        <w:t>로그인</w:t>
+      </w:r>
+      <w:r>
+        <w:rPr>
+          <w:rFonts w:ascii="Consolas" w:hAnsi="Consolas"/>
+          <w:sz w:val="18"/>
+        </w:rPr>
+        <w:t xml:space="preserve"> </w:t>
+      </w:r>
+      <w:r>
+        <w:rPr>
+          <w:rFonts w:ascii="Consolas" w:hAnsi="Consolas"/>
+          <w:sz w:val="18"/>
+        </w:rPr>
+        <w:t>실패</w:t>
+      </w:r>
+      <w:r>
+        <w:rPr>
+          <w:rFonts w:ascii="Consolas" w:hAnsi="Consolas"/>
+          <w:sz w:val="18"/>
+        </w:rPr>
+        <w:t xml:space="preserve"> </w:t>
+      </w:r>
+      <w:r>
+        <w:rPr>
+          <w:rFonts w:ascii="Consolas" w:hAnsi="Consolas"/>
+          <w:sz w:val="18"/>
+        </w:rPr>
+        <w:t>시</w:t>
+      </w:r>
+      <w:r>
+        <w:rPr>
+          <w:rFonts w:ascii="Consolas" w:hAnsi="Consolas"/>
+          <w:sz w:val="18"/>
+        </w:rPr>
+        <w:t xml:space="preserve"> </w:t>
+      </w:r>
+      <w:r>
+        <w:rPr>
+          <w:rFonts w:ascii="Consolas" w:hAnsi="Consolas"/>
+          <w:sz w:val="18"/>
+        </w:rPr>
+        <w:t>호출</w:t>
+      </w:r>
+      <w:r>
+        <w:rPr>
+          <w:rFonts w:ascii="Consolas" w:hAnsi="Consolas"/>
+          <w:sz w:val="18"/>
+        </w:rPr>
+        <w:t xml:space="preserve">. </w:t>
+      </w:r>
+      <w:r>
+        <w:rPr>
+          <w:rFonts w:ascii="Consolas" w:hAnsi="Consolas"/>
+          <w:sz w:val="18"/>
+        </w:rPr>
+        <w:t>실패</w:t>
+      </w:r>
+      <w:r>
+        <w:rPr>
+          <w:rFonts w:ascii="Consolas" w:hAnsi="Consolas"/>
+          <w:sz w:val="18"/>
+        </w:rPr>
+        <w:t xml:space="preserve"> </w:t>
+      </w:r>
+      <w:r>
+        <w:rPr>
+          <w:rFonts w:ascii="Consolas" w:hAnsi="Consolas"/>
+          <w:sz w:val="18"/>
+        </w:rPr>
+        <w:t>횟수를</w:t>
+      </w:r>
+      <w:r>
+        <w:rPr>
+          <w:rFonts w:ascii="Consolas" w:hAnsi="Consolas"/>
+          <w:sz w:val="18"/>
+        </w:rPr>
+        <w:t xml:space="preserve"> </w:t>
+      </w:r>
+      <w:r>
+        <w:rPr>
+          <w:rFonts w:ascii="Consolas" w:hAnsi="Consolas"/>
+          <w:sz w:val="18"/>
+        </w:rPr>
+        <w:t>누적하고</w:t>
+      </w:r>
+      <w:r>
+        <w:rPr>
+          <w:rFonts w:ascii="Consolas" w:hAnsi="Consolas"/>
+          <w:sz w:val="18"/>
+        </w:rPr>
+        <w:t xml:space="preserve">, </w:t>
+      </w:r>
+      <w:r>
+        <w:rPr>
+          <w:rFonts w:ascii="Consolas" w:hAnsi="Consolas"/>
+          <w:sz w:val="18"/>
+        </w:rPr>
+        <w:t>임계치를</w:t>
+      </w:r>
+      <w:r>
+        <w:rPr>
+          <w:rFonts w:ascii="Consolas" w:hAnsi="Consolas"/>
+          <w:sz w:val="18"/>
+        </w:rPr>
+        <w:t xml:space="preserve"> </w:t>
+      </w:r>
+      <w:r>
+        <w:rPr>
+          <w:rFonts w:ascii="Consolas" w:hAnsi="Consolas"/>
+          <w:sz w:val="18"/>
+        </w:rPr>
+        <w:t>넘으면</w:t>
+      </w:r>
+      <w:r>
+        <w:rPr>
+          <w:rFonts w:ascii="Consolas" w:hAnsi="Consolas"/>
+          <w:sz w:val="18"/>
+        </w:rPr>
+        <w:t xml:space="preserve"> </w:t>
+      </w:r>
+      <w:r>
+        <w:rPr>
+          <w:rFonts w:ascii="Consolas" w:hAnsi="Consolas"/>
+          <w:sz w:val="18"/>
+        </w:rPr>
+        <w:t>계정을</w:t>
+      </w:r>
+      <w:r>
+        <w:rPr>
+          <w:rFonts w:ascii="Consolas" w:hAnsi="Consolas"/>
+          <w:sz w:val="18"/>
+        </w:rPr>
+        <w:t xml:space="preserve"> </w:t>
+      </w:r>
+      <w:r>
+        <w:rPr>
+          <w:rFonts w:ascii="Consolas" w:hAnsi="Consolas"/>
+          <w:sz w:val="18"/>
+        </w:rPr>
+        <w:t>잠근다</w:t>
+      </w:r>
+      <w:r>
+        <w:rPr>
+          <w:rFonts w:ascii="Consolas" w:hAnsi="Consolas"/>
+          <w:sz w:val="18"/>
+        </w:rPr>
+        <w:t>. */</w:t>
       </w:r>
       <w:r>
         <w:br/>
@@ -884,7 +1941,147 @@
           <w:rFonts w:ascii="Consolas" w:hAnsi="Consolas"/>
           <w:sz w:val="18"/>
         </w:rPr>
-        <w:t xml:space="preserve">                log.warn("[AUDIT] 로그인 시도 제한 - 계정 잠금 - user={}, 실패 횟수={}, 잠금 시간={}초",</w:t>
+        <w:t xml:space="preserve">                log.warn("[AUDIT] </w:t>
+      </w:r>
+      <w:r>
+        <w:rPr>
+          <w:rFonts w:ascii="Consolas" w:hAnsi="Consolas"/>
+          <w:sz w:val="18"/>
+        </w:rPr>
+        <w:t>로그인</w:t>
+      </w:r>
+      <w:r>
+        <w:rPr>
+          <w:rFonts w:ascii="Consolas" w:hAnsi="Consolas"/>
+          <w:sz w:val="18"/>
+        </w:rPr>
+        <w:t xml:space="preserve"> </w:t>
+      </w:r>
+      <w:r>
+        <w:rPr>
+          <w:rFonts w:ascii="Consolas" w:hAnsi="Consolas"/>
+          <w:sz w:val="18"/>
+        </w:rPr>
+        <w:t>시도</w:t>
+      </w:r>
+      <w:r>
+        <w:rPr>
+          <w:rFonts w:ascii="Consolas" w:hAnsi="Consolas"/>
+          <w:sz w:val="18"/>
+        </w:rPr>
+        <w:t xml:space="preserve"> </w:t>
+      </w:r>
+      <w:r>
+        <w:rPr>
+          <w:rFonts w:ascii="Consolas" w:hAnsi="Consolas"/>
+          <w:sz w:val="18"/>
+        </w:rPr>
+        <w:t>제한</w:t>
+      </w:r>
+      <w:r>
+        <w:rPr>
+          <w:rFonts w:ascii="Consolas" w:hAnsi="Consolas"/>
+          <w:sz w:val="18"/>
+        </w:rPr>
+        <w:t xml:space="preserve"> - </w:t>
+      </w:r>
+      <w:r>
+        <w:rPr>
+          <w:rFonts w:ascii="Consolas" w:hAnsi="Consolas"/>
+          <w:sz w:val="18"/>
+        </w:rPr>
+        <w:t>계정</w:t>
+      </w:r>
+      <w:r>
+        <w:rPr>
+          <w:rFonts w:ascii="Consolas" w:hAnsi="Consolas"/>
+          <w:sz w:val="18"/>
+        </w:rPr>
+        <w:t xml:space="preserve"> </w:t>
+      </w:r>
+      <w:r>
+        <w:rPr>
+          <w:rFonts w:ascii="Consolas" w:hAnsi="Consolas"/>
+          <w:sz w:val="18"/>
+        </w:rPr>
+        <w:t>잠금</w:t>
+      </w:r>
+      <w:r>
+        <w:rPr>
+          <w:rFonts w:ascii="Consolas" w:hAnsi="Consolas"/>
+          <w:sz w:val="18"/>
+        </w:rPr>
+        <w:t xml:space="preserve"> - user={}, </w:t>
+      </w:r>
+      <w:r>
+        <w:rPr>
+          <w:rFonts w:ascii="Consolas" w:hAnsi="Consolas"/>
+          <w:sz w:val="18"/>
+        </w:rPr>
+        <w:t>실패</w:t>
+      </w:r>
+      <w:r>
+        <w:rPr>
+          <w:rFonts w:ascii="Consolas" w:hAnsi="Consolas"/>
+          <w:sz w:val="18"/>
+        </w:rPr>
+        <w:t xml:space="preserve"> </w:t>
+      </w:r>
+      <w:r>
+        <w:rPr>
+          <w:rFonts w:ascii="Consolas" w:hAnsi="Consolas"/>
+          <w:sz w:val="18"/>
+        </w:rPr>
+        <w:t>횟수</w:t>
+      </w:r>
+      <w:r>
+        <w:rPr>
+          <w:rFonts w:ascii="Consolas" w:hAnsi="Consolas"/>
+          <w:sz w:val="18"/>
+        </w:rPr>
+        <w:t xml:space="preserve">={}, </w:t>
+      </w:r>
+      <w:r>
+        <w:rPr>
+          <w:rFonts w:ascii="Consolas" w:hAnsi="Consolas"/>
+          <w:sz w:val="18"/>
+        </w:rPr>
+        <w:t>잠금</w:t>
+      </w:r>
+      <w:r>
+        <w:rPr>
+          <w:rFonts w:ascii="Consolas" w:hAnsi="Consolas"/>
+          <w:sz w:val="18"/>
+        </w:rPr>
+        <w:t xml:space="preserve"> </w:t>
+      </w:r>
+      <w:r>
+        <w:rPr>
+          <w:rFonts w:ascii="Consolas" w:hAnsi="Consolas"/>
+          <w:sz w:val="18"/>
+        </w:rPr>
+        <w:t>시간</w:t>
+      </w:r>
+      <w:r>
+        <w:rPr>
+          <w:rFonts w:ascii="Consolas" w:hAnsi="Consolas"/>
+          <w:sz w:val="18"/>
+        </w:rPr>
+        <w:t>={}</w:t>
+      </w:r>
+      <w:r>
+        <w:rPr>
+          <w:rFonts w:ascii="Consolas" w:hAnsi="Consolas"/>
+          <w:sz w:val="18"/>
+        </w:rPr>
+        <w:t>초</w:t>
+      </w:r>
+      <w:r>
+        <w:rPr>
+          <w:rFonts w:ascii="Consolas" w:hAnsi="Consolas"/>
+          <w:sz w:val="18"/>
+        </w:rPr>
+        <w:t>",</w:t>
       </w:r>
       <w:r>
         <w:br/>
@@ -1004,7 +2201,112 @@
           <w:rFonts w:ascii="Consolas" w:hAnsi="Consolas"/>
           <w:sz w:val="18"/>
         </w:rPr>
-        <w:t xml:space="preserve">    //이미 잠긴 계정이면 비밀번호 검증 없이 즉시 거부한다</w:t>
+        <w:t xml:space="preserve">    //</w:t>
+      </w:r>
+      <w:r>
+        <w:rPr>
+          <w:rFonts w:ascii="Consolas" w:hAnsi="Consolas"/>
+          <w:sz w:val="18"/>
+        </w:rPr>
+        <w:t>이미</w:t>
+      </w:r>
+      <w:r>
+        <w:rPr>
+          <w:rFonts w:ascii="Consolas" w:hAnsi="Consolas"/>
+          <w:sz w:val="18"/>
+        </w:rPr>
+        <w:t xml:space="preserve"> </w:t>
+      </w:r>
+      <w:r>
+        <w:rPr>
+          <w:rFonts w:ascii="Consolas" w:hAnsi="Consolas"/>
+          <w:sz w:val="18"/>
+        </w:rPr>
+        <w:t>잠긴</w:t>
+      </w:r>
+      <w:r>
+        <w:rPr>
+          <w:rFonts w:ascii="Consolas" w:hAnsi="Consolas"/>
+          <w:sz w:val="18"/>
+        </w:rPr>
+        <w:t xml:space="preserve"> </w:t>
+      </w:r>
+      <w:r>
+        <w:rPr>
+          <w:rFonts w:ascii="Consolas" w:hAnsi="Consolas"/>
+          <w:sz w:val="18"/>
+        </w:rPr>
+        <w:t>계정이면</w:t>
+      </w:r>
+      <w:r>
+        <w:rPr>
+          <w:rFonts w:ascii="Consolas" w:hAnsi="Consolas"/>
+          <w:sz w:val="18"/>
+        </w:rPr>
+        <w:t xml:space="preserve"> </w:t>
+      </w:r>
+      <w:r>
+        <w:rPr>
+          <w:rFonts w:ascii="Consolas" w:hAnsi="Consolas"/>
+          <w:sz w:val="18"/>
+        </w:rPr>
+        <w:t>비밀번호</w:t>
+      </w:r>
+      <w:r>
+        <w:rPr>
+          <w:rFonts w:ascii="Consolas" w:hAnsi="Consolas"/>
+          <w:sz w:val="18"/>
+        </w:rPr>
+        <w:t xml:space="preserve"> </w:t>
+      </w:r>
+      <w:r>
+        <w:rPr>
+          <w:rFonts w:ascii="Consolas" w:hAnsi="Consolas"/>
+          <w:sz w:val="18"/>
+        </w:rPr>
+        <w:t>검증</w:t>
+      </w:r>
+      <w:r>
+        <w:rPr>
+          <w:rFonts w:ascii="Consolas" w:hAnsi="Consolas"/>
+          <w:sz w:val="18"/>
+        </w:rPr>
+        <w:t xml:space="preserve"> </w:t>
+      </w:r>
+      <w:r>
+        <w:rPr>
+          <w:rFonts w:ascii="Consolas" w:hAnsi="Consolas"/>
+          <w:sz w:val="18"/>
+        </w:rPr>
+        <w:t>없이</w:t>
+      </w:r>
+      <w:r>
+        <w:rPr>
+          <w:rFonts w:ascii="Consolas" w:hAnsi="Consolas"/>
+          <w:sz w:val="18"/>
+        </w:rPr>
+        <w:t xml:space="preserve"> </w:t>
+      </w:r>
+      <w:r>
+        <w:rPr>
+          <w:rFonts w:ascii="Consolas" w:hAnsi="Consolas"/>
+          <w:sz w:val="18"/>
+        </w:rPr>
+        <w:t>즉시</w:t>
+      </w:r>
+      <w:r>
+        <w:rPr>
+          <w:rFonts w:ascii="Consolas" w:hAnsi="Consolas"/>
+          <w:sz w:val="18"/>
+        </w:rPr>
+        <w:t xml:space="preserve"> </w:t>
+      </w:r>
+      <w:r>
+        <w:rPr>
+          <w:rFonts w:ascii="Consolas" w:hAnsi="Consolas"/>
+          <w:sz w:val="18"/>
+        </w:rPr>
+        <w:t>거부한다</w:t>
       </w:r>
       <w:r>
         <w:br/>
@@ -1018,6 +2320,8 @@
       </w:r>
       <w:r>
         <w:br/>
+      </w:r>
+      <w:r>
         <w:br/>
       </w:r>
       <w:r>
@@ -1109,6 +2413,8 @@
       </w:r>
       <w:r>
         <w:br/>
+      </w:r>
+      <w:r>
         <w:br/>
       </w:r>
       <w:r>
@@ -1136,7 +2442,70 @@
           <w:rFonts w:ascii="Consolas" w:hAnsi="Consolas"/>
           <w:sz w:val="18"/>
         </w:rPr>
-        <w:t xml:space="preserve">    // ... 이후 토큰 발급은 기존과 동일</w:t>
+        <w:t xml:space="preserve">    // ... </w:t>
+      </w:r>
+      <w:r>
+        <w:rPr>
+          <w:rFonts w:ascii="Consolas" w:hAnsi="Consolas"/>
+          <w:sz w:val="18"/>
+        </w:rPr>
+        <w:t>이후</w:t>
+      </w:r>
+      <w:r>
+        <w:rPr>
+          <w:rFonts w:ascii="Consolas" w:hAnsi="Consolas"/>
+          <w:sz w:val="18"/>
+        </w:rPr>
+        <w:t xml:space="preserve"> </w:t>
+      </w:r>
+      <w:r>
+        <w:rPr>
+          <w:rFonts w:ascii="Consolas" w:hAnsi="Consolas"/>
+          <w:sz w:val="18"/>
+        </w:rPr>
+        <w:t>토큰</w:t>
+      </w:r>
+      <w:r>
+        <w:rPr>
+          <w:rFonts w:ascii="Consolas" w:hAnsi="Consolas"/>
+          <w:sz w:val="18"/>
+        </w:rPr>
+        <w:t xml:space="preserve"> </w:t>
+      </w:r>
+      <w:r>
+        <w:rPr>
+          <w:rFonts w:ascii="Consolas" w:hAnsi="Consolas"/>
+          <w:sz w:val="18"/>
+        </w:rPr>
+        <w:t>발급은</w:t>
+      </w:r>
+      <w:r>
+        <w:rPr>
+          <w:rFonts w:ascii="Consolas" w:hAnsi="Consolas"/>
+          <w:sz w:val="18"/>
+        </w:rPr>
+        <w:t xml:space="preserve"> </w:t>
+      </w:r>
+      <w:r>
+        <w:rPr>
+          <w:rFonts w:ascii="Consolas" w:hAnsi="Consolas"/>
+          <w:sz w:val="18"/>
+        </w:rPr>
+        <w:t>기존과</w:t>
+      </w:r>
+      <w:r>
+        <w:rPr>
+          <w:rFonts w:ascii="Consolas" w:hAnsi="Consolas"/>
+          <w:sz w:val="18"/>
+        </w:rPr>
+        <w:t xml:space="preserve"> </w:t>
+      </w:r>
+      <w:r>
+        <w:rPr>
+          <w:rFonts w:ascii="Consolas" w:hAnsi="Consolas"/>
+          <w:sz w:val="18"/>
+        </w:rPr>
+        <w:t>동일</w:t>
       </w:r>
       <w:r>
         <w:br/>
@@ -1179,7 +2548,189 @@
           <w:rFonts w:ascii="Consolas" w:hAnsi="Consolas"/>
           <w:sz w:val="18"/>
         </w:rPr>
-        <w:t xml:space="preserve"># [로그인 시도 제한 - bruteforce-demo] (OWASP #7) 연속 로그인 실패 임계치 초과 시 계정을 일정 시간 잠근다.</w:t>
+        <w:t># [</w:t>
+      </w:r>
+      <w:r>
+        <w:rPr>
+          <w:rFonts w:ascii="Consolas" w:hAnsi="Consolas"/>
+          <w:sz w:val="18"/>
+        </w:rPr>
+        <w:t>로그인</w:t>
+      </w:r>
+      <w:r>
+        <w:rPr>
+          <w:rFonts w:ascii="Consolas" w:hAnsi="Consolas"/>
+          <w:sz w:val="18"/>
+        </w:rPr>
+        <w:t xml:space="preserve"> </w:t>
+      </w:r>
+      <w:r>
+        <w:rPr>
+          <w:rFonts w:ascii="Consolas" w:hAnsi="Consolas"/>
+          <w:sz w:val="18"/>
+        </w:rPr>
+        <w:t>시도</w:t>
+      </w:r>
+      <w:r>
+        <w:rPr>
+          <w:rFonts w:ascii="Consolas" w:hAnsi="Consolas"/>
+          <w:sz w:val="18"/>
+        </w:rPr>
+        <w:t xml:space="preserve"> </w:t>
+      </w:r>
+      <w:r>
+        <w:rPr>
+          <w:rFonts w:ascii="Consolas" w:hAnsi="Consolas"/>
+          <w:sz w:val="18"/>
+        </w:rPr>
+        <w:t>제한</w:t>
+      </w:r>
+      <w:r>
+        <w:rPr>
+          <w:rFonts w:ascii="Consolas" w:hAnsi="Consolas"/>
+          <w:sz w:val="18"/>
+        </w:rPr>
+        <w:t xml:space="preserve"> - bruteforce-demo] (OWASP #7) </w:t>
+      </w:r>
+      <w:r>
+        <w:rPr>
+          <w:rFonts w:ascii="Consolas" w:hAnsi="Consolas"/>
+          <w:sz w:val="18"/>
+        </w:rPr>
+        <w:t>연속</w:t>
+      </w:r>
+      <w:r>
+        <w:rPr>
+          <w:rFonts w:ascii="Consolas" w:hAnsi="Consolas"/>
+          <w:sz w:val="18"/>
+        </w:rPr>
+        <w:t xml:space="preserve"> </w:t>
+      </w:r>
+      <w:r>
+        <w:rPr>
+          <w:rFonts w:ascii="Consolas" w:hAnsi="Consolas"/>
+          <w:sz w:val="18"/>
+        </w:rPr>
+        <w:t>로그인</w:t>
+      </w:r>
+      <w:r>
+        <w:rPr>
+          <w:rFonts w:ascii="Consolas" w:hAnsi="Consolas"/>
+          <w:sz w:val="18"/>
+        </w:rPr>
+        <w:t xml:space="preserve"> </w:t>
+      </w:r>
+      <w:r>
+        <w:rPr>
+          <w:rFonts w:ascii="Consolas" w:hAnsi="Consolas"/>
+          <w:sz w:val="18"/>
+        </w:rPr>
+        <w:t>실패</w:t>
+      </w:r>
+      <w:r>
+        <w:rPr>
+          <w:rFonts w:ascii="Consolas" w:hAnsi="Consolas"/>
+          <w:sz w:val="18"/>
+        </w:rPr>
+        <w:t xml:space="preserve"> </w:t>
+      </w:r>
+      <w:r>
+        <w:rPr>
+          <w:rFonts w:ascii="Consolas" w:hAnsi="Consolas"/>
+          <w:sz w:val="18"/>
+        </w:rPr>
+        <w:t>임계치</w:t>
+      </w:r>
+      <w:r>
+        <w:rPr>
+          <w:rFonts w:ascii="Consolas" w:hAnsi="Consolas"/>
+          <w:sz w:val="18"/>
+        </w:rPr>
+        <w:t xml:space="preserve"> </w:t>
+      </w:r>
+      <w:r>
+        <w:rPr>
+          <w:rFonts w:ascii="Consolas" w:hAnsi="Consolas"/>
+          <w:sz w:val="18"/>
+        </w:rPr>
+        <w:t>초과</w:t>
+      </w:r>
+      <w:r>
+        <w:rPr>
+          <w:rFonts w:ascii="Consolas" w:hAnsi="Consolas"/>
+          <w:sz w:val="18"/>
+        </w:rPr>
+        <w:t xml:space="preserve"> </w:t>
+      </w:r>
+      <w:r>
+        <w:rPr>
+          <w:rFonts w:ascii="Consolas" w:hAnsi="Consolas"/>
+          <w:sz w:val="18"/>
+        </w:rPr>
+        <w:t>시</w:t>
+      </w:r>
+      <w:r>
+        <w:rPr>
+          <w:rFonts w:ascii="Consolas" w:hAnsi="Consolas"/>
+          <w:sz w:val="18"/>
+        </w:rPr>
+        <w:t xml:space="preserve"> </w:t>
+      </w:r>
+      <w:r>
+        <w:rPr>
+          <w:rFonts w:ascii="Consolas" w:hAnsi="Consolas"/>
+          <w:sz w:val="18"/>
+        </w:rPr>
+        <w:t>계정을</w:t>
+      </w:r>
+      <w:r>
+        <w:rPr>
+          <w:rFonts w:ascii="Consolas" w:hAnsi="Consolas"/>
+          <w:sz w:val="18"/>
+        </w:rPr>
+        <w:t xml:space="preserve"> </w:t>
+      </w:r>
+      <w:r>
+        <w:rPr>
+          <w:rFonts w:ascii="Consolas" w:hAnsi="Consolas"/>
+          <w:sz w:val="18"/>
+        </w:rPr>
+        <w:t>일정</w:t>
+      </w:r>
+      <w:r>
+        <w:rPr>
+          <w:rFonts w:ascii="Consolas" w:hAnsi="Consolas"/>
+          <w:sz w:val="18"/>
+        </w:rPr>
+        <w:t xml:space="preserve"> </w:t>
+      </w:r>
+      <w:r>
+        <w:rPr>
+          <w:rFonts w:ascii="Consolas" w:hAnsi="Consolas"/>
+          <w:sz w:val="18"/>
+        </w:rPr>
+        <w:t>시간</w:t>
+      </w:r>
+      <w:r>
+        <w:rPr>
+          <w:rFonts w:ascii="Consolas" w:hAnsi="Consolas"/>
+          <w:sz w:val="18"/>
+        </w:rPr>
+        <w:t xml:space="preserve"> </w:t>
+      </w:r>
+      <w:r>
+        <w:rPr>
+          <w:rFonts w:ascii="Consolas" w:hAnsi="Consolas"/>
+          <w:sz w:val="18"/>
+        </w:rPr>
+        <w:t>잠근다</w:t>
+      </w:r>
+      <w:r>
+        <w:rPr>
+          <w:rFonts w:ascii="Consolas" w:hAnsi="Consolas"/>
+          <w:sz w:val="18"/>
+        </w:rPr>
+        <w:t>.</w:t>
       </w:r>
       <w:r>
         <w:br/>
@@ -1199,7 +2750,70 @@
           <w:rFonts w:ascii="Consolas" w:hAnsi="Consolas"/>
           <w:sz w:val="18"/>
         </w:rPr>
-        <w:t xml:space="preserve"># 잠금 시간 ( 초 ) - 300초 = 5분</w:t>
+        <w:t xml:space="preserve"># </w:t>
+      </w:r>
+      <w:r>
+        <w:rPr>
+          <w:rFonts w:ascii="Consolas" w:hAnsi="Consolas"/>
+          <w:sz w:val="18"/>
+        </w:rPr>
+        <w:t>잠금</w:t>
+      </w:r>
+      <w:r>
+        <w:rPr>
+          <w:rFonts w:ascii="Consolas" w:hAnsi="Consolas"/>
+          <w:sz w:val="18"/>
+        </w:rPr>
+        <w:t xml:space="preserve"> </w:t>
+      </w:r>
+      <w:r>
+        <w:rPr>
+          <w:rFonts w:ascii="Consolas" w:hAnsi="Consolas"/>
+          <w:sz w:val="18"/>
+        </w:rPr>
+        <w:t>시간</w:t>
+      </w:r>
+      <w:r>
+        <w:rPr>
+          <w:rFonts w:ascii="Consolas" w:hAnsi="Consolas"/>
+          <w:sz w:val="18"/>
+        </w:rPr>
+        <w:t xml:space="preserve"> ( </w:t>
+      </w:r>
+      <w:r>
+        <w:rPr>
+          <w:rFonts w:ascii="Consolas" w:hAnsi="Consolas"/>
+          <w:sz w:val="18"/>
+        </w:rPr>
+        <w:t>초</w:t>
+      </w:r>
+      <w:r>
+        <w:rPr>
+          <w:rFonts w:ascii="Consolas" w:hAnsi="Consolas"/>
+          <w:sz w:val="18"/>
+        </w:rPr>
+        <w:t xml:space="preserve"> ) - 300</w:t>
+      </w:r>
+      <w:r>
+        <w:rPr>
+          <w:rFonts w:ascii="Consolas" w:hAnsi="Consolas"/>
+          <w:sz w:val="18"/>
+        </w:rPr>
+        <w:t>초</w:t>
+      </w:r>
+      <w:r>
+        <w:rPr>
+          <w:rFonts w:ascii="Consolas" w:hAnsi="Consolas"/>
+          <w:sz w:val="18"/>
+        </w:rPr>
+        <w:t xml:space="preserve"> = 5</w:t>
+      </w:r>
+      <w:r>
+        <w:rPr>
+          <w:rFonts w:ascii="Consolas" w:hAnsi="Consolas"/>
+          <w:sz w:val="18"/>
+        </w:rPr>
+        <w:t>분</w:t>
       </w:r>
       <w:r>
         <w:br/>
@@ -1359,14 +2973,30 @@
           <w:color w:val="000000" w:themeColor="text1"/>
           <w:lang w:eastAsia="ko-KR"/>
         </w:rPr>
+        <w:t xml:space="preserve">을 </w:t>
+      </w:r>
+      <w:r>
+        <w:rPr>
+          <w:rFonts w:hint="eastAsia"/>
+          <w:color w:val="000000" w:themeColor="text1"/>
+          <w:lang w:eastAsia="ko-KR"/>
+        </w:rPr>
         <w:t>처리</w:t>
       </w:r>
       <w:r>
         <w:rPr>
+          <w:rFonts w:hint="eastAsia"/>
           <w:color w:val="000000" w:themeColor="text1"/>
           <w:lang w:eastAsia="ko-KR"/>
         </w:rPr>
-        <w:t xml:space="preserve"> 실패/성공 이후 두 경로의 공통 지점으로 위치를 옮겼다.</w:t>
+        <w:t>하기 위해</w:t>
+      </w:r>
+      <w:r>
+        <w:rPr>
+          <w:color w:val="000000" w:themeColor="text1"/>
+          <w:lang w:eastAsia="ko-KR"/>
+        </w:rPr>
+        <w:t xml:space="preserve"> 두 경로의 공통 지점으로 위치를 옮겼다.</w:t>
       </w:r>
     </w:p>
     <w:p>
@@ -1387,7 +3017,7 @@
     </w:p>
     <w:tbl>
       <w:tblPr>
-        <w:tblW w:w="0" w:type="auto"/>
+        <w:tblW w:w="9216" w:type="dxa"/>
         <w:tblBorders>
           <w:top w:val="single" w:sz="4" w:space="0" w:color="BFBFBF"/>
           <w:left w:val="single" w:sz="4" w:space="0" w:color="BFBFBF"/>
@@ -1400,14 +3030,14 @@
         <w:tblLook w:val="04A0" w:firstRow="1" w:lastRow="0" w:firstColumn="1" w:lastColumn="0" w:noHBand="0" w:noVBand="1"/>
       </w:tblPr>
       <w:tblGrid>
-        <w:gridCol w:w="2304"/>
-        <w:gridCol w:w="1152"/>
-        <w:gridCol w:w="5760"/>
+        <w:gridCol w:w="2518"/>
+        <w:gridCol w:w="1134"/>
+        <w:gridCol w:w="5564"/>
       </w:tblGrid>
       <w:tr>
         <w:tc>
           <w:tcPr>
-            <w:tcW w:w="2304" w:type="dxa"/>
+            <w:tcW w:w="2518" w:type="dxa"/>
             <w:shd w:val="clear" w:color="auto" w:fill="2E5496"/>
           </w:tcPr>
           <w:p>
@@ -1423,7 +3053,7 @@
         </w:tc>
         <w:tc>
           <w:tcPr>
-            <w:tcW w:w="1152" w:type="dxa"/>
+            <w:tcW w:w="1134" w:type="dxa"/>
             <w:shd w:val="clear" w:color="auto" w:fill="2E5496"/>
           </w:tcPr>
           <w:p>
@@ -1439,7 +3069,7 @@
         </w:tc>
         <w:tc>
           <w:tcPr>
-            <w:tcW w:w="5760" w:type="dxa"/>
+            <w:tcW w:w="5564" w:type="dxa"/>
             <w:shd w:val="clear" w:color="auto" w:fill="2E5496"/>
           </w:tcPr>
           <w:p>
@@ -1457,7 +3087,7 @@
       <w:tr>
         <w:tc>
           <w:tcPr>
-            <w:tcW w:w="2304" w:type="dxa"/>
+            <w:tcW w:w="2518" w:type="dxa"/>
           </w:tcPr>
           <w:p>
             <w:r>
@@ -1470,7 +3100,7 @@
         </w:tc>
         <w:tc>
           <w:tcPr>
-            <w:tcW w:w="1152" w:type="dxa"/>
+            <w:tcW w:w="1134" w:type="dxa"/>
           </w:tcPr>
           <w:p>
             <w:r>
@@ -1483,7 +3113,7 @@
         </w:tc>
         <w:tc>
           <w:tcPr>
-            <w:tcW w:w="5760" w:type="dxa"/>
+            <w:tcW w:w="5564" w:type="dxa"/>
           </w:tcPr>
           <w:p>
             <w:r>
@@ -1498,7 +3128,7 @@
       <w:tr>
         <w:tc>
           <w:tcPr>
-            <w:tcW w:w="2304" w:type="dxa"/>
+            <w:tcW w:w="2518" w:type="dxa"/>
           </w:tcPr>
           <w:p>
             <w:r>
@@ -1511,7 +3141,7 @@
         </w:tc>
         <w:tc>
           <w:tcPr>
-            <w:tcW w:w="1152" w:type="dxa"/>
+            <w:tcW w:w="1134" w:type="dxa"/>
           </w:tcPr>
           <w:p>
             <w:r>
@@ -1524,7 +3154,7 @@
         </w:tc>
         <w:tc>
           <w:tcPr>
-            <w:tcW w:w="5760" w:type="dxa"/>
+            <w:tcW w:w="5564" w:type="dxa"/>
           </w:tcPr>
           <w:p>
             <w:r>
@@ -1539,7 +3169,7 @@
       <w:tr>
         <w:tc>
           <w:tcPr>
-            <w:tcW w:w="2304" w:type="dxa"/>
+            <w:tcW w:w="2518" w:type="dxa"/>
           </w:tcPr>
           <w:p>
             <w:r>
@@ -1552,7 +3182,7 @@
         </w:tc>
         <w:tc>
           <w:tcPr>
-            <w:tcW w:w="1152" w:type="dxa"/>
+            <w:tcW w:w="1134" w:type="dxa"/>
           </w:tcPr>
           <w:p>
             <w:r>
@@ -1565,7 +3195,7 @@
         </w:tc>
         <w:tc>
           <w:tcPr>
-            <w:tcW w:w="5760" w:type="dxa"/>
+            <w:tcW w:w="5564" w:type="dxa"/>
           </w:tcPr>
           <w:p>
             <w:pPr>
@@ -1586,7 +3216,7 @@
       <w:tr>
         <w:tc>
           <w:tcPr>
-            <w:tcW w:w="2304" w:type="dxa"/>
+            <w:tcW w:w="2518" w:type="dxa"/>
           </w:tcPr>
           <w:p>
             <w:r>
@@ -1599,7 +3229,7 @@
         </w:tc>
         <w:tc>
           <w:tcPr>
-            <w:tcW w:w="1152" w:type="dxa"/>
+            <w:tcW w:w="1134" w:type="dxa"/>
           </w:tcPr>
           <w:p>
             <w:r>
@@ -1612,7 +3242,7 @@
         </w:tc>
         <w:tc>
           <w:tcPr>
-            <w:tcW w:w="5760" w:type="dxa"/>
+            <w:tcW w:w="5564" w:type="dxa"/>
           </w:tcPr>
           <w:p>
             <w:r>
@@ -1627,7 +3257,7 @@
       <w:tr>
         <w:tc>
           <w:tcPr>
-            <w:tcW w:w="2304" w:type="dxa"/>
+            <w:tcW w:w="2518" w:type="dxa"/>
           </w:tcPr>
           <w:p>
             <w:r>
@@ -1640,7 +3270,7 @@
         </w:tc>
         <w:tc>
           <w:tcPr>
-            <w:tcW w:w="1152" w:type="dxa"/>
+            <w:tcW w:w="1134" w:type="dxa"/>
           </w:tcPr>
           <w:p>
             <w:r>
@@ -1653,7 +3283,7 @@
         </w:tc>
         <w:tc>
           <w:tcPr>
-            <w:tcW w:w="5760" w:type="dxa"/>
+            <w:tcW w:w="5564" w:type="dxa"/>
           </w:tcPr>
           <w:p>
             <w:r>
@@ -1668,7 +3298,7 @@
       <w:tr>
         <w:tc>
           <w:tcPr>
-            <w:tcW w:w="2304" w:type="dxa"/>
+            <w:tcW w:w="2518" w:type="dxa"/>
           </w:tcPr>
           <w:p>
             <w:r>
@@ -1681,7 +3311,7 @@
         </w:tc>
         <w:tc>
           <w:tcPr>
-            <w:tcW w:w="1152" w:type="dxa"/>
+            <w:tcW w:w="1134" w:type="dxa"/>
           </w:tcPr>
           <w:p>
             <w:r>
@@ -1694,14 +3324,28 @@
         </w:tc>
         <w:tc>
           <w:tcPr>
-            <w:tcW w:w="5760" w:type="dxa"/>
+            <w:tcW w:w="5564" w:type="dxa"/>
           </w:tcPr>
+          <w:p>
+            <w:pPr>
+              <w:spacing w:after="0"/>
+              <w:rPr>
+                <w:sz w:val="18"/>
+              </w:rPr>
+            </w:pPr>
+            <w:r>
+              <w:rPr>
+                <w:sz w:val="18"/>
+              </w:rPr>
+              <w:t xml:space="preserve">onAuthenticationSuccess/onAuthenticationFailure 에서 LoginAttemptService.onSuccess/onFailure 호출 </w:t>
+            </w:r>
+          </w:p>
           <w:p>
             <w:r>
               <w:rPr>
                 <w:sz w:val="18"/>
               </w:rPr>
-              <w:t>onAuthenticationSuccess/onAuthenticationFailure 에서 LoginAttemptService.onSuccess/onFailure 호출 (LockedException 은 제외)</w:t>
+              <w:t>(LockedException 은 제외)</w:t>
             </w:r>
           </w:p>
         </w:tc>
@@ -1777,9 +3421,22 @@
       </w:pPr>
       <w:r>
         <w:rPr>
-          <w:lang w:eastAsia="ko-KR"/>
-        </w:rPr>
-        <w:t>폼 로그인</w:t>
+          <w:rFonts w:hint="eastAsia"/>
+          <w:lang w:eastAsia="ko-KR"/>
+        </w:rPr>
+        <w:t>F</w:t>
+      </w:r>
+      <w:r>
+        <w:rPr>
+          <w:lang w:eastAsia="ko-KR"/>
+        </w:rPr>
+        <w:t>rom</w:t>
+      </w:r>
+      <w:r>
+        <w:rPr>
+          <w:lang w:eastAsia="ko-KR"/>
+        </w:rPr>
+        <w:t xml:space="preserve"> 로그인</w:t>
       </w:r>
       <w:r>
         <w:rPr>
@@ -1834,7 +3491,133 @@
           <w:rFonts w:ascii="Consolas" w:hAnsi="Consolas"/>
           <w:sz w:val="18"/>
         </w:rPr>
-        <w:t xml:space="preserve">// DaoAuthenticationProvider 가 비밀번호 검증 전에 호출하는 지점이라 폼/REST 공통으로 거친다.</w:t>
+        <w:t xml:space="preserve">// DaoAuthenticationProvider </w:t>
+      </w:r>
+      <w:r>
+        <w:rPr>
+          <w:rFonts w:ascii="Consolas" w:hAnsi="Consolas"/>
+          <w:sz w:val="18"/>
+        </w:rPr>
+        <w:t>가</w:t>
+      </w:r>
+      <w:r>
+        <w:rPr>
+          <w:rFonts w:ascii="Consolas" w:hAnsi="Consolas"/>
+          <w:sz w:val="18"/>
+        </w:rPr>
+        <w:t xml:space="preserve"> </w:t>
+      </w:r>
+      <w:r>
+        <w:rPr>
+          <w:rFonts w:ascii="Consolas" w:hAnsi="Consolas"/>
+          <w:sz w:val="18"/>
+        </w:rPr>
+        <w:t>비밀번호</w:t>
+      </w:r>
+      <w:r>
+        <w:rPr>
+          <w:rFonts w:ascii="Consolas" w:hAnsi="Consolas"/>
+          <w:sz w:val="18"/>
+        </w:rPr>
+        <w:t xml:space="preserve"> </w:t>
+      </w:r>
+      <w:r>
+        <w:rPr>
+          <w:rFonts w:ascii="Consolas" w:hAnsi="Consolas"/>
+          <w:sz w:val="18"/>
+        </w:rPr>
+        <w:t>검증</w:t>
+      </w:r>
+      <w:r>
+        <w:rPr>
+          <w:rFonts w:ascii="Consolas" w:hAnsi="Consolas"/>
+          <w:sz w:val="18"/>
+        </w:rPr>
+        <w:t xml:space="preserve"> </w:t>
+      </w:r>
+      <w:r>
+        <w:rPr>
+          <w:rFonts w:ascii="Consolas" w:hAnsi="Consolas"/>
+          <w:sz w:val="18"/>
+        </w:rPr>
+        <w:t>전에</w:t>
+      </w:r>
+      <w:r>
+        <w:rPr>
+          <w:rFonts w:ascii="Consolas" w:hAnsi="Consolas"/>
+          <w:sz w:val="18"/>
+        </w:rPr>
+        <w:t xml:space="preserve"> </w:t>
+      </w:r>
+      <w:r>
+        <w:rPr>
+          <w:rFonts w:ascii="Consolas" w:hAnsi="Consolas"/>
+          <w:sz w:val="18"/>
+        </w:rPr>
+        <w:t>호출하는</w:t>
+      </w:r>
+      <w:r>
+        <w:rPr>
+          <w:rFonts w:ascii="Consolas" w:hAnsi="Consolas"/>
+          <w:sz w:val="18"/>
+        </w:rPr>
+        <w:t xml:space="preserve"> </w:t>
+      </w:r>
+      <w:r>
+        <w:rPr>
+          <w:rFonts w:ascii="Consolas" w:hAnsi="Consolas"/>
+          <w:sz w:val="18"/>
+        </w:rPr>
+        <w:t>지점이라</w:t>
+      </w:r>
+      <w:r>
+        <w:rPr>
+          <w:rFonts w:ascii="Consolas" w:hAnsi="Consolas"/>
+          <w:sz w:val="18"/>
+        </w:rPr>
+        <w:t xml:space="preserve"> </w:t>
+      </w:r>
+      <w:r>
+        <w:rPr>
+          <w:rFonts w:ascii="Consolas" w:hAnsi="Consolas"/>
+          <w:sz w:val="18"/>
+        </w:rPr>
+        <w:t>폼</w:t>
+      </w:r>
+      <w:r>
+        <w:rPr>
+          <w:rFonts w:ascii="Consolas" w:hAnsi="Consolas"/>
+          <w:sz w:val="18"/>
+        </w:rPr>
+        <w:t xml:space="preserve">/REST </w:t>
+      </w:r>
+      <w:r>
+        <w:rPr>
+          <w:rFonts w:ascii="Consolas" w:hAnsi="Consolas"/>
+          <w:sz w:val="18"/>
+        </w:rPr>
+        <w:t>공통으로</w:t>
+      </w:r>
+      <w:r>
+        <w:rPr>
+          <w:rFonts w:ascii="Consolas" w:hAnsi="Consolas"/>
+          <w:sz w:val="18"/>
+        </w:rPr>
+        <w:t xml:space="preserve"> </w:t>
+      </w:r>
+      <w:r>
+        <w:rPr>
+          <w:rFonts w:ascii="Consolas" w:hAnsi="Consolas"/>
+          <w:sz w:val="18"/>
+        </w:rPr>
+        <w:t>거친다</w:t>
+      </w:r>
+      <w:r>
+        <w:rPr>
+          <w:rFonts w:ascii="Consolas" w:hAnsi="Consolas"/>
+          <w:sz w:val="18"/>
+        </w:rPr>
+        <w:t>.</w:t>
       </w:r>
       <w:r>
         <w:br/>
@@ -1903,7 +3686,84 @@
           <w:rFonts w:ascii="Consolas" w:hAnsi="Consolas"/>
           <w:sz w:val="18"/>
         </w:rPr>
-        <w:t xml:space="preserve">// SecurityAuditListener - 두 로그인 경로 모두 AuthenticationManager 가 발행하는</w:t>
+        <w:t xml:space="preserve">// SecurityAuditListener - </w:t>
+      </w:r>
+      <w:r>
+        <w:rPr>
+          <w:rFonts w:ascii="Consolas" w:hAnsi="Consolas"/>
+          <w:sz w:val="18"/>
+        </w:rPr>
+        <w:t>두</w:t>
+      </w:r>
+      <w:r>
+        <w:rPr>
+          <w:rFonts w:ascii="Consolas" w:hAnsi="Consolas"/>
+          <w:sz w:val="18"/>
+        </w:rPr>
+        <w:t xml:space="preserve"> </w:t>
+      </w:r>
+      <w:r>
+        <w:rPr>
+          <w:rFonts w:ascii="Consolas" w:hAnsi="Consolas"/>
+          <w:sz w:val="18"/>
+        </w:rPr>
+        <w:t>로그인</w:t>
+      </w:r>
+      <w:r>
+        <w:rPr>
+          <w:rFonts w:ascii="Consolas" w:hAnsi="Consolas"/>
+          <w:sz w:val="18"/>
+        </w:rPr>
+        <w:t xml:space="preserve"> </w:t>
+      </w:r>
+      <w:r>
+        <w:rPr>
+          <w:rFonts w:ascii="Consolas" w:hAnsi="Consolas"/>
+          <w:sz w:val="18"/>
+        </w:rPr>
+        <w:t>경로</w:t>
+      </w:r>
+      <w:r>
+        <w:rPr>
+          <w:rFonts w:ascii="Consolas" w:hAnsi="Consolas"/>
+          <w:sz w:val="18"/>
+        </w:rPr>
+        <w:t xml:space="preserve"> </w:t>
+      </w:r>
+      <w:r>
+        <w:rPr>
+          <w:rFonts w:ascii="Consolas" w:hAnsi="Consolas"/>
+          <w:sz w:val="18"/>
+        </w:rPr>
+        <w:t>모두</w:t>
+      </w:r>
+      <w:r>
+        <w:rPr>
+          <w:rFonts w:ascii="Consolas" w:hAnsi="Consolas"/>
+          <w:sz w:val="18"/>
+        </w:rPr>
+        <w:t xml:space="preserve"> AuthenticationManager </w:t>
+      </w:r>
+      <w:r>
+        <w:rPr>
+          <w:rFonts w:ascii="Consolas" w:hAnsi="Consolas"/>
+          <w:sz w:val="18"/>
+        </w:rPr>
+        <w:t>가</w:t>
+      </w:r>
+      <w:r>
+        <w:rPr>
+          <w:rFonts w:ascii="Consolas" w:hAnsi="Consolas"/>
+          <w:sz w:val="18"/>
+        </w:rPr>
+        <w:t xml:space="preserve"> </w:t>
+      </w:r>
+      <w:r>
+        <w:rPr>
+          <w:rFonts w:ascii="Consolas" w:hAnsi="Consolas"/>
+          <w:sz w:val="18"/>
+        </w:rPr>
+        <w:t>발행하는</w:t>
       </w:r>
       <w:r>
         <w:br/>
@@ -1913,7 +3773,77 @@
           <w:rFonts w:ascii="Consolas" w:hAnsi="Consolas"/>
           <w:sz w:val="18"/>
         </w:rPr>
-        <w:t xml:space="preserve">// 이벤트를 공통으로 받는 지점이다(04_Logging_Hardening.md 2-1 참고).</w:t>
+        <w:t xml:space="preserve">// </w:t>
+      </w:r>
+      <w:r>
+        <w:rPr>
+          <w:rFonts w:ascii="Consolas" w:hAnsi="Consolas"/>
+          <w:sz w:val="18"/>
+        </w:rPr>
+        <w:t>이벤트를</w:t>
+      </w:r>
+      <w:r>
+        <w:rPr>
+          <w:rFonts w:ascii="Consolas" w:hAnsi="Consolas"/>
+          <w:sz w:val="18"/>
+        </w:rPr>
+        <w:t xml:space="preserve"> </w:t>
+      </w:r>
+      <w:r>
+        <w:rPr>
+          <w:rFonts w:ascii="Consolas" w:hAnsi="Consolas"/>
+          <w:sz w:val="18"/>
+        </w:rPr>
+        <w:t>공통으로</w:t>
+      </w:r>
+      <w:r>
+        <w:rPr>
+          <w:rFonts w:ascii="Consolas" w:hAnsi="Consolas"/>
+          <w:sz w:val="18"/>
+        </w:rPr>
+        <w:t xml:space="preserve"> </w:t>
+      </w:r>
+      <w:r>
+        <w:rPr>
+          <w:rFonts w:ascii="Consolas" w:hAnsi="Consolas"/>
+          <w:sz w:val="18"/>
+        </w:rPr>
+        <w:t>받는</w:t>
+      </w:r>
+      <w:r>
+        <w:rPr>
+          <w:rFonts w:ascii="Consolas" w:hAnsi="Consolas"/>
+          <w:sz w:val="18"/>
+        </w:rPr>
+        <w:t xml:space="preserve"> </w:t>
+      </w:r>
+      <w:r>
+        <w:rPr>
+          <w:rFonts w:ascii="Consolas" w:hAnsi="Consolas"/>
+          <w:sz w:val="18"/>
+        </w:rPr>
+        <w:t>지점이다</w:t>
+      </w:r>
+      <w:r>
+        <w:rPr>
+          <w:rFonts w:ascii="Consolas" w:hAnsi="Consolas"/>
+          <w:sz w:val="18"/>
+        </w:rPr>
+        <w:t xml:space="preserve">(04_Logging_Hardening.md 2-1 </w:t>
+      </w:r>
+      <w:r>
+        <w:rPr>
+          <w:rFonts w:ascii="Consolas" w:hAnsi="Consolas"/>
+          <w:sz w:val="18"/>
+        </w:rPr>
+        <w:t>참고</w:t>
+      </w:r>
+      <w:r>
+        <w:rPr>
+          <w:rFonts w:ascii="Consolas" w:hAnsi="Consolas"/>
+          <w:sz w:val="18"/>
+        </w:rPr>
+        <w:t>).</w:t>
       </w:r>
       <w:r>
         <w:br/>
@@ -1927,6 +3857,8 @@
       </w:r>
       <w:r>
         <w:br/>
+      </w:r>
+      <w:r>
         <w:br/>
       </w:r>
       <w:r>
@@ -2156,6 +4088,11 @@
                 <w:sz w:val="18"/>
               </w:rPr>
               <w:t xml:space="preserve">POST /login-process (틀린 비밀번호, CSRF 토큰 포함) -&gt; 302 </w:t>
+            </w:r>
+            <w:r>
+              <w:rPr>
+                <w:sz w:val="18"/>
+              </w:rPr>
               <w:lastRenderedPageBreak/>
               <w:t>/login?error</w:t>
             </w:r>
@@ -2249,7 +4186,98 @@
           <w:rFonts w:ascii="Consolas" w:hAnsi="Consolas"/>
           <w:sz w:val="18"/>
         </w:rPr>
-        <w:t xml:space="preserve"># 같은 계정에 틀린 비밀번호로 5회 연속 요청</w:t>
+        <w:t xml:space="preserve"># </w:t>
+      </w:r>
+      <w:r>
+        <w:rPr>
+          <w:rFonts w:ascii="Consolas" w:hAnsi="Consolas"/>
+          <w:sz w:val="18"/>
+        </w:rPr>
+        <w:t>같은</w:t>
+      </w:r>
+      <w:r>
+        <w:rPr>
+          <w:rFonts w:ascii="Consolas" w:hAnsi="Consolas"/>
+          <w:sz w:val="18"/>
+        </w:rPr>
+        <w:t xml:space="preserve"> </w:t>
+      </w:r>
+      <w:r>
+        <w:rPr>
+          <w:rFonts w:ascii="Consolas" w:hAnsi="Consolas"/>
+          <w:sz w:val="18"/>
+        </w:rPr>
+        <w:t>계정에</w:t>
+      </w:r>
+      <w:r>
+        <w:rPr>
+          <w:rFonts w:ascii="Consolas" w:hAnsi="Consolas"/>
+          <w:sz w:val="18"/>
+        </w:rPr>
+        <w:t xml:space="preserve"> </w:t>
+      </w:r>
+      <w:r>
+        <w:rPr>
+          <w:rFonts w:ascii="Consolas" w:hAnsi="Consolas"/>
+          <w:sz w:val="18"/>
+        </w:rPr>
+        <w:t>틀린</w:t>
+      </w:r>
+      <w:r>
+        <w:rPr>
+          <w:rFonts w:ascii="Consolas" w:hAnsi="Consolas"/>
+          <w:sz w:val="18"/>
+        </w:rPr>
+        <w:t xml:space="preserve"> </w:t>
+      </w:r>
+      <w:r>
+        <w:rPr>
+          <w:rFonts w:ascii="Consolas" w:hAnsi="Consolas"/>
+          <w:sz w:val="18"/>
+        </w:rPr>
+        <w:t>비밀번호로</w:t>
+      </w:r>
+      <w:r>
+        <w:rPr>
+          <w:rFonts w:ascii="Consolas" w:hAnsi="Consolas"/>
+          <w:sz w:val="18"/>
+        </w:rPr>
+        <w:t xml:space="preserve"> 5</w:t>
+      </w:r>
+      <w:r>
+        <w:rPr>
+          <w:rFonts w:ascii="Consolas" w:hAnsi="Consolas"/>
+          <w:sz w:val="18"/>
+        </w:rPr>
+        <w:t>회</w:t>
+      </w:r>
+      <w:r>
+        <w:rPr>
+          <w:rFonts w:ascii="Consolas" w:hAnsi="Consolas"/>
+          <w:sz w:val="18"/>
+        </w:rPr>
+        <w:t xml:space="preserve"> </w:t>
+      </w:r>
+      <w:r>
+        <w:rPr>
+          <w:rFonts w:ascii="Consolas" w:hAnsi="Consolas"/>
+          <w:sz w:val="18"/>
+        </w:rPr>
+        <w:t>연속</w:t>
+      </w:r>
+      <w:r>
+        <w:rPr>
+          <w:rFonts w:ascii="Consolas" w:hAnsi="Consolas"/>
+          <w:sz w:val="18"/>
+        </w:rPr>
+        <w:t xml:space="preserve"> </w:t>
+      </w:r>
+      <w:r>
+        <w:rPr>
+          <w:rFonts w:ascii="Consolas" w:hAnsi="Consolas"/>
+          <w:sz w:val="18"/>
+        </w:rPr>
+        <w:t>요청</w:t>
       </w:r>
       <w:r>
         <w:br/>
@@ -2490,15 +4518,14 @@
       <w:pPr>
         <w:spacing w:after="90" w:line="240" w:lineRule="auto"/>
         <w:rPr>
-          <w:rFonts w:hint="eastAsia"/>
-          <w:lang w:eastAsia="ko-KR"/>
-        </w:rPr>
-      </w:pPr>
-      <w:r>
-        <w:rPr>
-          <w:lang w:eastAsia="ko-KR"/>
-        </w:rPr>
-        <w:t xml:space="preserve">로그인 성공(올바른 비밀번호) 후 다시 틀린 비밀번호를 시도하면, 카운트가 0부터 다시 쌓</w:t>
+          <w:lang w:eastAsia="ko-KR"/>
+        </w:rPr>
+      </w:pPr>
+      <w:r>
+        <w:rPr>
+          <w:lang w:eastAsia="ko-KR"/>
+        </w:rPr>
+        <w:t>로그인 성공(올바른 비밀번호) 후 다시 틀린 비밀번호를 시도하면, 카운트가 0부터 다시 쌓</w:t>
       </w:r>
       <w:r>
         <w:rPr>
@@ -2516,18 +4543,273 @@
     </w:p>
     <w:p>
       <w:pPr>
+        <w:rPr>
+          <w:lang w:eastAsia="ko-KR"/>
+        </w:rPr>
+      </w:pPr>
+      <w:r>
+        <w:rPr>
+          <w:lang w:eastAsia="ko-KR"/>
+        </w:rPr>
+        <w:br w:type="page"/>
+      </w:r>
+    </w:p>
+    <w:p>
+      <w:pPr>
         <w:pStyle w:val="21"/>
         <w:spacing w:before="240" w:after="100"/>
-      </w:pPr>
-      <w:r>
         <w:rPr>
           <w:color w:val="2E5496"/>
         </w:rPr>
+      </w:pPr>
+      <w:r>
+        <w:rPr>
+          <w:color w:val="2E5496"/>
+        </w:rPr>
+        <w:lastRenderedPageBreak/>
         <w:t>3-2. Burp Suite Intruder로 자동화 재현</w:t>
       </w:r>
     </w:p>
     <w:p>
       <w:pPr>
+        <w:pStyle w:val="aa"/>
+        <w:numPr>
+          <w:ilvl w:val="0"/>
+          <w:numId w:val="12"/>
+        </w:numPr>
+        <w:rPr>
+          <w:b/>
+          <w:lang w:eastAsia="ko-KR"/>
+        </w:rPr>
+      </w:pPr>
+      <w:r>
+        <w:rPr>
+          <w:b/>
+        </w:rPr>
+        <w:t xml:space="preserve">Burp Suite </w:t>
+      </w:r>
+      <w:r>
+        <w:rPr>
+          <w:rFonts w:hint="eastAsia"/>
+          <w:b/>
+          <w:lang w:eastAsia="ko-KR"/>
+        </w:rPr>
+        <w:t>B</w:t>
+      </w:r>
+      <w:r>
+        <w:rPr>
+          <w:b/>
+          <w:lang w:eastAsia="ko-KR"/>
+        </w:rPr>
+        <w:t xml:space="preserve">rowser </w:t>
+      </w:r>
+      <w:r>
+        <w:rPr>
+          <w:rFonts w:hint="eastAsia"/>
+          <w:b/>
+          <w:lang w:eastAsia="ko-KR"/>
+        </w:rPr>
+        <w:t xml:space="preserve">열기 </w:t>
+      </w:r>
+    </w:p>
+    <w:p>
+      <w:pPr>
+        <w:spacing w:after="90"/>
+        <w:ind w:firstLineChars="200" w:firstLine="440"/>
+        <w:rPr>
+          <w:b/>
+          <w:lang w:eastAsia="ko-KR"/>
+        </w:rPr>
+      </w:pPr>
+      <w:r>
+        <w:rPr>
+          <w:b/>
+          <w:lang w:eastAsia="ko-KR"/>
+        </w:rPr>
+        <w:t xml:space="preserve">Browser </w:t>
+      </w:r>
+      <w:r>
+        <w:rPr>
+          <w:rFonts w:hint="eastAsia"/>
+          <w:b/>
+          <w:lang w:eastAsia="ko-KR"/>
+        </w:rPr>
+        <w:t xml:space="preserve">에서 </w:t>
+      </w:r>
+      <w:r>
+        <w:rPr>
+          <w:b/>
+          <w:lang w:eastAsia="ko-KR"/>
+        </w:rPr>
+        <w:t xml:space="preserve"> </w:t>
+      </w:r>
+      <w:hyperlink r:id="rId8" w:history="1">
+        <w:r>
+          <w:rPr>
+            <w:rStyle w:val="aff1"/>
+            <w:b/>
+            <w:lang w:eastAsia="ko-KR"/>
+          </w:rPr>
+          <w:t>http://localhost:8080</w:t>
+        </w:r>
+      </w:hyperlink>
+    </w:p>
+    <w:p>
+      <w:pPr>
+        <w:ind w:left="360"/>
+        <w:rPr>
+          <w:b/>
+          <w:lang w:eastAsia="ko-KR"/>
+        </w:rPr>
+      </w:pPr>
+      <w:r>
+        <w:rPr>
+          <w:rFonts w:hint="eastAsia"/>
+          <w:b/>
+          <w:lang w:eastAsia="ko-KR"/>
+        </w:rPr>
+        <w:t>:</w:t>
+      </w:r>
+      <w:r>
+        <w:rPr>
+          <w:b/>
+          <w:lang w:eastAsia="ko-KR"/>
+        </w:rPr>
+        <w:t xml:space="preserve"> </w:t>
+      </w:r>
+      <w:hyperlink r:id="rId9" w:history="1">
+        <w:r>
+          <w:rPr>
+            <w:rStyle w:val="aff1"/>
+            <w:b/>
+            <w:lang w:eastAsia="ko-KR"/>
+          </w:rPr>
+          <w:t>admin@aa.com</w:t>
+        </w:r>
+      </w:hyperlink>
+      <w:r>
+        <w:rPr>
+          <w:b/>
+          <w:lang w:eastAsia="ko-KR"/>
+        </w:rPr>
+        <w:t xml:space="preserve"> / qqqqq ( </w:t>
+      </w:r>
+      <w:r>
+        <w:rPr>
+          <w:rFonts w:hint="eastAsia"/>
+          <w:b/>
+          <w:lang w:eastAsia="ko-KR"/>
+        </w:rPr>
+        <w:t xml:space="preserve">틀린 패스워드로 입력 </w:t>
+      </w:r>
+      <w:r>
+        <w:rPr>
+          <w:b/>
+          <w:lang w:eastAsia="ko-KR"/>
+        </w:rPr>
+        <w:t>)</w:t>
+      </w:r>
+    </w:p>
+    <w:p>
+      <w:pPr>
+        <w:ind w:left="360"/>
+        <w:rPr>
+          <w:lang w:eastAsia="ko-KR"/>
+        </w:rPr>
+      </w:pPr>
+      <w:r>
+        <w:rPr>
+          <w:noProof/>
+          <w:lang w:eastAsia="ko-KR"/>
+        </w:rPr>
+        <w:drawing>
+          <wp:inline distT="0" distB="0" distL="0" distR="0" wp14:anchorId="4C643C24" wp14:editId="3C6417A8">
+            <wp:extent cx="5486400" cy="661035"/>
+            <wp:effectExtent l="0" t="0" r="0" b="5715"/>
+            <wp:docPr id="9" name="그림 9"/>
+            <wp:cNvGraphicFramePr>
+              <a:graphicFrameLocks xmlns:a="http://schemas.openxmlformats.org/drawingml/2006/main" noChangeAspect="1"/>
+            </wp:cNvGraphicFramePr>
+            <a:graphic xmlns:a="http://schemas.openxmlformats.org/drawingml/2006/main">
+              <a:graphicData uri="http://schemas.openxmlformats.org/drawingml/2006/picture">
+                <pic:pic xmlns:pic="http://schemas.openxmlformats.org/drawingml/2006/picture">
+                  <pic:nvPicPr>
+                    <pic:cNvPr id="1" name=""/>
+                    <pic:cNvPicPr/>
+                  </pic:nvPicPr>
+                  <pic:blipFill>
+                    <a:blip r:embed="rId10"/>
+                    <a:stretch>
+                      <a:fillRect/>
+                    </a:stretch>
+                  </pic:blipFill>
+                  <pic:spPr>
+                    <a:xfrm>
+                      <a:off x="0" y="0"/>
+                      <a:ext cx="5486400" cy="661035"/>
+                    </a:xfrm>
+                    <a:prstGeom prst="rect">
+                      <a:avLst/>
+                    </a:prstGeom>
+                  </pic:spPr>
+                </pic:pic>
+              </a:graphicData>
+            </a:graphic>
+          </wp:inline>
+        </w:drawing>
+      </w:r>
+    </w:p>
+    <w:p>
+      <w:pPr>
+        <w:ind w:left="360"/>
+        <w:rPr>
+          <w:lang w:eastAsia="ko-KR"/>
+        </w:rPr>
+      </w:pPr>
+      <w:r>
+        <w:rPr>
+          <w:noProof/>
+          <w:lang w:eastAsia="ko-KR"/>
+        </w:rPr>
+        <w:drawing>
+          <wp:inline distT="0" distB="0" distL="0" distR="0" wp14:anchorId="369C35C1" wp14:editId="21C6F5CC">
+            <wp:extent cx="4433777" cy="2713123"/>
+            <wp:effectExtent l="0" t="0" r="5080" b="0"/>
+            <wp:docPr id="6" name="그림 6"/>
+            <wp:cNvGraphicFramePr>
+              <a:graphicFrameLocks xmlns:a="http://schemas.openxmlformats.org/drawingml/2006/main" noChangeAspect="1"/>
+            </wp:cNvGraphicFramePr>
+            <a:graphic xmlns:a="http://schemas.openxmlformats.org/drawingml/2006/main">
+              <a:graphicData uri="http://schemas.openxmlformats.org/drawingml/2006/picture">
+                <pic:pic xmlns:pic="http://schemas.openxmlformats.org/drawingml/2006/picture">
+                  <pic:nvPicPr>
+                    <pic:cNvPr id="1" name=""/>
+                    <pic:cNvPicPr/>
+                  </pic:nvPicPr>
+                  <pic:blipFill>
+                    <a:blip r:embed="rId11"/>
+                    <a:stretch>
+                      <a:fillRect/>
+                    </a:stretch>
+                  </pic:blipFill>
+                  <pic:spPr>
+                    <a:xfrm>
+                      <a:off x="0" y="0"/>
+                      <a:ext cx="4461672" cy="2730193"/>
+                    </a:xfrm>
+                    <a:prstGeom prst="rect">
+                      <a:avLst/>
+                    </a:prstGeom>
+                  </pic:spPr>
+                </pic:pic>
+              </a:graphicData>
+            </a:graphic>
+          </wp:inline>
+        </w:drawing>
+      </w:r>
+    </w:p>
+    <w:p>
+      <w:pPr>
         <w:spacing w:after="90"/>
         <w:ind w:left="360"/>
       </w:pPr>
@@ -2535,7 +4817,13 @@
         <w:rPr>
           <w:b/>
         </w:rPr>
-        <w:t>1. Proxy</w:t>
+        <w:t xml:space="preserve">2. </w:t>
+      </w:r>
+      <w:r>
+        <w:rPr>
+          <w:b/>
+        </w:rPr>
+        <w:t>Proxy</w:t>
       </w:r>
       <w:r>
         <w:t xml:space="preserve">로 정상 로그인 요청 1건을 가로채서 </w:t>
@@ -2557,61 +4845,115 @@
       </w:pPr>
       <w:r>
         <w:rPr>
-          <w:b/>
-        </w:rPr>
-        <w:t>2. Positions</w:t>
-      </w:r>
-      <w:r>
-        <w:t xml:space="preserve"> 탭: `Attack type = Sniper`, 요청 본문의 `password` 값만 `§...§`로 마킹(`email`은 고정).</w:t>
+          <w:noProof/>
+          <w:lang w:eastAsia="ko-KR"/>
+        </w:rPr>
+        <w:drawing>
+          <wp:inline distT="0" distB="0" distL="0" distR="0" wp14:anchorId="34573FEF" wp14:editId="123C8067">
+            <wp:extent cx="4957675" cy="2488019"/>
+            <wp:effectExtent l="0" t="0" r="0" b="7620"/>
+            <wp:docPr id="7" name="그림 7"/>
+            <wp:cNvGraphicFramePr>
+              <a:graphicFrameLocks xmlns:a="http://schemas.openxmlformats.org/drawingml/2006/main" noChangeAspect="1"/>
+            </wp:cNvGraphicFramePr>
+            <a:graphic xmlns:a="http://schemas.openxmlformats.org/drawingml/2006/main">
+              <a:graphicData uri="http://schemas.openxmlformats.org/drawingml/2006/picture">
+                <pic:pic xmlns:pic="http://schemas.openxmlformats.org/drawingml/2006/picture">
+                  <pic:nvPicPr>
+                    <pic:cNvPr id="1" name=""/>
+                    <pic:cNvPicPr/>
+                  </pic:nvPicPr>
+                  <pic:blipFill>
+                    <a:blip r:embed="rId12"/>
+                    <a:stretch>
+                      <a:fillRect/>
+                    </a:stretch>
+                  </pic:blipFill>
+                  <pic:spPr>
+                    <a:xfrm>
+                      <a:off x="0" y="0"/>
+                      <a:ext cx="4979765" cy="2499105"/>
+                    </a:xfrm>
+                    <a:prstGeom prst="rect">
+                      <a:avLst/>
+                    </a:prstGeom>
+                  </pic:spPr>
+                </pic:pic>
+              </a:graphicData>
+            </a:graphic>
+          </wp:inline>
+        </w:drawing>
       </w:r>
     </w:p>
     <w:p>
       <w:pPr>
         <w:spacing w:after="90"/>
         <w:ind w:left="360"/>
-        <w:rPr>
-          <w:lang w:eastAsia="ko-KR"/>
-        </w:rPr>
       </w:pPr>
       <w:r>
         <w:rPr>
           <w:b/>
-          <w:lang w:eastAsia="ko-KR"/>
         </w:rPr>
         <w:lastRenderedPageBreak/>
-        <w:t>3. Payloads</w:t>
-      </w:r>
-      <w:r>
-        <w:rPr>
-          <w:lang w:eastAsia="ko-KR"/>
-        </w:rPr>
-        <w:t xml:space="preserve"> 탭: 흔한 비밀번호 10~20개(사전 리스트) 또는 `Simple list`로 짧은 후보군 입력.</w:t>
+        <w:t>3</w:t>
+      </w:r>
+      <w:r>
+        <w:rPr>
+          <w:b/>
+        </w:rPr>
+        <w:t>. Positions</w:t>
+      </w:r>
+      <w:r>
+        <w:t xml:space="preserve"> 탭: `Attack type = Sniper`, 요청 본문의 `password` 값만 `§...§`로 마킹(`email`은 고정).</w:t>
       </w:r>
     </w:p>
     <w:p>
       <w:pPr>
         <w:spacing w:after="90"/>
         <w:ind w:left="360"/>
-        <w:rPr>
-          <w:lang w:eastAsia="ko-KR"/>
-        </w:rPr>
-      </w:pPr>
-      <w:bookmarkStart w:id="0" w:name="_GoBack"/>
-      <w:r>
-        <w:rPr>
-          <w:b/>
-          <w:lang w:eastAsia="ko-KR"/>
-        </w:rPr>
-        <w:t>4. Settings(과거 Options) → Grep - Match</w:t>
-      </w:r>
-      <w:r>
-        <w:rPr>
-          <w:lang w:eastAsia="ko-KR"/>
-        </w:rPr>
-        <w:t>에 `잠겼습니다` 문자열을 추가해 두면, 결과 테이블에서 몇 번째 요청부터 잠금 메시지로 바뀌는지 체크박스로 바로 확인된다.</w:t>
+      </w:pPr>
+      <w:r>
+        <w:rPr>
+          <w:noProof/>
+          <w:lang w:eastAsia="ko-KR"/>
+        </w:rPr>
+        <w:drawing>
+          <wp:inline distT="0" distB="0" distL="0" distR="0" wp14:anchorId="1F51CF7A" wp14:editId="392F38A0">
+            <wp:extent cx="5486400" cy="3233420"/>
+            <wp:effectExtent l="0" t="0" r="0" b="5080"/>
+            <wp:docPr id="10" name="그림 10"/>
+            <wp:cNvGraphicFramePr>
+              <a:graphicFrameLocks xmlns:a="http://schemas.openxmlformats.org/drawingml/2006/main" noChangeAspect="1"/>
+            </wp:cNvGraphicFramePr>
+            <a:graphic xmlns:a="http://schemas.openxmlformats.org/drawingml/2006/main">
+              <a:graphicData uri="http://schemas.openxmlformats.org/drawingml/2006/picture">
+                <pic:pic xmlns:pic="http://schemas.openxmlformats.org/drawingml/2006/picture">
+                  <pic:nvPicPr>
+                    <pic:cNvPr id="1" name=""/>
+                    <pic:cNvPicPr/>
+                  </pic:nvPicPr>
+                  <pic:blipFill>
+                    <a:blip r:embed="rId13"/>
+                    <a:stretch>
+                      <a:fillRect/>
+                    </a:stretch>
+                  </pic:blipFill>
+                  <pic:spPr>
+                    <a:xfrm>
+                      <a:off x="0" y="0"/>
+                      <a:ext cx="5486400" cy="3233420"/>
+                    </a:xfrm>
+                    <a:prstGeom prst="rect">
+                      <a:avLst/>
+                    </a:prstGeom>
+                  </pic:spPr>
+                </pic:pic>
+              </a:graphicData>
+            </a:graphic>
+          </wp:inline>
+        </w:drawing>
       </w:r>
     </w:p>
-    <w:bookmarkEnd w:id="0"/>
     <w:p>
       <w:pPr>
         <w:spacing w:after="90"/>
@@ -2625,18 +4967,32 @@
           <w:b/>
           <w:lang w:eastAsia="ko-KR"/>
         </w:rPr>
-        <w:t>5. Start attack</w:t>
-      </w:r>
-      <w:r>
-        <w:rPr>
-          <w:lang w:eastAsia="ko-KR"/>
-        </w:rPr>
-        <w:t xml:space="preserve"> → 결과 테이블의 `Status code`는 전부 401로 동일하지만, 5번째 응답까지는 `잠겼습니다` 컬럼이 비어 있고 6번째부터 체크된다 — 자동화된 공격이라도 서버가 5회 지점에서 차단선을 그었다는 것을 한눈에 확인할 수 있다.</w:t>
+        <w:t>4</w:t>
+      </w:r>
+      <w:r>
+        <w:rPr>
+          <w:b/>
+          <w:lang w:eastAsia="ko-KR"/>
+        </w:rPr>
+        <w:t>. Payloads</w:t>
+      </w:r>
+      <w:r>
+        <w:rPr>
+          <w:lang w:eastAsia="ko-KR"/>
+        </w:rPr>
+        <w:t xml:space="preserve"> 탭: 흔한 비밀번호 10~20개(사전 리스트) 또는 `Simple list`로 짧은 후보군 입력.</w:t>
+      </w:r>
+      <w:r>
+        <w:rPr>
+          <w:lang w:eastAsia="ko-KR"/>
+        </w:rPr>
+        <w:t xml:space="preserve"> ( 12345, password, qwer, admin, test1234 )</w:t>
       </w:r>
     </w:p>
     <w:p>
       <w:pPr>
         <w:spacing w:after="90"/>
+        <w:ind w:left="360"/>
         <w:rPr>
           <w:lang w:eastAsia="ko-KR"/>
         </w:rPr>
@@ -2647,9 +5003,108 @@
           <w:lang w:eastAsia="ko-KR"/>
         </w:rPr>
         <w:drawing>
-          <wp:inline distT="0" distB="0" distL="0" distR="0" wp14:anchorId="37C0A12F" wp14:editId="18206081">
-            <wp:extent cx="5486400" cy="4021455"/>
-            <wp:effectExtent l="0" t="0" r="0" b="0"/>
+          <wp:inline distT="0" distB="0" distL="0" distR="0" wp14:anchorId="47F4F174" wp14:editId="18208850">
+            <wp:extent cx="5486400" cy="3425825"/>
+            <wp:effectExtent l="0" t="0" r="0" b="3175"/>
+            <wp:docPr id="12" name="그림 12"/>
+            <wp:cNvGraphicFramePr>
+              <a:graphicFrameLocks xmlns:a="http://schemas.openxmlformats.org/drawingml/2006/main" noChangeAspect="1"/>
+            </wp:cNvGraphicFramePr>
+            <a:graphic xmlns:a="http://schemas.openxmlformats.org/drawingml/2006/main">
+              <a:graphicData uri="http://schemas.openxmlformats.org/drawingml/2006/picture">
+                <pic:pic xmlns:pic="http://schemas.openxmlformats.org/drawingml/2006/picture">
+                  <pic:nvPicPr>
+                    <pic:cNvPr id="1" name=""/>
+                    <pic:cNvPicPr/>
+                  </pic:nvPicPr>
+                  <pic:blipFill>
+                    <a:blip r:embed="rId14"/>
+                    <a:stretch>
+                      <a:fillRect/>
+                    </a:stretch>
+                  </pic:blipFill>
+                  <pic:spPr>
+                    <a:xfrm>
+                      <a:off x="0" y="0"/>
+                      <a:ext cx="5486400" cy="3425825"/>
+                    </a:xfrm>
+                    <a:prstGeom prst="rect">
+                      <a:avLst/>
+                    </a:prstGeom>
+                  </pic:spPr>
+                </pic:pic>
+              </a:graphicData>
+            </a:graphic>
+          </wp:inline>
+        </w:drawing>
+      </w:r>
+    </w:p>
+    <w:p>
+      <w:pPr>
+        <w:spacing w:after="90"/>
+        <w:ind w:left="360"/>
+        <w:rPr>
+          <w:lang w:eastAsia="ko-KR"/>
+        </w:rPr>
+      </w:pPr>
+      <w:r>
+        <w:rPr>
+          <w:b/>
+          <w:lang w:eastAsia="ko-KR"/>
+        </w:rPr>
+        <w:lastRenderedPageBreak/>
+        <w:t>5</w:t>
+      </w:r>
+      <w:r>
+        <w:rPr>
+          <w:b/>
+          <w:lang w:eastAsia="ko-KR"/>
+        </w:rPr>
+        <w:t>. Settings → Grep - Match</w:t>
+      </w:r>
+      <w:r>
+        <w:rPr>
+          <w:lang w:eastAsia="ko-KR"/>
+        </w:rPr>
+        <w:t>에 `</w:t>
+      </w:r>
+      <w:r>
+        <w:rPr>
+          <w:rFonts w:hint="eastAsia"/>
+          <w:lang w:eastAsia="ko-KR"/>
+        </w:rPr>
+        <w:t>l</w:t>
+      </w:r>
+      <w:r>
+        <w:rPr>
+          <w:lang w:eastAsia="ko-KR"/>
+        </w:rPr>
+        <w:t>ocked</w:t>
+      </w:r>
+      <w:r>
+        <w:rPr>
+          <w:lang w:eastAsia="ko-KR"/>
+        </w:rPr>
+        <w:t>` 문자열을 추가해 두면, 결과 테이블에서 몇 번째 요청부터 잠금 메시지로 바뀌는지 체크박스로 바로 확인된다.</w:t>
+      </w:r>
+    </w:p>
+    <w:p>
+      <w:pPr>
+        <w:spacing w:after="90"/>
+        <w:ind w:left="360"/>
+        <w:rPr>
+          <w:lang w:eastAsia="ko-KR"/>
+        </w:rPr>
+      </w:pPr>
+      <w:r>
+        <w:rPr>
+          <w:noProof/>
+          <w:lang w:eastAsia="ko-KR"/>
+        </w:rPr>
+        <w:drawing>
+          <wp:inline distT="0" distB="0" distL="0" distR="0" wp14:anchorId="4F4F36D2" wp14:editId="46186F5C">
+            <wp:extent cx="5486400" cy="3104515"/>
+            <wp:effectExtent l="0" t="0" r="0" b="635"/>
             <wp:docPr id="1" name="그림 1"/>
             <wp:cNvGraphicFramePr>
               <a:graphicFrameLocks xmlns:a="http://schemas.openxmlformats.org/drawingml/2006/main" noChangeAspect="1"/>
@@ -2662,7 +5117,7 @@
                     <pic:cNvPicPr/>
                   </pic:nvPicPr>
                   <pic:blipFill>
-                    <a:blip r:embed="rId8"/>
+                    <a:blip r:embed="rId15"/>
                     <a:stretch>
                       <a:fillRect/>
                     </a:stretch>
@@ -2670,7 +5125,7 @@
                   <pic:spPr>
                     <a:xfrm>
                       <a:off x="0" y="0"/>
-                      <a:ext cx="5486400" cy="4021455"/>
+                      <a:ext cx="5486400" cy="3104515"/>
                     </a:xfrm>
                     <a:prstGeom prst="rect">
                       <a:avLst/>
@@ -2685,6 +5140,156 @@
     </w:p>
     <w:p>
       <w:pPr>
+        <w:spacing w:after="90"/>
+        <w:ind w:left="360"/>
+        <w:rPr>
+          <w:lang w:eastAsia="ko-KR"/>
+        </w:rPr>
+      </w:pPr>
+      <w:r>
+        <w:rPr>
+          <w:b/>
+          <w:lang w:eastAsia="ko-KR"/>
+        </w:rPr>
+        <w:t>5. Start attack</w:t>
+      </w:r>
+      <w:r>
+        <w:rPr>
+          <w:lang w:eastAsia="ko-KR"/>
+        </w:rPr>
+        <w:t xml:space="preserve"> → 결과 테이블의 `Status code`는 전부 401로 동일</w:t>
+      </w:r>
+      <w:r>
+        <w:rPr>
+          <w:rFonts w:hint="eastAsia"/>
+          <w:lang w:eastAsia="ko-KR"/>
+        </w:rPr>
+        <w:t xml:space="preserve"> </w:t>
+      </w:r>
+      <w:r>
+        <w:rPr>
+          <w:lang w:eastAsia="ko-KR"/>
+        </w:rPr>
+        <w:t>하지만, 5번째 응답까지는 `잠겼습니다` 컬럼이 비어 있고 6번째부터 체크된다 — 자동화</w:t>
+      </w:r>
+      <w:r>
+        <w:rPr>
+          <w:rFonts w:hint="eastAsia"/>
+          <w:lang w:eastAsia="ko-KR"/>
+        </w:rPr>
+        <w:t xml:space="preserve"> </w:t>
+      </w:r>
+      <w:r>
+        <w:rPr>
+          <w:lang w:eastAsia="ko-KR"/>
+        </w:rPr>
+        <w:t>된 공격이라도 서버가 5회 지점에서 차단선을 그었다는 것을 한눈에 확인할 수 있다.</w:t>
+      </w:r>
+    </w:p>
+    <w:p>
+      <w:pPr>
+        <w:spacing w:after="90"/>
+        <w:ind w:left="360"/>
+        <w:rPr>
+          <w:lang w:eastAsia="ko-KR"/>
+        </w:rPr>
+      </w:pPr>
+      <w:r>
+        <w:rPr>
+          <w:noProof/>
+          <w:lang w:eastAsia="ko-KR"/>
+        </w:rPr>
+        <w:drawing>
+          <wp:inline distT="0" distB="0" distL="0" distR="0" wp14:anchorId="647D7C08" wp14:editId="18CA4BBE">
+            <wp:extent cx="5486400" cy="2400300"/>
+            <wp:effectExtent l="0" t="0" r="0" b="0"/>
+            <wp:docPr id="2" name="그림 2"/>
+            <wp:cNvGraphicFramePr>
+              <a:graphicFrameLocks xmlns:a="http://schemas.openxmlformats.org/drawingml/2006/main" noChangeAspect="1"/>
+            </wp:cNvGraphicFramePr>
+            <a:graphic xmlns:a="http://schemas.openxmlformats.org/drawingml/2006/main">
+              <a:graphicData uri="http://schemas.openxmlformats.org/drawingml/2006/picture">
+                <pic:pic xmlns:pic="http://schemas.openxmlformats.org/drawingml/2006/picture">
+                  <pic:nvPicPr>
+                    <pic:cNvPr id="1" name=""/>
+                    <pic:cNvPicPr/>
+                  </pic:nvPicPr>
+                  <pic:blipFill>
+                    <a:blip r:embed="rId16"/>
+                    <a:stretch>
+                      <a:fillRect/>
+                    </a:stretch>
+                  </pic:blipFill>
+                  <pic:spPr>
+                    <a:xfrm>
+                      <a:off x="0" y="0"/>
+                      <a:ext cx="5486400" cy="2400300"/>
+                    </a:xfrm>
+                    <a:prstGeom prst="rect">
+                      <a:avLst/>
+                    </a:prstGeom>
+                  </pic:spPr>
+                </pic:pic>
+              </a:graphicData>
+            </a:graphic>
+          </wp:inline>
+        </w:drawing>
+      </w:r>
+    </w:p>
+    <w:p>
+      <w:pPr>
+        <w:spacing w:after="90"/>
+        <w:ind w:left="360"/>
+        <w:rPr>
+          <w:rFonts w:hint="eastAsia"/>
+          <w:lang w:eastAsia="ko-KR"/>
+        </w:rPr>
+      </w:pPr>
+      <w:r>
+        <w:rPr>
+          <w:noProof/>
+          <w:lang w:eastAsia="ko-KR"/>
+        </w:rPr>
+        <w:lastRenderedPageBreak/>
+        <w:drawing>
+          <wp:inline distT="0" distB="0" distL="0" distR="0" wp14:anchorId="7FC1867E" wp14:editId="44ABF10F">
+            <wp:extent cx="5486400" cy="2190115"/>
+            <wp:effectExtent l="0" t="0" r="0" b="635"/>
+            <wp:docPr id="3" name="그림 3"/>
+            <wp:cNvGraphicFramePr>
+              <a:graphicFrameLocks xmlns:a="http://schemas.openxmlformats.org/drawingml/2006/main" noChangeAspect="1"/>
+            </wp:cNvGraphicFramePr>
+            <a:graphic xmlns:a="http://schemas.openxmlformats.org/drawingml/2006/main">
+              <a:graphicData uri="http://schemas.openxmlformats.org/drawingml/2006/picture">
+                <pic:pic xmlns:pic="http://schemas.openxmlformats.org/drawingml/2006/picture">
+                  <pic:nvPicPr>
+                    <pic:cNvPr id="1" name=""/>
+                    <pic:cNvPicPr/>
+                  </pic:nvPicPr>
+                  <pic:blipFill>
+                    <a:blip r:embed="rId17"/>
+                    <a:stretch>
+                      <a:fillRect/>
+                    </a:stretch>
+                  </pic:blipFill>
+                  <pic:spPr>
+                    <a:xfrm>
+                      <a:off x="0" y="0"/>
+                      <a:ext cx="5486400" cy="2190115"/>
+                    </a:xfrm>
+                    <a:prstGeom prst="rect">
+                      <a:avLst/>
+                    </a:prstGeom>
+                  </pic:spPr>
+                </pic:pic>
+              </a:graphicData>
+            </a:graphic>
+          </wp:inline>
+        </w:drawing>
+      </w:r>
+    </w:p>
+    <w:p>
+      <w:pPr>
         <w:pStyle w:val="21"/>
         <w:spacing w:before="240" w:after="100"/>
         <w:rPr>
@@ -2787,7 +5392,6 @@
           <w:b/>
           <w:lang w:eastAsia="ko-KR"/>
         </w:rPr>
-        <w:lastRenderedPageBreak/>
         <w:t>결과</w:t>
       </w:r>
       <w:r>
@@ -2906,7 +5510,22 @@
           <w:color w:val="2E5496"/>
           <w:lang w:eastAsia="ko-KR"/>
         </w:rPr>
-        <w:t>4-2. 성공하면 즉시 초기화한다</w:t>
+        <w:t>4-2. 성공하면 즉시 초기화</w:t>
+      </w:r>
+      <w:r>
+        <w:rPr>
+          <w:rFonts w:hint="eastAsia"/>
+          <w:color w:val="2E5496"/>
+          <w:lang w:eastAsia="ko-KR"/>
+        </w:rPr>
+        <w:t xml:space="preserve"> </w:t>
+      </w:r>
+      <w:r>
+        <w:rPr>
+          <w:color w:val="2E5496"/>
+          <w:lang w:eastAsia="ko-KR"/>
+        </w:rPr>
+        <w:t>한다</w:t>
       </w:r>
     </w:p>
     <w:p>
@@ -2943,6 +5562,7 @@
         <w:rPr>
           <w:lang w:eastAsia="ko-KR"/>
         </w:rPr>
+        <w:lastRenderedPageBreak/>
         <w:t>실패를 몇 번 하다가도 결국 올바른 비밀번호로 로그인하면 카운트를 0으로 되돌린다 — 정상 사용자가 비밀번호를 몇 번 오타 냈다고 누적되어 다음에 불이익을 받지 않게 한다.</w:t>
       </w:r>
     </w:p>
@@ -2980,7 +5600,35 @@
         <w:rPr>
           <w:lang w:eastAsia="ko-KR"/>
         </w:rPr>
-        <w:t xml:space="preserve"> 공격자가 피해자의 이메일만 알면(비밀번호는 몰라도) 일부러 5번 틀려서 그 계정을 잠가버릴 수 있다 — 정작 피해자 본인도 5분(또는 설정한 시간) 동안 로그인할 수 없다. 이번 §3-3에서 확인했듯 IP 기준이 아니므로, "한 사람이 계정 여러 개를 공격"하는 시나리오엔 강하지만 "여러 사람이 한 계정을 공격"하는 시나리오엔 취약하다.</w:t>
+        <w:t xml:space="preserve"> 공격자가 피해자의 이메일만 알면(비밀번호는 몰라도) 일부러 5번 틀려서 그 계정을 잠가버릴 수 있다 — 정작 피해자 본인도 5분(또는 설정한 시간) 동안 로그인할 수 없다. 이번 3-3에서 확인</w:t>
+      </w:r>
+      <w:r>
+        <w:rPr>
+          <w:rFonts w:hint="eastAsia"/>
+          <w:lang w:eastAsia="ko-KR"/>
+        </w:rPr>
+        <w:t xml:space="preserve"> </w:t>
+      </w:r>
+      <w:r>
+        <w:rPr>
+          <w:lang w:eastAsia="ko-KR"/>
+        </w:rPr>
+        <w:t>했</w:t>
+      </w:r>
+      <w:r>
+        <w:rPr>
+          <w:rFonts w:hint="eastAsia"/>
+          <w:lang w:eastAsia="ko-KR"/>
+        </w:rPr>
+        <w:t>듯이</w:t>
+      </w:r>
+      <w:bookmarkStart w:id="0" w:name="_GoBack"/>
+      <w:bookmarkEnd w:id="0"/>
+      <w:r>
+        <w:rPr>
+          <w:lang w:eastAsia="ko-KR"/>
+        </w:rPr>
+        <w:t xml:space="preserve"> IP 기준이 아니므로, "한 사람이 계정 여러 개를 공격"하는 시나리오엔 강하지만 "여러 사람이 한 계정을 공격"하는 시나리오엔 취약하다.</w:t>
       </w:r>
     </w:p>
     <w:p>
@@ -3054,7 +5702,6 @@
           <w:b/>
           <w:lang w:eastAsia="ko-KR"/>
         </w:rPr>
-        <w:lastRenderedPageBreak/>
         <w:t>CAPTCHA</w:t>
       </w:r>
       <w:r>
@@ -3289,6 +5936,7 @@
           <w:color w:val="1F3864"/>
           <w:sz w:val="30"/>
         </w:rPr>
+        <w:lastRenderedPageBreak/>
         <w:t>5. 방어 정리</w:t>
       </w:r>
     </w:p>
@@ -3528,7 +6176,6 @@
           <w:color w:val="1F3864"/>
           <w:sz w:val="30"/>
         </w:rPr>
-        <w:lastRenderedPageBreak/>
         <w:t>6. 관련 문서</w:t>
       </w:r>
     </w:p>
@@ -3572,7 +6219,7 @@
       </w:r>
     </w:p>
     <w:sectPr>
-      <w:headerReference w:type="default" r:id="rId9"/>
+      <w:headerReference w:type="default" r:id="rId18"/>
       <w:pgSz w:w="12240" w:h="15840"/>
       <w:pgMar w:top="1440" w:right="1800" w:bottom="1440" w:left="1800" w:header="720" w:footer="720" w:gutter="0"/>
       <w:cols w:space="720"/>
@@ -3651,7 +6298,7 @@
       <w:rPr>
         <w:noProof/>
       </w:rPr>
-      <w:t>9</w:t>
+      <w:t>14</w:t>
     </w:r>
     <w:r>
       <w:fldChar w:fldCharType="end"/>
@@ -3887,6 +6534,208 @@
       <w:lvlJc w:val="left"/>
     </w:lvl>
   </w:abstractNum>
+  <w:abstractNum w:abstractNumId="10" w15:restartNumberingAfterBreak="0">
+    <w:nsid w:val="4F913D58"/>
+    <w:multiLevelType w:val="multilevel"/>
+    <w:tmpl w:val="40D47178"/>
+    <w:lvl w:ilvl="0">
+      <w:start w:val="1"/>
+      <w:numFmt w:val="decimal"/>
+      <w:lvlText w:val="%1-"/>
+      <w:lvlJc w:val="left"/>
+      <w:pPr>
+        <w:ind w:left="480" w:hanging="480"/>
+      </w:pPr>
+      <w:rPr>
+        <w:rFonts w:hint="default"/>
+      </w:rPr>
+    </w:lvl>
+    <w:lvl w:ilvl="1">
+      <w:start w:val="1"/>
+      <w:numFmt w:val="decimal"/>
+      <w:lvlText w:val="%1-%2."/>
+      <w:lvlJc w:val="left"/>
+      <w:pPr>
+        <w:ind w:left="1080" w:hanging="720"/>
+      </w:pPr>
+      <w:rPr>
+        <w:rFonts w:hint="default"/>
+      </w:rPr>
+    </w:lvl>
+    <w:lvl w:ilvl="2">
+      <w:start w:val="1"/>
+      <w:numFmt w:val="decimal"/>
+      <w:lvlText w:val="%1-%2.%3."/>
+      <w:lvlJc w:val="left"/>
+      <w:pPr>
+        <w:ind w:left="1440" w:hanging="720"/>
+      </w:pPr>
+      <w:rPr>
+        <w:rFonts w:hint="default"/>
+      </w:rPr>
+    </w:lvl>
+    <w:lvl w:ilvl="3">
+      <w:start w:val="1"/>
+      <w:numFmt w:val="decimal"/>
+      <w:lvlText w:val="%1-%2.%3.%4."/>
+      <w:lvlJc w:val="left"/>
+      <w:pPr>
+        <w:ind w:left="2160" w:hanging="1080"/>
+      </w:pPr>
+      <w:rPr>
+        <w:rFonts w:hint="default"/>
+      </w:rPr>
+    </w:lvl>
+    <w:lvl w:ilvl="4">
+      <w:start w:val="1"/>
+      <w:numFmt w:val="decimal"/>
+      <w:lvlText w:val="%1-%2.%3.%4.%5."/>
+      <w:lvlJc w:val="left"/>
+      <w:pPr>
+        <w:ind w:left="2520" w:hanging="1080"/>
+      </w:pPr>
+      <w:rPr>
+        <w:rFonts w:hint="default"/>
+      </w:rPr>
+    </w:lvl>
+    <w:lvl w:ilvl="5">
+      <w:start w:val="1"/>
+      <w:numFmt w:val="decimal"/>
+      <w:lvlText w:val="%1-%2.%3.%4.%5.%6."/>
+      <w:lvlJc w:val="left"/>
+      <w:pPr>
+        <w:ind w:left="3240" w:hanging="1440"/>
+      </w:pPr>
+      <w:rPr>
+        <w:rFonts w:hint="default"/>
+      </w:rPr>
+    </w:lvl>
+    <w:lvl w:ilvl="6">
+      <w:start w:val="1"/>
+      <w:numFmt w:val="decimal"/>
+      <w:lvlText w:val="%1-%2.%3.%4.%5.%6.%7."/>
+      <w:lvlJc w:val="left"/>
+      <w:pPr>
+        <w:ind w:left="3600" w:hanging="1440"/>
+      </w:pPr>
+      <w:rPr>
+        <w:rFonts w:hint="default"/>
+      </w:rPr>
+    </w:lvl>
+    <w:lvl w:ilvl="7">
+      <w:start w:val="1"/>
+      <w:numFmt w:val="decimal"/>
+      <w:lvlText w:val="%1-%2.%3.%4.%5.%6.%7.%8."/>
+      <w:lvlJc w:val="left"/>
+      <w:pPr>
+        <w:ind w:left="4320" w:hanging="1800"/>
+      </w:pPr>
+      <w:rPr>
+        <w:rFonts w:hint="default"/>
+      </w:rPr>
+    </w:lvl>
+    <w:lvl w:ilvl="8">
+      <w:start w:val="1"/>
+      <w:numFmt w:val="decimal"/>
+      <w:lvlText w:val="%1-%2.%3.%4.%5.%6.%7.%8.%9."/>
+      <w:lvlJc w:val="left"/>
+      <w:pPr>
+        <w:ind w:left="4680" w:hanging="1800"/>
+      </w:pPr>
+      <w:rPr>
+        <w:rFonts w:hint="default"/>
+      </w:rPr>
+    </w:lvl>
+  </w:abstractNum>
+  <w:abstractNum w:abstractNumId="11" w15:restartNumberingAfterBreak="0">
+    <w:nsid w:val="68A00655"/>
+    <w:multiLevelType w:val="hybridMultilevel"/>
+    <w:tmpl w:val="953207B0"/>
+    <w:lvl w:ilvl="0" w:tplc="B9823152">
+      <w:start w:val="1"/>
+      <w:numFmt w:val="decimal"/>
+      <w:lvlText w:val="%1."/>
+      <w:lvlJc w:val="left"/>
+      <w:pPr>
+        <w:ind w:left="720" w:hanging="360"/>
+      </w:pPr>
+      <w:rPr>
+        <w:rFonts w:hint="default"/>
+      </w:rPr>
+    </w:lvl>
+    <w:lvl w:ilvl="1" w:tplc="04090019">
+      <w:start w:val="1"/>
+      <w:numFmt w:val="upperLetter"/>
+      <w:lvlText w:val="%2."/>
+      <w:lvlJc w:val="left"/>
+      <w:pPr>
+        <w:ind w:left="1160" w:hanging="400"/>
+      </w:pPr>
+    </w:lvl>
+    <w:lvl w:ilvl="2" w:tplc="0409001B" w:tentative="1">
+      <w:start w:val="1"/>
+      <w:numFmt w:val="lowerRoman"/>
+      <w:lvlText w:val="%3."/>
+      <w:lvlJc w:val="right"/>
+      <w:pPr>
+        <w:ind w:left="1560" w:hanging="400"/>
+      </w:pPr>
+    </w:lvl>
+    <w:lvl w:ilvl="3" w:tplc="0409000F" w:tentative="1">
+      <w:start w:val="1"/>
+      <w:numFmt w:val="decimal"/>
+      <w:lvlText w:val="%4."/>
+      <w:lvlJc w:val="left"/>
+      <w:pPr>
+        <w:ind w:left="1960" w:hanging="400"/>
+      </w:pPr>
+    </w:lvl>
+    <w:lvl w:ilvl="4" w:tplc="04090019" w:tentative="1">
+      <w:start w:val="1"/>
+      <w:numFmt w:val="upperLetter"/>
+      <w:lvlText w:val="%5."/>
+      <w:lvlJc w:val="left"/>
+      <w:pPr>
+        <w:ind w:left="2360" w:hanging="400"/>
+      </w:pPr>
+    </w:lvl>
+    <w:lvl w:ilvl="5" w:tplc="0409001B" w:tentative="1">
+      <w:start w:val="1"/>
+      <w:numFmt w:val="lowerRoman"/>
+      <w:lvlText w:val="%6."/>
+      <w:lvlJc w:val="right"/>
+      <w:pPr>
+        <w:ind w:left="2760" w:hanging="400"/>
+      </w:pPr>
+    </w:lvl>
+    <w:lvl w:ilvl="6" w:tplc="0409000F" w:tentative="1">
+      <w:start w:val="1"/>
+      <w:numFmt w:val="decimal"/>
+      <w:lvlText w:val="%7."/>
+      <w:lvlJc w:val="left"/>
+      <w:pPr>
+        <w:ind w:left="3160" w:hanging="400"/>
+      </w:pPr>
+    </w:lvl>
+    <w:lvl w:ilvl="7" w:tplc="04090019" w:tentative="1">
+      <w:start w:val="1"/>
+      <w:numFmt w:val="upperLetter"/>
+      <w:lvlText w:val="%8."/>
+      <w:lvlJc w:val="left"/>
+      <w:pPr>
+        <w:ind w:left="3560" w:hanging="400"/>
+      </w:pPr>
+    </w:lvl>
+    <w:lvl w:ilvl="8" w:tplc="0409001B" w:tentative="1">
+      <w:start w:val="1"/>
+      <w:numFmt w:val="lowerRoman"/>
+      <w:lvlText w:val="%9."/>
+      <w:lvlJc w:val="right"/>
+      <w:pPr>
+        <w:ind w:left="3960" w:hanging="400"/>
+      </w:pPr>
+    </w:lvl>
+  </w:abstractNum>
   <w:num w:numId="1">
     <w:abstractNumId w:val="8"/>
   </w:num>
@@ -3916,6 +6765,12 @@
   </w:num>
   <w:num w:numId="10">
     <w:abstractNumId w:val="9"/>
+  </w:num>
+  <w:num w:numId="11">
+    <w:abstractNumId w:val="10"/>
+  </w:num>
+  <w:num w:numId="12">
+    <w:abstractNumId w:val="11"/>
   </w:num>
 </w:numbering>
 </file>
@@ -4304,7 +7159,7 @@
   <w:style w:type="paragraph" w:default="1" w:styleId="a1">
     <w:name w:val="Normal"/>
     <w:qFormat/>
-    <w:rsid w:val="00FC693F"/>
+    <w:rsid w:val="00BD5FD5"/>
   </w:style>
   <w:style w:type="paragraph" w:styleId="1">
     <w:name w:val="heading 1"/>
@@ -15270,6 +18125,17 @@
       </w:tcPr>
     </w:tblStylePr>
   </w:style>
+  <w:style w:type="character" w:styleId="aff1">
+    <w:name w:val="Hyperlink"/>
+    <w:basedOn w:val="a2"/>
+    <w:uiPriority w:val="99"/>
+    <w:unhideWhenUsed/>
+    <w:rsid w:val="00BD5FD5"/>
+    <w:rPr>
+      <w:color w:val="0000FF" w:themeColor="hyperlink"/>
+      <w:u w:val="single"/>
+    </w:rPr>
+  </w:style>
 </w:styles>
 </file>
 
@@ -15598,7 +18464,7 @@
 </file>
 
 <file path=customXml/itemProps1.xml><?xml version="1.0" encoding="utf-8"?>
-<ds:datastoreItem xmlns:ds="http://schemas.openxmlformats.org/officeDocument/2006/customXml" ds:itemID="{B5B6BE63-4C52-44ED-A296-FCCD22E83509}">
+<ds:datastoreItem xmlns:ds="http://schemas.openxmlformats.org/officeDocument/2006/customXml" ds:itemID="{E5EF6586-7309-48EB-9732-79CD338D2B26}">
   <ds:schemaRefs>
     <ds:schemaRef ds:uri="http://schemas.openxmlformats.org/officeDocument/2006/bibliography"/>
   </ds:schemaRefs>

</xml_diff>